<commit_message>
Update missed checks in the BlazorCspValidationTestReport.docx
</commit_message>
<xml_diff>
--- a/Evidence/BlazorCspValidationTestReport.docx
+++ b/Evidence/BlazorCspValidationTestReport.docx
@@ -293,14 +293,14 @@
         <w:tblDescription w:val=""/>
       </w:tblPr>
       <w:tblGrid>
-        <w:gridCol w:w="967"/>
-        <w:gridCol w:w="7241"/>
-        <w:gridCol w:w="1132"/>
+        <w:gridCol w:w="963"/>
+        <w:gridCol w:w="7205"/>
+        <w:gridCol w:w="1172"/>
       </w:tblGrid>
       <w:tr>
         <w:tc>
           <w:tcPr>
-            <w:tcW w:w="1469" w:type="dxa"/>
+            <w:tcW w:w="963" w:type="dxa"/>
             <w:tcBorders>
               <w:top w:val="single" w:sz="8" w:space="0" w:color="A3A3A3"/>
               <w:left w:val="single" w:sz="8" w:space="0" w:color="A3A3A3"/>
@@ -327,7 +327,7 @@
         </w:tc>
         <w:tc>
           <w:tcPr>
-            <w:tcW w:w="5363" w:type="dxa"/>
+            <w:tcW w:w="7205" w:type="dxa"/>
             <w:tcBorders>
               <w:top w:val="single" w:sz="8" w:space="0" w:color="A3A3A3"/>
               <w:left w:val="single" w:sz="8" w:space="0" w:color="A3A3A3"/>
@@ -354,7 +354,7 @@
         </w:tc>
         <w:tc>
           <w:tcPr>
-            <w:tcW w:w="1927" w:type="dxa"/>
+            <w:tcW w:w="1172" w:type="dxa"/>
             <w:tcBorders>
               <w:top w:val="single" w:sz="8" w:space="0" w:color="A3A3A3"/>
               <w:left w:val="single" w:sz="8" w:space="0" w:color="A3A3A3"/>
@@ -383,7 +383,7 @@
       <w:tr>
         <w:tc>
           <w:tcPr>
-            <w:tcW w:w="1496" w:type="dxa"/>
+            <w:tcW w:w="963" w:type="dxa"/>
             <w:tcBorders>
               <w:top w:val="single" w:sz="8" w:space="0" w:color="A3A3A3"/>
               <w:left w:val="single" w:sz="8" w:space="0" w:color="A3A3A3"/>
@@ -410,7 +410,7 @@
         </w:tc>
         <w:tc>
           <w:tcPr>
-            <w:tcW w:w="5841" w:type="dxa"/>
+            <w:tcW w:w="7205" w:type="dxa"/>
             <w:tcBorders>
               <w:top w:val="single" w:sz="8" w:space="0" w:color="A3A3A3"/>
               <w:left w:val="single" w:sz="8" w:space="0" w:color="A3A3A3"/>
@@ -443,11 +443,11 @@
               <w:tblDescription w:val=""/>
             </w:tblPr>
             <w:tblGrid>
-              <w:gridCol w:w="1296"/>
-              <w:gridCol w:w="1158"/>
-              <w:gridCol w:w="1435"/>
-              <w:gridCol w:w="1468"/>
-              <w:gridCol w:w="1744"/>
+              <w:gridCol w:w="1289"/>
+              <w:gridCol w:w="1153"/>
+              <w:gridCol w:w="1428"/>
+              <w:gridCol w:w="1460"/>
+              <w:gridCol w:w="1735"/>
             </w:tblGrid>
             <w:tr>
               <w:tc>
@@ -1102,7 +1102,7 @@
         </w:tc>
         <w:tc>
           <w:tcPr>
-            <w:tcW w:w="2117" w:type="dxa"/>
+            <w:tcW w:w="1172" w:type="dxa"/>
             <w:tcBorders>
               <w:top w:val="single" w:sz="8" w:space="0" w:color="A3A3A3"/>
               <w:left w:val="single" w:sz="8" w:space="0" w:color="A3A3A3"/>
@@ -1165,7 +1165,7 @@
       <w:tr>
         <w:tc>
           <w:tcPr>
-            <w:tcW w:w="1482" w:type="dxa"/>
+            <w:tcW w:w="963" w:type="dxa"/>
             <w:tcBorders>
               <w:top w:val="single" w:sz="8" w:space="0" w:color="A3A3A3"/>
               <w:left w:val="single" w:sz="8" w:space="0" w:color="A3A3A3"/>
@@ -1193,7 +1193,7 @@
         </w:tc>
         <w:tc>
           <w:tcPr>
-            <w:tcW w:w="5841" w:type="dxa"/>
+            <w:tcW w:w="7205" w:type="dxa"/>
             <w:tcBorders>
               <w:top w:val="single" w:sz="8" w:space="0" w:color="A3A3A3"/>
               <w:left w:val="single" w:sz="8" w:space="0" w:color="A3A3A3"/>
@@ -1226,11 +1226,11 @@
               <w:tblDescription w:val=""/>
             </w:tblPr>
             <w:tblGrid>
-              <w:gridCol w:w="1296"/>
-              <w:gridCol w:w="1158"/>
-              <w:gridCol w:w="1435"/>
-              <w:gridCol w:w="1468"/>
-              <w:gridCol w:w="1744"/>
+              <w:gridCol w:w="1289"/>
+              <w:gridCol w:w="1153"/>
+              <w:gridCol w:w="1428"/>
+              <w:gridCol w:w="1460"/>
+              <w:gridCol w:w="1735"/>
             </w:tblGrid>
             <w:tr>
               <w:tc>
@@ -1889,7 +1889,7 @@
         </w:tc>
         <w:tc>
           <w:tcPr>
-            <w:tcW w:w="1966" w:type="dxa"/>
+            <w:tcW w:w="1172" w:type="dxa"/>
             <w:tcBorders>
               <w:top w:val="single" w:sz="8" w:space="0" w:color="A3A3A3"/>
               <w:left w:val="single" w:sz="8" w:space="0" w:color="A3A3A3"/>
@@ -1915,7 +1915,7 @@
       <w:tr>
         <w:tc>
           <w:tcPr>
-            <w:tcW w:w="1498" w:type="dxa"/>
+            <w:tcW w:w="963" w:type="dxa"/>
             <w:tcBorders>
               <w:top w:val="single" w:sz="8" w:space="0" w:color="A3A3A3"/>
               <w:left w:val="single" w:sz="8" w:space="0" w:color="A3A3A3"/>
@@ -1938,7 +1938,7 @@
         </w:tc>
         <w:tc>
           <w:tcPr>
-            <w:tcW w:w="5841" w:type="dxa"/>
+            <w:tcW w:w="7205" w:type="dxa"/>
             <w:tcBorders>
               <w:top w:val="single" w:sz="8" w:space="0" w:color="A3A3A3"/>
               <w:left w:val="single" w:sz="8" w:space="0" w:color="A3A3A3"/>
@@ -1971,11 +1971,11 @@
               <w:tblDescription w:val=""/>
             </w:tblPr>
             <w:tblGrid>
-              <w:gridCol w:w="1296"/>
-              <w:gridCol w:w="1158"/>
-              <w:gridCol w:w="1435"/>
-              <w:gridCol w:w="1468"/>
-              <w:gridCol w:w="1744"/>
+              <w:gridCol w:w="1289"/>
+              <w:gridCol w:w="1153"/>
+              <w:gridCol w:w="1428"/>
+              <w:gridCol w:w="1460"/>
+              <w:gridCol w:w="1735"/>
             </w:tblGrid>
             <w:tr>
               <w:tc>
@@ -2632,7 +2632,7 @@
         </w:tc>
         <w:tc>
           <w:tcPr>
-            <w:tcW w:w="1966" w:type="dxa"/>
+            <w:tcW w:w="1172" w:type="dxa"/>
             <w:tcBorders>
               <w:top w:val="single" w:sz="8" w:space="0" w:color="A3A3A3"/>
               <w:left w:val="single" w:sz="8" w:space="0" w:color="A3A3A3"/>
@@ -2657,7 +2657,7 @@
       <w:tr>
         <w:tc>
           <w:tcPr>
-            <w:tcW w:w="1480" w:type="dxa"/>
+            <w:tcW w:w="963" w:type="dxa"/>
             <w:tcBorders>
               <w:top w:val="single" w:sz="8" w:space="0" w:color="A3A3A3"/>
               <w:left w:val="single" w:sz="8" w:space="0" w:color="A3A3A3"/>
@@ -2684,7 +2684,7 @@
         </w:tc>
         <w:tc>
           <w:tcPr>
-            <w:tcW w:w="5841" w:type="dxa"/>
+            <w:tcW w:w="7205" w:type="dxa"/>
             <w:tcBorders>
               <w:top w:val="single" w:sz="8" w:space="0" w:color="A3A3A3"/>
               <w:left w:val="single" w:sz="8" w:space="0" w:color="A3A3A3"/>
@@ -2717,11 +2717,11 @@
               <w:tblDescription w:val=""/>
             </w:tblPr>
             <w:tblGrid>
-              <w:gridCol w:w="1296"/>
-              <w:gridCol w:w="1158"/>
-              <w:gridCol w:w="1435"/>
-              <w:gridCol w:w="1468"/>
-              <w:gridCol w:w="1744"/>
+              <w:gridCol w:w="1289"/>
+              <w:gridCol w:w="1153"/>
+              <w:gridCol w:w="1428"/>
+              <w:gridCol w:w="1460"/>
+              <w:gridCol w:w="1735"/>
             </w:tblGrid>
             <w:tr>
               <w:tc>
@@ -3376,7 +3376,7 @@
         </w:tc>
         <w:tc>
           <w:tcPr>
-            <w:tcW w:w="2117" w:type="dxa"/>
+            <w:tcW w:w="1172" w:type="dxa"/>
             <w:tcBorders>
               <w:top w:val="single" w:sz="8" w:space="0" w:color="A3A3A3"/>
               <w:left w:val="single" w:sz="8" w:space="0" w:color="A3A3A3"/>
@@ -3412,11 +3412,11 @@
               <w:t>causes an</w:t>
             </w:r>
             <w:r>
-              <w:t xml:space="preserve"> inline script violation, which requires a per-app </w:t>
+              <w:t xml:space="preserve"> inline script violation, which requires a per-app inline </w:t>
             </w:r>
             <w:r>
               <w:lastRenderedPageBreak/>
-              <w:t>inline script exception to be added to the policy.</w:t>
+              <w:t>script exception to be added to the policy.</w:t>
             </w:r>
           </w:p>
           <w:p>
@@ -3431,6 +3431,908 @@
           <w:p>
             <w:r>
               <w:t>See Evidence Table.</w:t>
+            </w:r>
+          </w:p>
+        </w:tc>
+      </w:tr>
+      <w:tr>
+        <w:tc>
+          <w:tcPr>
+            <w:tcW w:w="963" w:type="dxa"/>
+            <w:tcBorders>
+              <w:top w:val="single" w:sz="8" w:space="0" w:color="A3A3A3"/>
+              <w:left w:val="single" w:sz="8" w:space="0" w:color="A3A3A3"/>
+              <w:bottom w:val="single" w:sz="8" w:space="0" w:color="A3A3A3"/>
+              <w:right w:val="single" w:sz="8" w:space="0" w:color="A3A3A3"/>
+            </w:tcBorders>
+            <w:tcMar>
+              <w:top w:w="40" w:type="dxa"/>
+              <w:left w:w="60" w:type="dxa"/>
+              <w:bottom w:w="40" w:type="dxa"/>
+              <w:right w:w="60" w:type="dxa"/>
+            </w:tcMar>
+          </w:tcPr>
+          <w:p>
+            <w:r>
+              <w:lastRenderedPageBreak/>
+              <w:t>Starting in report-only mode to collect violations without breaking the app, then switching to enforcing.</w:t>
+            </w:r>
+          </w:p>
+          <w:p/>
+        </w:tc>
+        <w:tc>
+          <w:tcPr>
+            <w:tcW w:w="7205" w:type="dxa"/>
+            <w:tcBorders>
+              <w:top w:val="single" w:sz="8" w:space="0" w:color="A3A3A3"/>
+              <w:left w:val="single" w:sz="8" w:space="0" w:color="A3A3A3"/>
+              <w:bottom w:val="single" w:sz="8" w:space="0" w:color="A3A3A3"/>
+              <w:right w:val="single" w:sz="8" w:space="0" w:color="A3A3A3"/>
+            </w:tcBorders>
+            <w:tcMar>
+              <w:top w:w="40" w:type="dxa"/>
+              <w:left w:w="60" w:type="dxa"/>
+              <w:bottom w:w="40" w:type="dxa"/>
+              <w:right w:w="60" w:type="dxa"/>
+            </w:tcMar>
+          </w:tcPr>
+          <w:p>
+            <w:r>
+              <w:t>N/A</w:t>
+            </w:r>
+          </w:p>
+        </w:tc>
+        <w:tc>
+          <w:tcPr>
+            <w:tcW w:w="1172" w:type="dxa"/>
+            <w:tcBorders>
+              <w:top w:val="single" w:sz="8" w:space="0" w:color="A3A3A3"/>
+              <w:left w:val="single" w:sz="8" w:space="0" w:color="A3A3A3"/>
+              <w:bottom w:val="single" w:sz="8" w:space="0" w:color="A3A3A3"/>
+              <w:right w:val="single" w:sz="8" w:space="0" w:color="A3A3A3"/>
+            </w:tcBorders>
+            <w:tcMar>
+              <w:top w:w="40" w:type="dxa"/>
+              <w:left w:w="60" w:type="dxa"/>
+              <w:bottom w:w="40" w:type="dxa"/>
+              <w:right w:w="60" w:type="dxa"/>
+            </w:tcMar>
+          </w:tcPr>
+          <w:p>
+            <w:r>
+              <w:t xml:space="preserve">To test a policy over </w:t>
+            </w:r>
+            <w:proofErr w:type="gramStart"/>
+            <w:r>
+              <w:t>a period of time</w:t>
+            </w:r>
+            <w:proofErr w:type="gramEnd"/>
+            <w:r>
+              <w:t xml:space="preserve"> without enforcing its directives, we can set the &lt;meta&gt; tag's http-</w:t>
+            </w:r>
+            <w:proofErr w:type="spellStart"/>
+            <w:r>
+              <w:t>equiv</w:t>
+            </w:r>
+            <w:proofErr w:type="spellEnd"/>
+            <w:r>
+              <w:t xml:space="preserve"> attribute to Content-Security-Policy-Report-Only instead of Content-Security-Policy. </w:t>
+            </w:r>
+            <w:r>
+              <w:lastRenderedPageBreak/>
+              <w:t>However, this appears to be unnecessary since we can test directly in enforcement mode to gather the required error details.</w:t>
+            </w:r>
+          </w:p>
+        </w:tc>
+      </w:tr>
+      <w:tr>
+        <w:tc>
+          <w:tcPr>
+            <w:tcW w:w="963" w:type="dxa"/>
+            <w:tcBorders>
+              <w:top w:val="single" w:sz="8" w:space="0" w:color="A3A3A3"/>
+              <w:left w:val="single" w:sz="8" w:space="0" w:color="A3A3A3"/>
+              <w:bottom w:val="single" w:sz="8" w:space="0" w:color="A3A3A3"/>
+              <w:right w:val="single" w:sz="8" w:space="0" w:color="A3A3A3"/>
+            </w:tcBorders>
+            <w:tcMar>
+              <w:top w:w="40" w:type="dxa"/>
+              <w:left w:w="60" w:type="dxa"/>
+              <w:bottom w:w="40" w:type="dxa"/>
+              <w:right w:w="60" w:type="dxa"/>
+            </w:tcMar>
+          </w:tcPr>
+          <w:p>
+            <w:r>
+              <w:lastRenderedPageBreak/>
+              <w:t>Resizing the window back and forth across the point where the menu collapses.</w:t>
+            </w:r>
+          </w:p>
+          <w:p/>
+        </w:tc>
+        <w:tc>
+          <w:tcPr>
+            <w:tcW w:w="7205" w:type="dxa"/>
+            <w:tcBorders>
+              <w:top w:val="single" w:sz="8" w:space="0" w:color="A3A3A3"/>
+              <w:left w:val="single" w:sz="8" w:space="0" w:color="A3A3A3"/>
+              <w:bottom w:val="single" w:sz="8" w:space="0" w:color="A3A3A3"/>
+              <w:right w:val="single" w:sz="8" w:space="0" w:color="A3A3A3"/>
+            </w:tcBorders>
+            <w:tcMar>
+              <w:top w:w="40" w:type="dxa"/>
+              <w:left w:w="60" w:type="dxa"/>
+              <w:bottom w:w="40" w:type="dxa"/>
+              <w:right w:w="60" w:type="dxa"/>
+            </w:tcMar>
+          </w:tcPr>
+          <w:tbl>
+            <w:tblPr>
+              <w:tblW w:w="0" w:type="auto"/>
+              <w:tblBorders>
+                <w:top w:val="single" w:sz="8" w:space="0" w:color="A3A3A3"/>
+                <w:left w:val="single" w:sz="8" w:space="0" w:color="A3A3A3"/>
+                <w:bottom w:val="single" w:sz="8" w:space="0" w:color="A3A3A3"/>
+                <w:right w:val="single" w:sz="8" w:space="0" w:color="A3A3A3"/>
+              </w:tblBorders>
+              <w:tblCellMar>
+                <w:left w:w="0" w:type="dxa"/>
+                <w:right w:w="0" w:type="dxa"/>
+              </w:tblCellMar>
+              <w:tblLook w:val="04A0" w:firstRow="1" w:lastRow="0" w:firstColumn="1" w:lastColumn="0" w:noHBand="0" w:noVBand="1"/>
+            </w:tblPr>
+            <w:tblGrid>
+              <w:gridCol w:w="1289"/>
+              <w:gridCol w:w="1153"/>
+              <w:gridCol w:w="1428"/>
+              <w:gridCol w:w="1460"/>
+              <w:gridCol w:w="1735"/>
+            </w:tblGrid>
+            <w:tr>
+              <w:tc>
+                <w:tcPr>
+                  <w:tcW w:w="1135" w:type="dxa"/>
+                  <w:tcBorders>
+                    <w:top w:val="single" w:sz="8" w:space="0" w:color="A3A3A3"/>
+                    <w:left w:val="single" w:sz="8" w:space="0" w:color="A3A3A3"/>
+                    <w:bottom w:val="single" w:sz="8" w:space="0" w:color="A3A3A3"/>
+                    <w:right w:val="single" w:sz="8" w:space="0" w:color="A3A3A3"/>
+                  </w:tcBorders>
+                  <w:tcMar>
+                    <w:top w:w="40" w:type="dxa"/>
+                    <w:left w:w="60" w:type="dxa"/>
+                    <w:bottom w:w="40" w:type="dxa"/>
+                    <w:right w:w="60" w:type="dxa"/>
+                  </w:tcMar>
+                  <w:hideMark/>
+                </w:tcPr>
+                <w:p>
+                  <w:r>
+                    <w:rPr>
+                      <w:b/>
+                      <w:bCs/>
+                    </w:rPr>
+                    <w:t>Blazor Web App</w:t>
+                  </w:r>
+                </w:p>
+              </w:tc>
+              <w:tc>
+                <w:tcPr>
+                  <w:tcW w:w="1077" w:type="dxa"/>
+                  <w:tcBorders>
+                    <w:top w:val="single" w:sz="8" w:space="0" w:color="A3A3A3"/>
+                    <w:left w:val="single" w:sz="8" w:space="0" w:color="A3A3A3"/>
+                    <w:bottom w:val="single" w:sz="8" w:space="0" w:color="A3A3A3"/>
+                    <w:right w:val="single" w:sz="8" w:space="0" w:color="A3A3A3"/>
+                  </w:tcBorders>
+                  <w:tcMar>
+                    <w:top w:w="40" w:type="dxa"/>
+                    <w:left w:w="60" w:type="dxa"/>
+                    <w:bottom w:w="40" w:type="dxa"/>
+                    <w:right w:w="60" w:type="dxa"/>
+                  </w:tcMar>
+                  <w:hideMark/>
+                </w:tcPr>
+                <w:p>
+                  <w:proofErr w:type="gramStart"/>
+                  <w:r>
+                    <w:rPr>
+                      <w:b/>
+                      <w:bCs/>
+                    </w:rPr>
+                    <w:t>Edge(</w:t>
+                  </w:r>
+                  <w:proofErr w:type="gramEnd"/>
+                  <w:r>
+                    <w:rPr>
+                      <w:b/>
+                      <w:bCs/>
+                    </w:rPr>
+                    <w:t>Debug mode)</w:t>
+                  </w:r>
+                </w:p>
+              </w:tc>
+              <w:tc>
+                <w:tcPr>
+                  <w:tcW w:w="1107" w:type="dxa"/>
+                  <w:tcBorders>
+                    <w:top w:val="single" w:sz="8" w:space="0" w:color="A3A3A3"/>
+                    <w:left w:val="single" w:sz="8" w:space="0" w:color="A3A3A3"/>
+                    <w:bottom w:val="single" w:sz="8" w:space="0" w:color="A3A3A3"/>
+                    <w:right w:val="single" w:sz="8" w:space="0" w:color="A3A3A3"/>
+                  </w:tcBorders>
+                  <w:tcMar>
+                    <w:top w:w="40" w:type="dxa"/>
+                    <w:left w:w="60" w:type="dxa"/>
+                    <w:bottom w:w="40" w:type="dxa"/>
+                    <w:right w:w="60" w:type="dxa"/>
+                  </w:tcMar>
+                  <w:hideMark/>
+                </w:tcPr>
+                <w:p>
+                  <w:proofErr w:type="gramStart"/>
+                  <w:r>
+                    <w:rPr>
+                      <w:b/>
+                      <w:bCs/>
+                    </w:rPr>
+                    <w:t>Chrome(</w:t>
+                  </w:r>
+                  <w:proofErr w:type="gramEnd"/>
+                  <w:r>
+                    <w:rPr>
+                      <w:b/>
+                      <w:bCs/>
+                    </w:rPr>
+                    <w:t>Debug mode)</w:t>
+                  </w:r>
+                </w:p>
+              </w:tc>
+              <w:tc>
+                <w:tcPr>
+                  <w:tcW w:w="1214" w:type="dxa"/>
+                  <w:tcBorders>
+                    <w:top w:val="single" w:sz="8" w:space="0" w:color="A3A3A3"/>
+                    <w:left w:val="single" w:sz="8" w:space="0" w:color="A3A3A3"/>
+                    <w:bottom w:val="single" w:sz="8" w:space="0" w:color="A3A3A3"/>
+                    <w:right w:val="single" w:sz="8" w:space="0" w:color="A3A3A3"/>
+                  </w:tcBorders>
+                  <w:tcMar>
+                    <w:top w:w="40" w:type="dxa"/>
+                    <w:left w:w="60" w:type="dxa"/>
+                    <w:bottom w:w="40" w:type="dxa"/>
+                    <w:right w:w="60" w:type="dxa"/>
+                  </w:tcMar>
+                  <w:hideMark/>
+                </w:tcPr>
+                <w:p>
+                  <w:proofErr w:type="gramStart"/>
+                  <w:r>
+                    <w:rPr>
+                      <w:b/>
+                      <w:bCs/>
+                    </w:rPr>
+                    <w:t>Edge(</w:t>
+                  </w:r>
+                  <w:proofErr w:type="gramEnd"/>
+                  <w:r>
+                    <w:rPr>
+                      <w:b/>
+                      <w:bCs/>
+                    </w:rPr>
+                    <w:t>Published output in Release)</w:t>
+                  </w:r>
+                </w:p>
+              </w:tc>
+              <w:tc>
+                <w:tcPr>
+                  <w:tcW w:w="1104" w:type="dxa"/>
+                  <w:tcBorders>
+                    <w:top w:val="single" w:sz="8" w:space="0" w:color="A3A3A3"/>
+                    <w:left w:val="single" w:sz="8" w:space="0" w:color="A3A3A3"/>
+                    <w:bottom w:val="single" w:sz="8" w:space="0" w:color="A3A3A3"/>
+                    <w:right w:val="single" w:sz="8" w:space="0" w:color="A3A3A3"/>
+                  </w:tcBorders>
+                  <w:tcMar>
+                    <w:top w:w="40" w:type="dxa"/>
+                    <w:left w:w="60" w:type="dxa"/>
+                    <w:bottom w:w="40" w:type="dxa"/>
+                    <w:right w:w="60" w:type="dxa"/>
+                  </w:tcMar>
+                  <w:hideMark/>
+                </w:tcPr>
+                <w:p>
+                  <w:proofErr w:type="gramStart"/>
+                  <w:r>
+                    <w:rPr>
+                      <w:b/>
+                      <w:bCs/>
+                    </w:rPr>
+                    <w:t>Chrome(</w:t>
+                  </w:r>
+                  <w:proofErr w:type="gramEnd"/>
+                  <w:r>
+                    <w:rPr>
+                      <w:b/>
+                      <w:bCs/>
+                    </w:rPr>
+                    <w:t>Published output in Release)</w:t>
+                  </w:r>
+                </w:p>
+              </w:tc>
+            </w:tr>
+            <w:tr>
+              <w:tc>
+                <w:tcPr>
+                  <w:tcW w:w="1107" w:type="dxa"/>
+                  <w:tcBorders>
+                    <w:top w:val="single" w:sz="8" w:space="0" w:color="A3A3A3"/>
+                    <w:left w:val="single" w:sz="8" w:space="0" w:color="A3A3A3"/>
+                    <w:bottom w:val="single" w:sz="8" w:space="0" w:color="A3A3A3"/>
+                    <w:right w:val="single" w:sz="8" w:space="0" w:color="A3A3A3"/>
+                  </w:tcBorders>
+                  <w:tcMar>
+                    <w:top w:w="40" w:type="dxa"/>
+                    <w:left w:w="60" w:type="dxa"/>
+                    <w:bottom w:w="40" w:type="dxa"/>
+                    <w:right w:w="60" w:type="dxa"/>
+                  </w:tcMar>
+                  <w:hideMark/>
+                </w:tcPr>
+                <w:p>
+                  <w:r>
+                    <w:t>Static SSR</w:t>
+                  </w:r>
+                </w:p>
+              </w:tc>
+              <w:tc>
+                <w:tcPr>
+                  <w:tcW w:w="1057" w:type="dxa"/>
+                  <w:tcBorders>
+                    <w:top w:val="single" w:sz="8" w:space="0" w:color="A3A3A3"/>
+                    <w:left w:val="single" w:sz="8" w:space="0" w:color="A3A3A3"/>
+                    <w:bottom w:val="single" w:sz="8" w:space="0" w:color="A3A3A3"/>
+                    <w:right w:val="single" w:sz="8" w:space="0" w:color="A3A3A3"/>
+                  </w:tcBorders>
+                  <w:tcMar>
+                    <w:top w:w="40" w:type="dxa"/>
+                    <w:left w:w="60" w:type="dxa"/>
+                    <w:bottom w:w="40" w:type="dxa"/>
+                    <w:right w:w="60" w:type="dxa"/>
+                  </w:tcMar>
+                  <w:hideMark/>
+                </w:tcPr>
+                <w:p>
+                  <w:r>
+                    <w:t>Pass</w:t>
+                  </w:r>
+                </w:p>
+              </w:tc>
+              <w:tc>
+                <w:tcPr>
+                  <w:tcW w:w="1083" w:type="dxa"/>
+                  <w:tcBorders>
+                    <w:top w:val="single" w:sz="8" w:space="0" w:color="A3A3A3"/>
+                    <w:left w:val="single" w:sz="8" w:space="0" w:color="A3A3A3"/>
+                    <w:bottom w:val="single" w:sz="8" w:space="0" w:color="A3A3A3"/>
+                    <w:right w:val="single" w:sz="8" w:space="0" w:color="A3A3A3"/>
+                  </w:tcBorders>
+                  <w:tcMar>
+                    <w:top w:w="40" w:type="dxa"/>
+                    <w:left w:w="60" w:type="dxa"/>
+                    <w:bottom w:w="40" w:type="dxa"/>
+                    <w:right w:w="60" w:type="dxa"/>
+                  </w:tcMar>
+                  <w:hideMark/>
+                </w:tcPr>
+                <w:p>
+                  <w:r>
+                    <w:t>Pass</w:t>
+                  </w:r>
+                </w:p>
+              </w:tc>
+              <w:tc>
+                <w:tcPr>
+                  <w:tcW w:w="1185" w:type="dxa"/>
+                  <w:tcBorders>
+                    <w:top w:val="single" w:sz="8" w:space="0" w:color="A3A3A3"/>
+                    <w:left w:val="single" w:sz="8" w:space="0" w:color="A3A3A3"/>
+                    <w:bottom w:val="single" w:sz="8" w:space="0" w:color="A3A3A3"/>
+                    <w:right w:val="single" w:sz="8" w:space="0" w:color="A3A3A3"/>
+                  </w:tcBorders>
+                  <w:tcMar>
+                    <w:top w:w="40" w:type="dxa"/>
+                    <w:left w:w="60" w:type="dxa"/>
+                    <w:bottom w:w="40" w:type="dxa"/>
+                    <w:right w:w="60" w:type="dxa"/>
+                  </w:tcMar>
+                  <w:hideMark/>
+                </w:tcPr>
+                <w:p>
+                  <w:r>
+                    <w:t>Pass</w:t>
+                  </w:r>
+                </w:p>
+              </w:tc>
+              <w:tc>
+                <w:tcPr>
+                  <w:tcW w:w="971" w:type="dxa"/>
+                  <w:tcBorders>
+                    <w:top w:val="single" w:sz="8" w:space="0" w:color="A3A3A3"/>
+                    <w:left w:val="single" w:sz="8" w:space="0" w:color="A3A3A3"/>
+                    <w:bottom w:val="single" w:sz="8" w:space="0" w:color="A3A3A3"/>
+                    <w:right w:val="single" w:sz="8" w:space="0" w:color="A3A3A3"/>
+                  </w:tcBorders>
+                  <w:tcMar>
+                    <w:top w:w="40" w:type="dxa"/>
+                    <w:left w:w="60" w:type="dxa"/>
+                    <w:bottom w:w="40" w:type="dxa"/>
+                    <w:right w:w="60" w:type="dxa"/>
+                  </w:tcMar>
+                  <w:hideMark/>
+                </w:tcPr>
+                <w:p>
+                  <w:r>
+                    <w:t>Pass</w:t>
+                  </w:r>
+                </w:p>
+              </w:tc>
+            </w:tr>
+            <w:tr>
+              <w:tc>
+                <w:tcPr>
+                  <w:tcW w:w="1135" w:type="dxa"/>
+                  <w:tcBorders>
+                    <w:top w:val="single" w:sz="8" w:space="0" w:color="A3A3A3"/>
+                    <w:left w:val="single" w:sz="8" w:space="0" w:color="A3A3A3"/>
+                    <w:bottom w:val="single" w:sz="8" w:space="0" w:color="A3A3A3"/>
+                    <w:right w:val="single" w:sz="8" w:space="0" w:color="A3A3A3"/>
+                  </w:tcBorders>
+                  <w:tcMar>
+                    <w:top w:w="40" w:type="dxa"/>
+                    <w:left w:w="60" w:type="dxa"/>
+                    <w:bottom w:w="40" w:type="dxa"/>
+                    <w:right w:w="60" w:type="dxa"/>
+                  </w:tcMar>
+                  <w:hideMark/>
+                </w:tcPr>
+                <w:p>
+                  <w:r>
+                    <w:t>Interactive Server</w:t>
+                  </w:r>
+                </w:p>
+              </w:tc>
+              <w:tc>
+                <w:tcPr>
+                  <w:tcW w:w="1057" w:type="dxa"/>
+                  <w:tcBorders>
+                    <w:top w:val="single" w:sz="8" w:space="0" w:color="A3A3A3"/>
+                    <w:left w:val="single" w:sz="8" w:space="0" w:color="A3A3A3"/>
+                    <w:bottom w:val="single" w:sz="8" w:space="0" w:color="A3A3A3"/>
+                    <w:right w:val="single" w:sz="8" w:space="0" w:color="A3A3A3"/>
+                  </w:tcBorders>
+                  <w:tcMar>
+                    <w:top w:w="40" w:type="dxa"/>
+                    <w:left w:w="60" w:type="dxa"/>
+                    <w:bottom w:w="40" w:type="dxa"/>
+                    <w:right w:w="60" w:type="dxa"/>
+                  </w:tcMar>
+                  <w:hideMark/>
+                </w:tcPr>
+                <w:p>
+                  <w:r>
+                    <w:t>Pass</w:t>
+                  </w:r>
+                </w:p>
+              </w:tc>
+              <w:tc>
+                <w:tcPr>
+                  <w:tcW w:w="1083" w:type="dxa"/>
+                  <w:tcBorders>
+                    <w:top w:val="single" w:sz="8" w:space="0" w:color="A3A3A3"/>
+                    <w:left w:val="single" w:sz="8" w:space="0" w:color="A3A3A3"/>
+                    <w:bottom w:val="single" w:sz="8" w:space="0" w:color="A3A3A3"/>
+                    <w:right w:val="single" w:sz="8" w:space="0" w:color="A3A3A3"/>
+                  </w:tcBorders>
+                  <w:tcMar>
+                    <w:top w:w="40" w:type="dxa"/>
+                    <w:left w:w="60" w:type="dxa"/>
+                    <w:bottom w:w="40" w:type="dxa"/>
+                    <w:right w:w="60" w:type="dxa"/>
+                  </w:tcMar>
+                  <w:hideMark/>
+                </w:tcPr>
+                <w:p>
+                  <w:r>
+                    <w:t>Pass</w:t>
+                  </w:r>
+                </w:p>
+              </w:tc>
+              <w:tc>
+                <w:tcPr>
+                  <w:tcW w:w="1185" w:type="dxa"/>
+                  <w:tcBorders>
+                    <w:top w:val="single" w:sz="8" w:space="0" w:color="A3A3A3"/>
+                    <w:left w:val="single" w:sz="8" w:space="0" w:color="A3A3A3"/>
+                    <w:bottom w:val="single" w:sz="8" w:space="0" w:color="A3A3A3"/>
+                    <w:right w:val="single" w:sz="8" w:space="0" w:color="A3A3A3"/>
+                  </w:tcBorders>
+                  <w:tcMar>
+                    <w:top w:w="40" w:type="dxa"/>
+                    <w:left w:w="60" w:type="dxa"/>
+                    <w:bottom w:w="40" w:type="dxa"/>
+                    <w:right w:w="60" w:type="dxa"/>
+                  </w:tcMar>
+                  <w:hideMark/>
+                </w:tcPr>
+                <w:p>
+                  <w:r>
+                    <w:t>Pass</w:t>
+                  </w:r>
+                </w:p>
+              </w:tc>
+              <w:tc>
+                <w:tcPr>
+                  <w:tcW w:w="971" w:type="dxa"/>
+                  <w:tcBorders>
+                    <w:top w:val="single" w:sz="8" w:space="0" w:color="A3A3A3"/>
+                    <w:left w:val="single" w:sz="8" w:space="0" w:color="A3A3A3"/>
+                    <w:bottom w:val="single" w:sz="8" w:space="0" w:color="A3A3A3"/>
+                    <w:right w:val="single" w:sz="8" w:space="0" w:color="A3A3A3"/>
+                  </w:tcBorders>
+                  <w:tcMar>
+                    <w:top w:w="40" w:type="dxa"/>
+                    <w:left w:w="60" w:type="dxa"/>
+                    <w:bottom w:w="40" w:type="dxa"/>
+                    <w:right w:w="60" w:type="dxa"/>
+                  </w:tcMar>
+                  <w:hideMark/>
+                </w:tcPr>
+                <w:p>
+                  <w:r>
+                    <w:t>Pass</w:t>
+                  </w:r>
+                </w:p>
+              </w:tc>
+            </w:tr>
+            <w:tr>
+              <w:tc>
+                <w:tcPr>
+                  <w:tcW w:w="1135" w:type="dxa"/>
+                  <w:tcBorders>
+                    <w:top w:val="single" w:sz="8" w:space="0" w:color="A3A3A3"/>
+                    <w:left w:val="single" w:sz="8" w:space="0" w:color="A3A3A3"/>
+                    <w:bottom w:val="single" w:sz="8" w:space="0" w:color="A3A3A3"/>
+                    <w:right w:val="single" w:sz="8" w:space="0" w:color="A3A3A3"/>
+                  </w:tcBorders>
+                  <w:tcMar>
+                    <w:top w:w="40" w:type="dxa"/>
+                    <w:left w:w="60" w:type="dxa"/>
+                    <w:bottom w:w="40" w:type="dxa"/>
+                    <w:right w:w="60" w:type="dxa"/>
+                  </w:tcMar>
+                  <w:hideMark/>
+                </w:tcPr>
+                <w:p>
+                  <w:r>
+                    <w:t xml:space="preserve">Interactive </w:t>
+                  </w:r>
+                  <w:proofErr w:type="spellStart"/>
+                  <w:r>
+                    <w:t>WebAssembly</w:t>
+                  </w:r>
+                  <w:proofErr w:type="spellEnd"/>
+                </w:p>
+              </w:tc>
+              <w:tc>
+                <w:tcPr>
+                  <w:tcW w:w="1057" w:type="dxa"/>
+                  <w:tcBorders>
+                    <w:top w:val="single" w:sz="8" w:space="0" w:color="A3A3A3"/>
+                    <w:left w:val="single" w:sz="8" w:space="0" w:color="A3A3A3"/>
+                    <w:bottom w:val="single" w:sz="8" w:space="0" w:color="A3A3A3"/>
+                    <w:right w:val="single" w:sz="8" w:space="0" w:color="A3A3A3"/>
+                  </w:tcBorders>
+                  <w:tcMar>
+                    <w:top w:w="40" w:type="dxa"/>
+                    <w:left w:w="60" w:type="dxa"/>
+                    <w:bottom w:w="40" w:type="dxa"/>
+                    <w:right w:w="60" w:type="dxa"/>
+                  </w:tcMar>
+                  <w:hideMark/>
+                </w:tcPr>
+                <w:p>
+                  <w:r>
+                    <w:t>Pass</w:t>
+                  </w:r>
+                </w:p>
+              </w:tc>
+              <w:tc>
+                <w:tcPr>
+                  <w:tcW w:w="1083" w:type="dxa"/>
+                  <w:tcBorders>
+                    <w:top w:val="single" w:sz="8" w:space="0" w:color="A3A3A3"/>
+                    <w:left w:val="single" w:sz="8" w:space="0" w:color="A3A3A3"/>
+                    <w:bottom w:val="single" w:sz="8" w:space="0" w:color="A3A3A3"/>
+                    <w:right w:val="single" w:sz="8" w:space="0" w:color="A3A3A3"/>
+                  </w:tcBorders>
+                  <w:tcMar>
+                    <w:top w:w="40" w:type="dxa"/>
+                    <w:left w:w="60" w:type="dxa"/>
+                    <w:bottom w:w="40" w:type="dxa"/>
+                    <w:right w:w="60" w:type="dxa"/>
+                  </w:tcMar>
+                  <w:hideMark/>
+                </w:tcPr>
+                <w:p>
+                  <w:r>
+                    <w:t>Pass</w:t>
+                  </w:r>
+                </w:p>
+              </w:tc>
+              <w:tc>
+                <w:tcPr>
+                  <w:tcW w:w="1185" w:type="dxa"/>
+                  <w:tcBorders>
+                    <w:top w:val="single" w:sz="8" w:space="0" w:color="A3A3A3"/>
+                    <w:left w:val="single" w:sz="8" w:space="0" w:color="A3A3A3"/>
+                    <w:bottom w:val="single" w:sz="8" w:space="0" w:color="A3A3A3"/>
+                    <w:right w:val="single" w:sz="8" w:space="0" w:color="A3A3A3"/>
+                  </w:tcBorders>
+                  <w:tcMar>
+                    <w:top w:w="40" w:type="dxa"/>
+                    <w:left w:w="60" w:type="dxa"/>
+                    <w:bottom w:w="40" w:type="dxa"/>
+                    <w:right w:w="60" w:type="dxa"/>
+                  </w:tcMar>
+                  <w:hideMark/>
+                </w:tcPr>
+                <w:p>
+                  <w:r>
+                    <w:t>Pass</w:t>
+                  </w:r>
+                </w:p>
+              </w:tc>
+              <w:tc>
+                <w:tcPr>
+                  <w:tcW w:w="971" w:type="dxa"/>
+                  <w:tcBorders>
+                    <w:top w:val="single" w:sz="8" w:space="0" w:color="A3A3A3"/>
+                    <w:left w:val="single" w:sz="8" w:space="0" w:color="A3A3A3"/>
+                    <w:bottom w:val="single" w:sz="8" w:space="0" w:color="A3A3A3"/>
+                    <w:right w:val="single" w:sz="8" w:space="0" w:color="A3A3A3"/>
+                  </w:tcBorders>
+                  <w:tcMar>
+                    <w:top w:w="40" w:type="dxa"/>
+                    <w:left w:w="60" w:type="dxa"/>
+                    <w:bottom w:w="40" w:type="dxa"/>
+                    <w:right w:w="60" w:type="dxa"/>
+                  </w:tcMar>
+                  <w:hideMark/>
+                </w:tcPr>
+                <w:p>
+                  <w:r>
+                    <w:t>Pass</w:t>
+                  </w:r>
+                </w:p>
+              </w:tc>
+            </w:tr>
+            <w:tr>
+              <w:tc>
+                <w:tcPr>
+                  <w:tcW w:w="1135" w:type="dxa"/>
+                  <w:tcBorders>
+                    <w:top w:val="single" w:sz="8" w:space="0" w:color="A3A3A3"/>
+                    <w:left w:val="single" w:sz="8" w:space="0" w:color="A3A3A3"/>
+                    <w:bottom w:val="single" w:sz="8" w:space="0" w:color="A3A3A3"/>
+                    <w:right w:val="single" w:sz="8" w:space="0" w:color="A3A3A3"/>
+                  </w:tcBorders>
+                  <w:tcMar>
+                    <w:top w:w="40" w:type="dxa"/>
+                    <w:left w:w="60" w:type="dxa"/>
+                    <w:bottom w:w="40" w:type="dxa"/>
+                    <w:right w:w="60" w:type="dxa"/>
+                  </w:tcMar>
+                  <w:hideMark/>
+                </w:tcPr>
+                <w:p>
+                  <w:r>
+                    <w:t>Interactive Auto</w:t>
+                  </w:r>
+                </w:p>
+              </w:tc>
+              <w:tc>
+                <w:tcPr>
+                  <w:tcW w:w="1057" w:type="dxa"/>
+                  <w:tcBorders>
+                    <w:top w:val="single" w:sz="8" w:space="0" w:color="A3A3A3"/>
+                    <w:left w:val="single" w:sz="8" w:space="0" w:color="A3A3A3"/>
+                    <w:bottom w:val="single" w:sz="8" w:space="0" w:color="A3A3A3"/>
+                    <w:right w:val="single" w:sz="8" w:space="0" w:color="A3A3A3"/>
+                  </w:tcBorders>
+                  <w:tcMar>
+                    <w:top w:w="40" w:type="dxa"/>
+                    <w:left w:w="60" w:type="dxa"/>
+                    <w:bottom w:w="40" w:type="dxa"/>
+                    <w:right w:w="60" w:type="dxa"/>
+                  </w:tcMar>
+                  <w:hideMark/>
+                </w:tcPr>
+                <w:p>
+                  <w:r>
+                    <w:t>Pass</w:t>
+                  </w:r>
+                </w:p>
+              </w:tc>
+              <w:tc>
+                <w:tcPr>
+                  <w:tcW w:w="1083" w:type="dxa"/>
+                  <w:tcBorders>
+                    <w:top w:val="single" w:sz="8" w:space="0" w:color="A3A3A3"/>
+                    <w:left w:val="single" w:sz="8" w:space="0" w:color="A3A3A3"/>
+                    <w:bottom w:val="single" w:sz="8" w:space="0" w:color="A3A3A3"/>
+                    <w:right w:val="single" w:sz="8" w:space="0" w:color="A3A3A3"/>
+                  </w:tcBorders>
+                  <w:tcMar>
+                    <w:top w:w="40" w:type="dxa"/>
+                    <w:left w:w="60" w:type="dxa"/>
+                    <w:bottom w:w="40" w:type="dxa"/>
+                    <w:right w:w="60" w:type="dxa"/>
+                  </w:tcMar>
+                  <w:hideMark/>
+                </w:tcPr>
+                <w:p>
+                  <w:r>
+                    <w:t>Pass</w:t>
+                  </w:r>
+                </w:p>
+              </w:tc>
+              <w:tc>
+                <w:tcPr>
+                  <w:tcW w:w="1185" w:type="dxa"/>
+                  <w:tcBorders>
+                    <w:top w:val="single" w:sz="8" w:space="0" w:color="A3A3A3"/>
+                    <w:left w:val="single" w:sz="8" w:space="0" w:color="A3A3A3"/>
+                    <w:bottom w:val="single" w:sz="8" w:space="0" w:color="A3A3A3"/>
+                    <w:right w:val="single" w:sz="8" w:space="0" w:color="A3A3A3"/>
+                  </w:tcBorders>
+                  <w:tcMar>
+                    <w:top w:w="40" w:type="dxa"/>
+                    <w:left w:w="60" w:type="dxa"/>
+                    <w:bottom w:w="40" w:type="dxa"/>
+                    <w:right w:w="60" w:type="dxa"/>
+                  </w:tcMar>
+                  <w:hideMark/>
+                </w:tcPr>
+                <w:p>
+                  <w:r>
+                    <w:t>Pass</w:t>
+                  </w:r>
+                </w:p>
+              </w:tc>
+              <w:tc>
+                <w:tcPr>
+                  <w:tcW w:w="971" w:type="dxa"/>
+                  <w:tcBorders>
+                    <w:top w:val="single" w:sz="8" w:space="0" w:color="A3A3A3"/>
+                    <w:left w:val="single" w:sz="8" w:space="0" w:color="A3A3A3"/>
+                    <w:bottom w:val="single" w:sz="8" w:space="0" w:color="A3A3A3"/>
+                    <w:right w:val="single" w:sz="8" w:space="0" w:color="A3A3A3"/>
+                  </w:tcBorders>
+                  <w:tcMar>
+                    <w:top w:w="40" w:type="dxa"/>
+                    <w:left w:w="60" w:type="dxa"/>
+                    <w:bottom w:w="40" w:type="dxa"/>
+                    <w:right w:w="60" w:type="dxa"/>
+                  </w:tcMar>
+                  <w:hideMark/>
+                </w:tcPr>
+                <w:p>
+                  <w:r>
+                    <w:t>Pass</w:t>
+                  </w:r>
+                </w:p>
+              </w:tc>
+            </w:tr>
+          </w:tbl>
+          <w:p/>
+        </w:tc>
+        <w:tc>
+          <w:tcPr>
+            <w:tcW w:w="1172" w:type="dxa"/>
+            <w:tcBorders>
+              <w:top w:val="single" w:sz="8" w:space="0" w:color="A3A3A3"/>
+              <w:left w:val="single" w:sz="8" w:space="0" w:color="A3A3A3"/>
+              <w:bottom w:val="single" w:sz="8" w:space="0" w:color="A3A3A3"/>
+              <w:right w:val="single" w:sz="8" w:space="0" w:color="A3A3A3"/>
+            </w:tcBorders>
+            <w:tcMar>
+              <w:top w:w="40" w:type="dxa"/>
+              <w:left w:w="60" w:type="dxa"/>
+              <w:bottom w:w="40" w:type="dxa"/>
+              <w:right w:w="60" w:type="dxa"/>
+            </w:tcMar>
+          </w:tcPr>
+          <w:p>
+            <w:r>
+              <w:t>See Evidence Table.</w:t>
+            </w:r>
+          </w:p>
+        </w:tc>
+      </w:tr>
+      <w:tr>
+        <w:tc>
+          <w:tcPr>
+            <w:tcW w:w="963" w:type="dxa"/>
+            <w:tcBorders>
+              <w:top w:val="single" w:sz="8" w:space="0" w:color="A3A3A3"/>
+              <w:left w:val="single" w:sz="8" w:space="0" w:color="A3A3A3"/>
+              <w:bottom w:val="single" w:sz="8" w:space="0" w:color="A3A3A3"/>
+              <w:right w:val="single" w:sz="8" w:space="0" w:color="A3A3A3"/>
+            </w:tcBorders>
+            <w:tcMar>
+              <w:top w:w="40" w:type="dxa"/>
+              <w:left w:w="60" w:type="dxa"/>
+              <w:bottom w:w="40" w:type="dxa"/>
+              <w:right w:w="60" w:type="dxa"/>
+            </w:tcMar>
+          </w:tcPr>
+          <w:p>
+            <w:r>
+              <w:t xml:space="preserve">Opening the menu, then </w:t>
+            </w:r>
+            <w:r>
+              <w:lastRenderedPageBreak/>
+              <w:t>tapping outside it</w:t>
+            </w:r>
+          </w:p>
+        </w:tc>
+        <w:tc>
+          <w:tcPr>
+            <w:tcW w:w="7205" w:type="dxa"/>
+            <w:tcBorders>
+              <w:top w:val="single" w:sz="8" w:space="0" w:color="A3A3A3"/>
+              <w:left w:val="single" w:sz="8" w:space="0" w:color="A3A3A3"/>
+              <w:bottom w:val="single" w:sz="8" w:space="0" w:color="A3A3A3"/>
+              <w:right w:val="single" w:sz="8" w:space="0" w:color="A3A3A3"/>
+            </w:tcBorders>
+            <w:tcMar>
+              <w:top w:w="40" w:type="dxa"/>
+              <w:left w:w="60" w:type="dxa"/>
+              <w:bottom w:w="40" w:type="dxa"/>
+              <w:right w:w="60" w:type="dxa"/>
+            </w:tcMar>
+          </w:tcPr>
+          <w:p>
+            <w:r>
+              <w:lastRenderedPageBreak/>
+              <w:t>N/A</w:t>
+            </w:r>
+          </w:p>
+        </w:tc>
+        <w:tc>
+          <w:tcPr>
+            <w:tcW w:w="1172" w:type="dxa"/>
+            <w:tcBorders>
+              <w:top w:val="single" w:sz="8" w:space="0" w:color="A3A3A3"/>
+              <w:left w:val="single" w:sz="8" w:space="0" w:color="A3A3A3"/>
+              <w:bottom w:val="single" w:sz="8" w:space="0" w:color="A3A3A3"/>
+              <w:right w:val="single" w:sz="8" w:space="0" w:color="A3A3A3"/>
+            </w:tcBorders>
+            <w:tcMar>
+              <w:top w:w="40" w:type="dxa"/>
+              <w:left w:w="60" w:type="dxa"/>
+              <w:bottom w:w="40" w:type="dxa"/>
+              <w:right w:w="60" w:type="dxa"/>
+            </w:tcMar>
+          </w:tcPr>
+          <w:p>
+            <w:r>
+              <w:t xml:space="preserve">This is not a valid test case. Tapping </w:t>
+            </w:r>
+            <w:r>
+              <w:lastRenderedPageBreak/>
+              <w:t>outside does not close the navigation menu; I verified this behavior in .NET 10 and 11.</w:t>
             </w:r>
           </w:p>
         </w:tc>
@@ -3438,7 +4340,6 @@
     </w:tbl>
     <w:p>
       <w:r>
-        <w:lastRenderedPageBreak/>
         <w:t> </w:t>
       </w:r>
     </w:p>
@@ -3810,11 +4711,11 @@
           </w:tcPr>
           <w:p>
             <w:r>
-              <w:t xml:space="preserve">Interactive </w:t>
+              <w:t>Interactive Se</w:t>
             </w:r>
             <w:r>
               <w:lastRenderedPageBreak/>
-              <w:t>Server</w:t>
+              <w:t>rver</w:t>
             </w:r>
           </w:p>
         </w:tc>
@@ -3841,14 +4742,7 @@
                 <w:rPr>
                   <w:rStyle w:val="Hyperlink"/>
                 </w:rPr>
-                <w:t>Evidence\DebugModeVideos\DebugModeVideos\InteractiveServer_Edge_</w:t>
-              </w:r>
-              <w:r>
-                <w:rPr>
-                  <w:rStyle w:val="Hyperlink"/>
-                </w:rPr>
-                <w:lastRenderedPageBreak/>
-                <w:t>WithCspScriptSrcSelf.mp4</w:t>
+                <w:t>Evidence\DebugModeVideos\DebugModeVideos\InteractiveServer_Edge_WithCspScriptSrcSelf.mp4</w:t>
               </w:r>
             </w:hyperlink>
           </w:p>
@@ -3876,14 +4770,7 @@
                 <w:rPr>
                   <w:rStyle w:val="Hyperlink"/>
                 </w:rPr>
-                <w:t>Evidence\DebugModeVideos\DebugModeVideos\InteractiveServer_Chrome_</w:t>
-              </w:r>
-              <w:r>
-                <w:rPr>
-                  <w:rStyle w:val="Hyperlink"/>
-                </w:rPr>
-                <w:lastRenderedPageBreak/>
-                <w:t>WithCspScriptSrcSelf.mp4</w:t>
+                <w:t>Evidence\DebugModeVideos\DebugModeVideos\InteractiveServer_Chrome_WithCspScriptSrcSelf.mp4</w:t>
               </w:r>
             </w:hyperlink>
           </w:p>
@@ -3911,14 +4798,7 @@
                 <w:rPr>
                   <w:rStyle w:val="Hyperlink"/>
                 </w:rPr>
-                <w:t>Evidence\PublishedOutputVideos\PublishedOutputVideos\InteractiveServer_Edge</w:t>
-              </w:r>
-              <w:r>
-                <w:rPr>
-                  <w:rStyle w:val="Hyperlink"/>
-                </w:rPr>
-                <w:lastRenderedPageBreak/>
-                <w:t>_WithCspScriptSrcSelf.mp4</w:t>
+                <w:t>Evidence\PublishedOutputVideos\PublishedOutputVideos\InteractiveServer_Edge_WithCspScriptSrcSelf.mp4</w:t>
               </w:r>
             </w:hyperlink>
           </w:p>
@@ -3946,14 +4826,7 @@
                 <w:rPr>
                   <w:rStyle w:val="Hyperlink"/>
                 </w:rPr>
-                <w:t>Evidence\PublishedOutputVideos\PublishedOutputVideos\InteractiveServer_Chrome_</w:t>
-              </w:r>
-              <w:r>
-                <w:rPr>
-                  <w:rStyle w:val="Hyperlink"/>
-                </w:rPr>
-                <w:lastRenderedPageBreak/>
-                <w:t>WithCspScriptSrcSelf.mp4</w:t>
+                <w:t>Evidence\PublishedOutputVideos\PublishedOutputVideos\InteractiveServer_Chrome_WithCspScriptSrcSelf.mp4</w:t>
               </w:r>
             </w:hyperlink>
           </w:p>
@@ -3979,7 +4852,6 @@
           </w:tcPr>
           <w:p>
             <w:r>
-              <w:lastRenderedPageBreak/>
               <w:t xml:space="preserve">Interactive </w:t>
             </w:r>
             <w:proofErr w:type="spellStart"/>
@@ -7274,6 +8146,155 @@
     </w:lvl>
   </w:abstractNum>
   <w:abstractNum w:abstractNumId="9" w15:restartNumberingAfterBreak="0">
+    <w:nsid w:val="48896157"/>
+    <w:multiLevelType w:val="multilevel"/>
+    <w:tmpl w:val="32EA8376"/>
+    <w:lvl w:ilvl="0">
+      <w:start w:val="1"/>
+      <w:numFmt w:val="bullet"/>
+      <w:lvlText w:val=""/>
+      <w:lvlJc w:val="left"/>
+      <w:pPr>
+        <w:tabs>
+          <w:tab w:val="num" w:pos="720"/>
+        </w:tabs>
+        <w:ind w:left="720" w:hanging="360"/>
+      </w:pPr>
+      <w:rPr>
+        <w:rFonts w:ascii="Symbol" w:hAnsi="Symbol" w:hint="default"/>
+        <w:sz w:val="20"/>
+      </w:rPr>
+    </w:lvl>
+    <w:lvl w:ilvl="1" w:tentative="1">
+      <w:start w:val="1"/>
+      <w:numFmt w:val="bullet"/>
+      <w:lvlText w:val="o"/>
+      <w:lvlJc w:val="left"/>
+      <w:pPr>
+        <w:tabs>
+          <w:tab w:val="num" w:pos="1440"/>
+        </w:tabs>
+        <w:ind w:left="1440" w:hanging="360"/>
+      </w:pPr>
+      <w:rPr>
+        <w:rFonts w:ascii="Courier New" w:hAnsi="Courier New" w:hint="default"/>
+        <w:sz w:val="20"/>
+      </w:rPr>
+    </w:lvl>
+    <w:lvl w:ilvl="2" w:tentative="1">
+      <w:start w:val="1"/>
+      <w:numFmt w:val="bullet"/>
+      <w:lvlText w:val=""/>
+      <w:lvlJc w:val="left"/>
+      <w:pPr>
+        <w:tabs>
+          <w:tab w:val="num" w:pos="2160"/>
+        </w:tabs>
+        <w:ind w:left="2160" w:hanging="360"/>
+      </w:pPr>
+      <w:rPr>
+        <w:rFonts w:ascii="Wingdings" w:hAnsi="Wingdings" w:hint="default"/>
+        <w:sz w:val="20"/>
+      </w:rPr>
+    </w:lvl>
+    <w:lvl w:ilvl="3" w:tentative="1">
+      <w:start w:val="1"/>
+      <w:numFmt w:val="bullet"/>
+      <w:lvlText w:val=""/>
+      <w:lvlJc w:val="left"/>
+      <w:pPr>
+        <w:tabs>
+          <w:tab w:val="num" w:pos="2880"/>
+        </w:tabs>
+        <w:ind w:left="2880" w:hanging="360"/>
+      </w:pPr>
+      <w:rPr>
+        <w:rFonts w:ascii="Wingdings" w:hAnsi="Wingdings" w:hint="default"/>
+        <w:sz w:val="20"/>
+      </w:rPr>
+    </w:lvl>
+    <w:lvl w:ilvl="4" w:tentative="1">
+      <w:start w:val="1"/>
+      <w:numFmt w:val="bullet"/>
+      <w:lvlText w:val=""/>
+      <w:lvlJc w:val="left"/>
+      <w:pPr>
+        <w:tabs>
+          <w:tab w:val="num" w:pos="3600"/>
+        </w:tabs>
+        <w:ind w:left="3600" w:hanging="360"/>
+      </w:pPr>
+      <w:rPr>
+        <w:rFonts w:ascii="Wingdings" w:hAnsi="Wingdings" w:hint="default"/>
+        <w:sz w:val="20"/>
+      </w:rPr>
+    </w:lvl>
+    <w:lvl w:ilvl="5" w:tentative="1">
+      <w:start w:val="1"/>
+      <w:numFmt w:val="bullet"/>
+      <w:lvlText w:val=""/>
+      <w:lvlJc w:val="left"/>
+      <w:pPr>
+        <w:tabs>
+          <w:tab w:val="num" w:pos="4320"/>
+        </w:tabs>
+        <w:ind w:left="4320" w:hanging="360"/>
+      </w:pPr>
+      <w:rPr>
+        <w:rFonts w:ascii="Wingdings" w:hAnsi="Wingdings" w:hint="default"/>
+        <w:sz w:val="20"/>
+      </w:rPr>
+    </w:lvl>
+    <w:lvl w:ilvl="6" w:tentative="1">
+      <w:start w:val="1"/>
+      <w:numFmt w:val="bullet"/>
+      <w:lvlText w:val=""/>
+      <w:lvlJc w:val="left"/>
+      <w:pPr>
+        <w:tabs>
+          <w:tab w:val="num" w:pos="5040"/>
+        </w:tabs>
+        <w:ind w:left="5040" w:hanging="360"/>
+      </w:pPr>
+      <w:rPr>
+        <w:rFonts w:ascii="Wingdings" w:hAnsi="Wingdings" w:hint="default"/>
+        <w:sz w:val="20"/>
+      </w:rPr>
+    </w:lvl>
+    <w:lvl w:ilvl="7" w:tentative="1">
+      <w:start w:val="1"/>
+      <w:numFmt w:val="bullet"/>
+      <w:lvlText w:val=""/>
+      <w:lvlJc w:val="left"/>
+      <w:pPr>
+        <w:tabs>
+          <w:tab w:val="num" w:pos="5760"/>
+        </w:tabs>
+        <w:ind w:left="5760" w:hanging="360"/>
+      </w:pPr>
+      <w:rPr>
+        <w:rFonts w:ascii="Wingdings" w:hAnsi="Wingdings" w:hint="default"/>
+        <w:sz w:val="20"/>
+      </w:rPr>
+    </w:lvl>
+    <w:lvl w:ilvl="8" w:tentative="1">
+      <w:start w:val="1"/>
+      <w:numFmt w:val="bullet"/>
+      <w:lvlText w:val=""/>
+      <w:lvlJc w:val="left"/>
+      <w:pPr>
+        <w:tabs>
+          <w:tab w:val="num" w:pos="6480"/>
+        </w:tabs>
+        <w:ind w:left="6480" w:hanging="360"/>
+      </w:pPr>
+      <w:rPr>
+        <w:rFonts w:ascii="Wingdings" w:hAnsi="Wingdings" w:hint="default"/>
+        <w:sz w:val="20"/>
+      </w:rPr>
+    </w:lvl>
+  </w:abstractNum>
+  <w:abstractNum w:abstractNumId="10" w15:restartNumberingAfterBreak="0">
     <w:nsid w:val="4A93225A"/>
     <w:multiLevelType w:val="multilevel"/>
     <w:tmpl w:val="16F6415A"/>
@@ -7422,7 +8443,156 @@
       </w:rPr>
     </w:lvl>
   </w:abstractNum>
-  <w:abstractNum w:abstractNumId="10" w15:restartNumberingAfterBreak="0">
+  <w:abstractNum w:abstractNumId="11" w15:restartNumberingAfterBreak="0">
+    <w:nsid w:val="530072F5"/>
+    <w:multiLevelType w:val="multilevel"/>
+    <w:tmpl w:val="CAE2D91E"/>
+    <w:lvl w:ilvl="0">
+      <w:start w:val="1"/>
+      <w:numFmt w:val="bullet"/>
+      <w:lvlText w:val=""/>
+      <w:lvlJc w:val="left"/>
+      <w:pPr>
+        <w:tabs>
+          <w:tab w:val="num" w:pos="720"/>
+        </w:tabs>
+        <w:ind w:left="720" w:hanging="360"/>
+      </w:pPr>
+      <w:rPr>
+        <w:rFonts w:ascii="Symbol" w:hAnsi="Symbol" w:hint="default"/>
+        <w:sz w:val="20"/>
+      </w:rPr>
+    </w:lvl>
+    <w:lvl w:ilvl="1" w:tentative="1">
+      <w:start w:val="1"/>
+      <w:numFmt w:val="bullet"/>
+      <w:lvlText w:val="o"/>
+      <w:lvlJc w:val="left"/>
+      <w:pPr>
+        <w:tabs>
+          <w:tab w:val="num" w:pos="1440"/>
+        </w:tabs>
+        <w:ind w:left="1440" w:hanging="360"/>
+      </w:pPr>
+      <w:rPr>
+        <w:rFonts w:ascii="Courier New" w:hAnsi="Courier New" w:hint="default"/>
+        <w:sz w:val="20"/>
+      </w:rPr>
+    </w:lvl>
+    <w:lvl w:ilvl="2" w:tentative="1">
+      <w:start w:val="1"/>
+      <w:numFmt w:val="bullet"/>
+      <w:lvlText w:val=""/>
+      <w:lvlJc w:val="left"/>
+      <w:pPr>
+        <w:tabs>
+          <w:tab w:val="num" w:pos="2160"/>
+        </w:tabs>
+        <w:ind w:left="2160" w:hanging="360"/>
+      </w:pPr>
+      <w:rPr>
+        <w:rFonts w:ascii="Wingdings" w:hAnsi="Wingdings" w:hint="default"/>
+        <w:sz w:val="20"/>
+      </w:rPr>
+    </w:lvl>
+    <w:lvl w:ilvl="3" w:tentative="1">
+      <w:start w:val="1"/>
+      <w:numFmt w:val="bullet"/>
+      <w:lvlText w:val=""/>
+      <w:lvlJc w:val="left"/>
+      <w:pPr>
+        <w:tabs>
+          <w:tab w:val="num" w:pos="2880"/>
+        </w:tabs>
+        <w:ind w:left="2880" w:hanging="360"/>
+      </w:pPr>
+      <w:rPr>
+        <w:rFonts w:ascii="Wingdings" w:hAnsi="Wingdings" w:hint="default"/>
+        <w:sz w:val="20"/>
+      </w:rPr>
+    </w:lvl>
+    <w:lvl w:ilvl="4" w:tentative="1">
+      <w:start w:val="1"/>
+      <w:numFmt w:val="bullet"/>
+      <w:lvlText w:val=""/>
+      <w:lvlJc w:val="left"/>
+      <w:pPr>
+        <w:tabs>
+          <w:tab w:val="num" w:pos="3600"/>
+        </w:tabs>
+        <w:ind w:left="3600" w:hanging="360"/>
+      </w:pPr>
+      <w:rPr>
+        <w:rFonts w:ascii="Wingdings" w:hAnsi="Wingdings" w:hint="default"/>
+        <w:sz w:val="20"/>
+      </w:rPr>
+    </w:lvl>
+    <w:lvl w:ilvl="5" w:tentative="1">
+      <w:start w:val="1"/>
+      <w:numFmt w:val="bullet"/>
+      <w:lvlText w:val=""/>
+      <w:lvlJc w:val="left"/>
+      <w:pPr>
+        <w:tabs>
+          <w:tab w:val="num" w:pos="4320"/>
+        </w:tabs>
+        <w:ind w:left="4320" w:hanging="360"/>
+      </w:pPr>
+      <w:rPr>
+        <w:rFonts w:ascii="Wingdings" w:hAnsi="Wingdings" w:hint="default"/>
+        <w:sz w:val="20"/>
+      </w:rPr>
+    </w:lvl>
+    <w:lvl w:ilvl="6" w:tentative="1">
+      <w:start w:val="1"/>
+      <w:numFmt w:val="bullet"/>
+      <w:lvlText w:val=""/>
+      <w:lvlJc w:val="left"/>
+      <w:pPr>
+        <w:tabs>
+          <w:tab w:val="num" w:pos="5040"/>
+        </w:tabs>
+        <w:ind w:left="5040" w:hanging="360"/>
+      </w:pPr>
+      <w:rPr>
+        <w:rFonts w:ascii="Wingdings" w:hAnsi="Wingdings" w:hint="default"/>
+        <w:sz w:val="20"/>
+      </w:rPr>
+    </w:lvl>
+    <w:lvl w:ilvl="7" w:tentative="1">
+      <w:start w:val="1"/>
+      <w:numFmt w:val="bullet"/>
+      <w:lvlText w:val=""/>
+      <w:lvlJc w:val="left"/>
+      <w:pPr>
+        <w:tabs>
+          <w:tab w:val="num" w:pos="5760"/>
+        </w:tabs>
+        <w:ind w:left="5760" w:hanging="360"/>
+      </w:pPr>
+      <w:rPr>
+        <w:rFonts w:ascii="Wingdings" w:hAnsi="Wingdings" w:hint="default"/>
+        <w:sz w:val="20"/>
+      </w:rPr>
+    </w:lvl>
+    <w:lvl w:ilvl="8" w:tentative="1">
+      <w:start w:val="1"/>
+      <w:numFmt w:val="bullet"/>
+      <w:lvlText w:val=""/>
+      <w:lvlJc w:val="left"/>
+      <w:pPr>
+        <w:tabs>
+          <w:tab w:val="num" w:pos="6480"/>
+        </w:tabs>
+        <w:ind w:left="6480" w:hanging="360"/>
+      </w:pPr>
+      <w:rPr>
+        <w:rFonts w:ascii="Wingdings" w:hAnsi="Wingdings" w:hint="default"/>
+        <w:sz w:val="20"/>
+      </w:rPr>
+    </w:lvl>
+  </w:abstractNum>
+  <w:abstractNum w:abstractNumId="12" w15:restartNumberingAfterBreak="0">
     <w:nsid w:val="551F3F93"/>
     <w:multiLevelType w:val="multilevel"/>
     <w:tmpl w:val="7562C15E"/>
@@ -7571,7 +8741,7 @@
       </w:rPr>
     </w:lvl>
   </w:abstractNum>
-  <w:abstractNum w:abstractNumId="11" w15:restartNumberingAfterBreak="0">
+  <w:abstractNum w:abstractNumId="13" w15:restartNumberingAfterBreak="0">
     <w:nsid w:val="55C52E24"/>
     <w:multiLevelType w:val="multilevel"/>
     <w:tmpl w:val="C9729366"/>
@@ -7688,7 +8858,7 @@
       </w:pPr>
     </w:lvl>
   </w:abstractNum>
-  <w:abstractNum w:abstractNumId="12" w15:restartNumberingAfterBreak="0">
+  <w:abstractNum w:abstractNumId="14" w15:restartNumberingAfterBreak="0">
     <w:nsid w:val="5EDC73A9"/>
     <w:multiLevelType w:val="multilevel"/>
     <w:tmpl w:val="B0CAD9B4"/>
@@ -7837,7 +9007,7 @@
       </w:rPr>
     </w:lvl>
   </w:abstractNum>
-  <w:abstractNum w:abstractNumId="13" w15:restartNumberingAfterBreak="0">
+  <w:abstractNum w:abstractNumId="15" w15:restartNumberingAfterBreak="0">
     <w:nsid w:val="63A86E9D"/>
     <w:multiLevelType w:val="multilevel"/>
     <w:tmpl w:val="90686B6E"/>
@@ -7986,7 +9156,7 @@
       </w:rPr>
     </w:lvl>
   </w:abstractNum>
-  <w:abstractNum w:abstractNumId="14" w15:restartNumberingAfterBreak="0">
+  <w:abstractNum w:abstractNumId="16" w15:restartNumberingAfterBreak="0">
     <w:nsid w:val="696C144F"/>
     <w:multiLevelType w:val="multilevel"/>
     <w:tmpl w:val="B65A3616"/>
@@ -8135,7 +9305,7 @@
       </w:rPr>
     </w:lvl>
   </w:abstractNum>
-  <w:abstractNum w:abstractNumId="15" w15:restartNumberingAfterBreak="0">
+  <w:abstractNum w:abstractNumId="17" w15:restartNumberingAfterBreak="0">
     <w:nsid w:val="6C2F0456"/>
     <w:multiLevelType w:val="multilevel"/>
     <w:tmpl w:val="27CAE67C"/>
@@ -8285,7 +9455,7 @@
     </w:lvl>
   </w:abstractNum>
   <w:num w:numId="1" w16cid:durableId="1435127517">
-    <w:abstractNumId w:val="10"/>
+    <w:abstractNumId w:val="12"/>
   </w:num>
   <w:num w:numId="2" w16cid:durableId="1201821682">
     <w:abstractNumId w:val="1"/>
@@ -8303,7 +9473,7 @@
     </w:lvlOverride>
   </w:num>
   <w:num w:numId="5" w16cid:durableId="1949582827">
-    <w:abstractNumId w:val="13"/>
+    <w:abstractNumId w:val="15"/>
   </w:num>
   <w:num w:numId="6" w16cid:durableId="2090148790">
     <w:abstractNumId w:val="0"/>
@@ -8312,13 +9482,13 @@
     <w:abstractNumId w:val="2"/>
   </w:num>
   <w:num w:numId="8" w16cid:durableId="699401781">
-    <w:abstractNumId w:val="12"/>
+    <w:abstractNumId w:val="14"/>
   </w:num>
   <w:num w:numId="9" w16cid:durableId="959804759">
-    <w:abstractNumId w:val="14"/>
+    <w:abstractNumId w:val="16"/>
   </w:num>
   <w:num w:numId="10" w16cid:durableId="723412882">
-    <w:abstractNumId w:val="11"/>
+    <w:abstractNumId w:val="13"/>
     <w:lvlOverride w:ilvl="0">
       <w:startOverride w:val="1"/>
     </w:lvlOverride>
@@ -8336,13 +9506,19 @@
     <w:abstractNumId w:val="3"/>
   </w:num>
   <w:num w:numId="14" w16cid:durableId="1347361645">
-    <w:abstractNumId w:val="9"/>
+    <w:abstractNumId w:val="10"/>
   </w:num>
   <w:num w:numId="15" w16cid:durableId="1816949979">
-    <w:abstractNumId w:val="15"/>
+    <w:abstractNumId w:val="17"/>
   </w:num>
   <w:num w:numId="16" w16cid:durableId="1544976214">
     <w:abstractNumId w:val="6"/>
+  </w:num>
+  <w:num w:numId="17" w16cid:durableId="1993554907">
+    <w:abstractNumId w:val="9"/>
+  </w:num>
+  <w:num w:numId="18" w16cid:durableId="1860927008">
+    <w:abstractNumId w:val="11"/>
   </w:num>
 </w:numbering>
 </file>
@@ -8747,6 +9923,7 @@
   <w:style w:type="paragraph" w:default="1" w:styleId="Normal">
     <w:name w:val="Normal"/>
     <w:qFormat/>
+    <w:rsid w:val="005407A4"/>
   </w:style>
   <w:style w:type="paragraph" w:styleId="Heading1">
     <w:name w:val="heading 1"/>

</xml_diff>

<commit_message>
Update the BlazorCspValidationTestReport.docx with `The mobile menu remains open after page selection in .NET 11 Interactive Server, WebAssembly, and Auto samples` issue's details
</commit_message>
<xml_diff>
--- a/Evidence/BlazorCspValidationTestReport.docx
+++ b/Evidence/BlazorCspValidationTestReport.docx
@@ -111,13 +111,8 @@
         <w:ind w:left="1440"/>
       </w:pPr>
       <w:r>
-        <w:t xml:space="preserve">Interactive </w:t>
-      </w:r>
-      <w:proofErr w:type="spellStart"/>
-      <w:r>
-        <w:t>WebAssembly</w:t>
-      </w:r>
-      <w:proofErr w:type="spellEnd"/>
+        <w:t>Interactive WebAssembly</w:t>
+      </w:r>
     </w:p>
     <w:p>
       <w:pPr>
@@ -198,35 +193,7 @@
           <w:rPr>
             <w:rStyle w:val="Hyperlink"/>
           </w:rPr>
-          <w:t>BharatRamsf3693/</w:t>
-        </w:r>
-        <w:proofErr w:type="spellStart"/>
-        <w:r>
-          <w:rPr>
-            <w:rStyle w:val="Hyperlink"/>
-          </w:rPr>
-          <w:t>BlazorCspValidation</w:t>
-        </w:r>
-        <w:proofErr w:type="spellEnd"/>
-        <w:r>
-          <w:rPr>
-            <w:rStyle w:val="Hyperlink"/>
-          </w:rPr>
-          <w:t xml:space="preserve">: Sample Blazor Web Apps demonstrating Static SSR, Interactive Server, Interactive </w:t>
-        </w:r>
-        <w:proofErr w:type="spellStart"/>
-        <w:r>
-          <w:rPr>
-            <w:rStyle w:val="Hyperlink"/>
-          </w:rPr>
-          <w:t>WebAssembly</w:t>
-        </w:r>
-        <w:proofErr w:type="spellEnd"/>
-        <w:r>
-          <w:rPr>
-            <w:rStyle w:val="Hyperlink"/>
-          </w:rPr>
-          <w:t>, and Interactive Auto render modes for Content Security Policy (CSP) testing</w:t>
+          <w:t>BharatRamsf3693/BlazorCspValidation: Sample Blazor Web Apps demonstrating Static SSR, Interactive Server, Interactive WebAssembly, and Interactive Auto render modes for Content Security Policy (CSP) testing</w:t>
         </w:r>
       </w:hyperlink>
     </w:p>
@@ -246,27 +213,13 @@
           <w:b/>
           <w:bCs/>
         </w:rPr>
-        <w:t xml:space="preserve">Outcome: </w:t>
-      </w:r>
-      <w:r>
-        <w:t xml:space="preserve">Works with </w:t>
-      </w:r>
-      <w:r>
-        <w:t>1</w:t>
+        <w:t>Outcome:</w:t>
       </w:r>
       <w:r>
         <w:t xml:space="preserve"> </w:t>
       </w:r>
-      <w:proofErr w:type="gramStart"/>
-      <w:r>
-        <w:t>issues</w:t>
-      </w:r>
-      <w:proofErr w:type="gramEnd"/>
-      <w:r>
-        <w:t>.</w:t>
-      </w:r>
-      <w:r>
-        <w:t> </w:t>
+      <w:r>
+        <w:t>Two issues were identified.</w:t>
       </w:r>
     </w:p>
     <w:p>
@@ -307,9 +260,9 @@
         <w:tblDescription w:val=""/>
       </w:tblPr>
       <w:tblGrid>
-        <w:gridCol w:w="963"/>
-        <w:gridCol w:w="7205"/>
-        <w:gridCol w:w="1172"/>
+        <w:gridCol w:w="948"/>
+        <w:gridCol w:w="7085"/>
+        <w:gridCol w:w="1307"/>
       </w:tblGrid>
       <w:tr>
         <w:tc>
@@ -457,11 +410,11 @@
               <w:tblDescription w:val=""/>
             </w:tblPr>
             <w:tblGrid>
-              <w:gridCol w:w="1289"/>
-              <w:gridCol w:w="1153"/>
-              <w:gridCol w:w="1428"/>
-              <w:gridCol w:w="1460"/>
-              <w:gridCol w:w="1735"/>
+              <w:gridCol w:w="1269"/>
+              <w:gridCol w:w="1133"/>
+              <w:gridCol w:w="1403"/>
+              <w:gridCol w:w="1435"/>
+              <w:gridCol w:w="1705"/>
             </w:tblGrid>
             <w:tr>
               <w:tc>
@@ -510,129 +463,93 @@
                   <w:hideMark/>
                 </w:tcPr>
                 <w:p>
-                  <w:proofErr w:type="gramStart"/>
                   <w:r>
                     <w:rPr>
                       <w:b/>
                       <w:bCs/>
                     </w:rPr>
-                    <w:t>Edge(</w:t>
-                  </w:r>
-                  <w:proofErr w:type="gramEnd"/>
+                    <w:t>Edge(Debug mode)</w:t>
+                  </w:r>
+                </w:p>
+              </w:tc>
+              <w:tc>
+                <w:tcPr>
+                  <w:tcW w:w="1097" w:type="dxa"/>
+                  <w:tcBorders>
+                    <w:top w:val="single" w:sz="8" w:space="0" w:color="A3A3A3"/>
+                    <w:left w:val="single" w:sz="8" w:space="0" w:color="A3A3A3"/>
+                    <w:bottom w:val="single" w:sz="8" w:space="0" w:color="A3A3A3"/>
+                    <w:right w:val="single" w:sz="8" w:space="0" w:color="A3A3A3"/>
+                  </w:tcBorders>
+                  <w:tcMar>
+                    <w:top w:w="40" w:type="dxa"/>
+                    <w:left w:w="60" w:type="dxa"/>
+                    <w:bottom w:w="40" w:type="dxa"/>
+                    <w:right w:w="60" w:type="dxa"/>
+                  </w:tcMar>
+                  <w:hideMark/>
+                </w:tcPr>
+                <w:p>
                   <w:r>
                     <w:rPr>
                       <w:b/>
                       <w:bCs/>
                     </w:rPr>
-                    <w:t>Debug mode)</w:t>
-                  </w:r>
-                </w:p>
-              </w:tc>
-              <w:tc>
-                <w:tcPr>
-                  <w:tcW w:w="1097" w:type="dxa"/>
-                  <w:tcBorders>
-                    <w:top w:val="single" w:sz="8" w:space="0" w:color="A3A3A3"/>
-                    <w:left w:val="single" w:sz="8" w:space="0" w:color="A3A3A3"/>
-                    <w:bottom w:val="single" w:sz="8" w:space="0" w:color="A3A3A3"/>
-                    <w:right w:val="single" w:sz="8" w:space="0" w:color="A3A3A3"/>
-                  </w:tcBorders>
-                  <w:tcMar>
-                    <w:top w:w="40" w:type="dxa"/>
-                    <w:left w:w="60" w:type="dxa"/>
-                    <w:bottom w:w="40" w:type="dxa"/>
-                    <w:right w:w="60" w:type="dxa"/>
-                  </w:tcMar>
-                  <w:hideMark/>
-                </w:tcPr>
-                <w:p>
-                  <w:proofErr w:type="gramStart"/>
+                    <w:t>Chrome(Debug mode)</w:t>
+                  </w:r>
+                </w:p>
+              </w:tc>
+              <w:tc>
+                <w:tcPr>
+                  <w:tcW w:w="1234" w:type="dxa"/>
+                  <w:tcBorders>
+                    <w:top w:val="single" w:sz="8" w:space="0" w:color="A3A3A3"/>
+                    <w:left w:val="single" w:sz="8" w:space="0" w:color="A3A3A3"/>
+                    <w:bottom w:val="single" w:sz="8" w:space="0" w:color="A3A3A3"/>
+                    <w:right w:val="single" w:sz="8" w:space="0" w:color="A3A3A3"/>
+                  </w:tcBorders>
+                  <w:tcMar>
+                    <w:top w:w="40" w:type="dxa"/>
+                    <w:left w:w="60" w:type="dxa"/>
+                    <w:bottom w:w="40" w:type="dxa"/>
+                    <w:right w:w="60" w:type="dxa"/>
+                  </w:tcMar>
+                  <w:hideMark/>
+                </w:tcPr>
+                <w:p>
                   <w:r>
                     <w:rPr>
                       <w:b/>
                       <w:bCs/>
                     </w:rPr>
-                    <w:t>Chrome(</w:t>
-                  </w:r>
-                  <w:proofErr w:type="gramEnd"/>
+                    <w:t>Edge(Published output in Release mode)</w:t>
+                  </w:r>
+                </w:p>
+              </w:tc>
+              <w:tc>
+                <w:tcPr>
+                  <w:tcW w:w="1104" w:type="dxa"/>
+                  <w:tcBorders>
+                    <w:top w:val="single" w:sz="8" w:space="0" w:color="A3A3A3"/>
+                    <w:left w:val="single" w:sz="8" w:space="0" w:color="A3A3A3"/>
+                    <w:bottom w:val="single" w:sz="8" w:space="0" w:color="A3A3A3"/>
+                    <w:right w:val="single" w:sz="8" w:space="0" w:color="A3A3A3"/>
+                  </w:tcBorders>
+                  <w:tcMar>
+                    <w:top w:w="40" w:type="dxa"/>
+                    <w:left w:w="60" w:type="dxa"/>
+                    <w:bottom w:w="40" w:type="dxa"/>
+                    <w:right w:w="60" w:type="dxa"/>
+                  </w:tcMar>
+                  <w:hideMark/>
+                </w:tcPr>
+                <w:p>
                   <w:r>
                     <w:rPr>
                       <w:b/>
                       <w:bCs/>
                     </w:rPr>
-                    <w:t>Debug mode)</w:t>
-                  </w:r>
-                </w:p>
-              </w:tc>
-              <w:tc>
-                <w:tcPr>
-                  <w:tcW w:w="1234" w:type="dxa"/>
-                  <w:tcBorders>
-                    <w:top w:val="single" w:sz="8" w:space="0" w:color="A3A3A3"/>
-                    <w:left w:val="single" w:sz="8" w:space="0" w:color="A3A3A3"/>
-                    <w:bottom w:val="single" w:sz="8" w:space="0" w:color="A3A3A3"/>
-                    <w:right w:val="single" w:sz="8" w:space="0" w:color="A3A3A3"/>
-                  </w:tcBorders>
-                  <w:tcMar>
-                    <w:top w:w="40" w:type="dxa"/>
-                    <w:left w:w="60" w:type="dxa"/>
-                    <w:bottom w:w="40" w:type="dxa"/>
-                    <w:right w:w="60" w:type="dxa"/>
-                  </w:tcMar>
-                  <w:hideMark/>
-                </w:tcPr>
-                <w:p>
-                  <w:proofErr w:type="gramStart"/>
-                  <w:r>
-                    <w:rPr>
-                      <w:b/>
-                      <w:bCs/>
-                    </w:rPr>
-                    <w:t>Edge(</w:t>
-                  </w:r>
-                  <w:proofErr w:type="gramEnd"/>
-                  <w:r>
-                    <w:rPr>
-                      <w:b/>
-                      <w:bCs/>
-                    </w:rPr>
-                    <w:t>Published output in Release mode)</w:t>
-                  </w:r>
-                </w:p>
-              </w:tc>
-              <w:tc>
-                <w:tcPr>
-                  <w:tcW w:w="1104" w:type="dxa"/>
-                  <w:tcBorders>
-                    <w:top w:val="single" w:sz="8" w:space="0" w:color="A3A3A3"/>
-                    <w:left w:val="single" w:sz="8" w:space="0" w:color="A3A3A3"/>
-                    <w:bottom w:val="single" w:sz="8" w:space="0" w:color="A3A3A3"/>
-                    <w:right w:val="single" w:sz="8" w:space="0" w:color="A3A3A3"/>
-                  </w:tcBorders>
-                  <w:tcMar>
-                    <w:top w:w="40" w:type="dxa"/>
-                    <w:left w:w="60" w:type="dxa"/>
-                    <w:bottom w:w="40" w:type="dxa"/>
-                    <w:right w:w="60" w:type="dxa"/>
-                  </w:tcMar>
-                  <w:hideMark/>
-                </w:tcPr>
-                <w:p>
-                  <w:proofErr w:type="gramStart"/>
-                  <w:r>
-                    <w:rPr>
-                      <w:b/>
-                      <w:bCs/>
-                    </w:rPr>
-                    <w:t>Chrome(</w:t>
-                  </w:r>
-                  <w:proofErr w:type="gramEnd"/>
-                  <w:r>
-                    <w:rPr>
-                      <w:b/>
-                      <w:bCs/>
-                    </w:rPr>
-                    <w:t>Published output in Release mode)</w:t>
+                    <w:t>Chrome(Published output in Release mode)</w:t>
                   </w:r>
                 </w:p>
               </w:tc>
@@ -892,13 +809,8 @@
                 <w:p>
                   <w:r>
                     <w:lastRenderedPageBreak/>
-                    <w:t xml:space="preserve">Interactive </w:t>
-                  </w:r>
-                  <w:proofErr w:type="spellStart"/>
-                  <w:r>
-                    <w:t>WebAssembly</w:t>
-                  </w:r>
-                  <w:proofErr w:type="spellEnd"/>
+                    <w:t>Interactive WebAssembly</w:t>
+                  </w:r>
                 </w:p>
               </w:tc>
               <w:tc>
@@ -1134,27 +1046,11 @@
           <w:p>
             <w:r>
               <w:lastRenderedPageBreak/>
-              <w:t>We are getting a console error due to an inline script violation because the &lt;</w:t>
-            </w:r>
-            <w:proofErr w:type="spellStart"/>
-            <w:r>
-              <w:t>ImportM</w:t>
+              <w:t xml:space="preserve">We are getting a console error due to an inline script violation because the &lt;ImportMap /&gt; </w:t>
             </w:r>
             <w:r>
               <w:lastRenderedPageBreak/>
-              <w:t>ap</w:t>
-            </w:r>
-            <w:proofErr w:type="spellEnd"/>
-            <w:r>
-              <w:t xml:space="preserve"> /&gt; component conflicts with the script-</w:t>
-            </w:r>
-            <w:proofErr w:type="spellStart"/>
-            <w:r>
-              <w:t>src</w:t>
-            </w:r>
-            <w:proofErr w:type="spellEnd"/>
-            <w:r>
-              <w:t xml:space="preserve"> 'self'; directive. To suppress and fix this violation, we need to follow this guide: </w:t>
+              <w:t xml:space="preserve">component conflicts with the script-src 'self'; directive. To suppress and fix this violation, we need to follow this guide: </w:t>
             </w:r>
             <w:hyperlink r:id="rId6" w:anchor="import-map-content-security-policy-csp-violations" w:history="1">
               <w:r>
@@ -1197,11 +1093,11 @@
           <w:p>
             <w:r>
               <w:lastRenderedPageBreak/>
-              <w:t xml:space="preserve">On a narrow viewport the navigation menu opens, </w:t>
+              <w:t xml:space="preserve">On a narrow viewport the navigation menu opens, closes, and navigates to a </w:t>
             </w:r>
             <w:r>
               <w:lastRenderedPageBreak/>
-              <w:t>closes, and navigates to a chosen page.</w:t>
+              <w:t>chosen page.</w:t>
             </w:r>
           </w:p>
         </w:tc>
@@ -1240,11 +1136,11 @@
               <w:tblDescription w:val=""/>
             </w:tblPr>
             <w:tblGrid>
-              <w:gridCol w:w="1289"/>
-              <w:gridCol w:w="1153"/>
-              <w:gridCol w:w="1428"/>
-              <w:gridCol w:w="1460"/>
-              <w:gridCol w:w="1735"/>
+              <w:gridCol w:w="1269"/>
+              <w:gridCol w:w="1133"/>
+              <w:gridCol w:w="1403"/>
+              <w:gridCol w:w="1435"/>
+              <w:gridCol w:w="1705"/>
             </w:tblGrid>
             <w:tr>
               <w:tc>
@@ -1293,129 +1189,93 @@
                   <w:hideMark/>
                 </w:tcPr>
                 <w:p>
-                  <w:proofErr w:type="gramStart"/>
                   <w:r>
                     <w:rPr>
                       <w:b/>
                       <w:bCs/>
                     </w:rPr>
-                    <w:t>Edge(</w:t>
-                  </w:r>
-                  <w:proofErr w:type="gramEnd"/>
+                    <w:t>Edge(Debug mode)</w:t>
+                  </w:r>
+                </w:p>
+              </w:tc>
+              <w:tc>
+                <w:tcPr>
+                  <w:tcW w:w="1107" w:type="dxa"/>
+                  <w:tcBorders>
+                    <w:top w:val="single" w:sz="8" w:space="0" w:color="A3A3A3"/>
+                    <w:left w:val="single" w:sz="8" w:space="0" w:color="A3A3A3"/>
+                    <w:bottom w:val="single" w:sz="8" w:space="0" w:color="A3A3A3"/>
+                    <w:right w:val="single" w:sz="8" w:space="0" w:color="A3A3A3"/>
+                  </w:tcBorders>
+                  <w:tcMar>
+                    <w:top w:w="40" w:type="dxa"/>
+                    <w:left w:w="60" w:type="dxa"/>
+                    <w:bottom w:w="40" w:type="dxa"/>
+                    <w:right w:w="60" w:type="dxa"/>
+                  </w:tcMar>
+                  <w:hideMark/>
+                </w:tcPr>
+                <w:p>
                   <w:r>
                     <w:rPr>
                       <w:b/>
                       <w:bCs/>
                     </w:rPr>
-                    <w:t>Debug mode)</w:t>
-                  </w:r>
-                </w:p>
-              </w:tc>
-              <w:tc>
-                <w:tcPr>
-                  <w:tcW w:w="1107" w:type="dxa"/>
-                  <w:tcBorders>
-                    <w:top w:val="single" w:sz="8" w:space="0" w:color="A3A3A3"/>
-                    <w:left w:val="single" w:sz="8" w:space="0" w:color="A3A3A3"/>
-                    <w:bottom w:val="single" w:sz="8" w:space="0" w:color="A3A3A3"/>
-                    <w:right w:val="single" w:sz="8" w:space="0" w:color="A3A3A3"/>
-                  </w:tcBorders>
-                  <w:tcMar>
-                    <w:top w:w="40" w:type="dxa"/>
-                    <w:left w:w="60" w:type="dxa"/>
-                    <w:bottom w:w="40" w:type="dxa"/>
-                    <w:right w:w="60" w:type="dxa"/>
-                  </w:tcMar>
-                  <w:hideMark/>
-                </w:tcPr>
-                <w:p>
-                  <w:proofErr w:type="gramStart"/>
+                    <w:t>Chrome(Debug mode)</w:t>
+                  </w:r>
+                </w:p>
+              </w:tc>
+              <w:tc>
+                <w:tcPr>
+                  <w:tcW w:w="1210" w:type="dxa"/>
+                  <w:tcBorders>
+                    <w:top w:val="single" w:sz="8" w:space="0" w:color="A3A3A3"/>
+                    <w:left w:val="single" w:sz="8" w:space="0" w:color="A3A3A3"/>
+                    <w:bottom w:val="single" w:sz="8" w:space="0" w:color="A3A3A3"/>
+                    <w:right w:val="single" w:sz="8" w:space="0" w:color="A3A3A3"/>
+                  </w:tcBorders>
+                  <w:tcMar>
+                    <w:top w:w="40" w:type="dxa"/>
+                    <w:left w:w="60" w:type="dxa"/>
+                    <w:bottom w:w="40" w:type="dxa"/>
+                    <w:right w:w="60" w:type="dxa"/>
+                  </w:tcMar>
+                  <w:hideMark/>
+                </w:tcPr>
+                <w:p>
                   <w:r>
                     <w:rPr>
                       <w:b/>
                       <w:bCs/>
                     </w:rPr>
-                    <w:t>Chrome(</w:t>
-                  </w:r>
-                  <w:proofErr w:type="gramEnd"/>
+                    <w:t>Edge(Published output in Release)</w:t>
+                  </w:r>
+                </w:p>
+              </w:tc>
+              <w:tc>
+                <w:tcPr>
+                  <w:tcW w:w="1104" w:type="dxa"/>
+                  <w:tcBorders>
+                    <w:top w:val="single" w:sz="8" w:space="0" w:color="A3A3A3"/>
+                    <w:left w:val="single" w:sz="8" w:space="0" w:color="A3A3A3"/>
+                    <w:bottom w:val="single" w:sz="8" w:space="0" w:color="A3A3A3"/>
+                    <w:right w:val="single" w:sz="8" w:space="0" w:color="A3A3A3"/>
+                  </w:tcBorders>
+                  <w:tcMar>
+                    <w:top w:w="40" w:type="dxa"/>
+                    <w:left w:w="60" w:type="dxa"/>
+                    <w:bottom w:w="40" w:type="dxa"/>
+                    <w:right w:w="60" w:type="dxa"/>
+                  </w:tcMar>
+                  <w:hideMark/>
+                </w:tcPr>
+                <w:p>
                   <w:r>
                     <w:rPr>
                       <w:b/>
                       <w:bCs/>
                     </w:rPr>
-                    <w:t>Debug mode)</w:t>
-                  </w:r>
-                </w:p>
-              </w:tc>
-              <w:tc>
-                <w:tcPr>
-                  <w:tcW w:w="1210" w:type="dxa"/>
-                  <w:tcBorders>
-                    <w:top w:val="single" w:sz="8" w:space="0" w:color="A3A3A3"/>
-                    <w:left w:val="single" w:sz="8" w:space="0" w:color="A3A3A3"/>
-                    <w:bottom w:val="single" w:sz="8" w:space="0" w:color="A3A3A3"/>
-                    <w:right w:val="single" w:sz="8" w:space="0" w:color="A3A3A3"/>
-                  </w:tcBorders>
-                  <w:tcMar>
-                    <w:top w:w="40" w:type="dxa"/>
-                    <w:left w:w="60" w:type="dxa"/>
-                    <w:bottom w:w="40" w:type="dxa"/>
-                    <w:right w:w="60" w:type="dxa"/>
-                  </w:tcMar>
-                  <w:hideMark/>
-                </w:tcPr>
-                <w:p>
-                  <w:proofErr w:type="gramStart"/>
-                  <w:r>
-                    <w:rPr>
-                      <w:b/>
-                      <w:bCs/>
-                    </w:rPr>
-                    <w:t>Edge(</w:t>
-                  </w:r>
-                  <w:proofErr w:type="gramEnd"/>
-                  <w:r>
-                    <w:rPr>
-                      <w:b/>
-                      <w:bCs/>
-                    </w:rPr>
-                    <w:t>Published output in Release)</w:t>
-                  </w:r>
-                </w:p>
-              </w:tc>
-              <w:tc>
-                <w:tcPr>
-                  <w:tcW w:w="1104" w:type="dxa"/>
-                  <w:tcBorders>
-                    <w:top w:val="single" w:sz="8" w:space="0" w:color="A3A3A3"/>
-                    <w:left w:val="single" w:sz="8" w:space="0" w:color="A3A3A3"/>
-                    <w:bottom w:val="single" w:sz="8" w:space="0" w:color="A3A3A3"/>
-                    <w:right w:val="single" w:sz="8" w:space="0" w:color="A3A3A3"/>
-                  </w:tcBorders>
-                  <w:tcMar>
-                    <w:top w:w="40" w:type="dxa"/>
-                    <w:left w:w="60" w:type="dxa"/>
-                    <w:bottom w:w="40" w:type="dxa"/>
-                    <w:right w:w="60" w:type="dxa"/>
-                  </w:tcMar>
-                  <w:hideMark/>
-                </w:tcPr>
-                <w:p>
-                  <w:proofErr w:type="gramStart"/>
-                  <w:r>
-                    <w:rPr>
-                      <w:b/>
-                      <w:bCs/>
-                    </w:rPr>
-                    <w:t>Chrome(</w:t>
-                  </w:r>
-                  <w:proofErr w:type="gramEnd"/>
-                  <w:r>
-                    <w:rPr>
-                      <w:b/>
-                      <w:bCs/>
-                    </w:rPr>
-                    <w:t>Published output in Release)</w:t>
+                    <w:t>Chrome(Published output in Release)</w:t>
                   </w:r>
                 </w:p>
               </w:tc>
@@ -1580,7 +1440,7 @@
                 </w:tcPr>
                 <w:p>
                   <w:r>
-                    <w:t>Pass</w:t>
+                    <w:t>Fail</w:t>
                   </w:r>
                 </w:p>
               </w:tc>
@@ -1603,7 +1463,7 @@
                 </w:tcPr>
                 <w:p>
                   <w:r>
-                    <w:t>Pass</w:t>
+                    <w:t>Fail</w:t>
                   </w:r>
                 </w:p>
               </w:tc>
@@ -1626,7 +1486,7 @@
                 </w:tcPr>
                 <w:p>
                   <w:r>
-                    <w:t>Pass</w:t>
+                    <w:t>Fail</w:t>
                   </w:r>
                 </w:p>
               </w:tc>
@@ -1649,7 +1509,7 @@
                 </w:tcPr>
                 <w:p>
                   <w:r>
-                    <w:t>Pass</w:t>
+                    <w:t>Fail</w:t>
                   </w:r>
                 </w:p>
               </w:tc>
@@ -1674,14 +1534,8 @@
                 </w:tcPr>
                 <w:p>
                   <w:r>
-                    <w:lastRenderedPageBreak/>
-                    <w:t xml:space="preserve">Interactive </w:t>
-                  </w:r>
-                  <w:proofErr w:type="spellStart"/>
-                  <w:r>
-                    <w:t>WebAssembly</w:t>
-                  </w:r>
-                  <w:proofErr w:type="spellEnd"/>
+                    <w:t>Interactive WebAssembly</w:t>
+                  </w:r>
                 </w:p>
               </w:tc>
               <w:tc>
@@ -1703,7 +1557,7 @@
                 </w:tcPr>
                 <w:p>
                   <w:r>
-                    <w:t>Pass</w:t>
+                    <w:t>Fail</w:t>
                   </w:r>
                 </w:p>
               </w:tc>
@@ -1726,7 +1580,7 @@
                 </w:tcPr>
                 <w:p>
                   <w:r>
-                    <w:t>Pass</w:t>
+                    <w:t>Fail</w:t>
                   </w:r>
                 </w:p>
               </w:tc>
@@ -1749,7 +1603,7 @@
                 </w:tcPr>
                 <w:p>
                   <w:r>
-                    <w:t>Pass</w:t>
+                    <w:t>Fail</w:t>
                   </w:r>
                 </w:p>
               </w:tc>
@@ -1772,7 +1626,7 @@
                 </w:tcPr>
                 <w:p>
                   <w:r>
-                    <w:t>Pass</w:t>
+                    <w:t>Fail</w:t>
                   </w:r>
                 </w:p>
               </w:tc>
@@ -1797,6 +1651,7 @@
                 </w:tcPr>
                 <w:p>
                   <w:r>
+                    <w:lastRenderedPageBreak/>
                     <w:t>Interactive Auto</w:t>
                   </w:r>
                 </w:p>
@@ -1820,7 +1675,7 @@
                 </w:tcPr>
                 <w:p>
                   <w:r>
-                    <w:t>Pass</w:t>
+                    <w:t>Fail</w:t>
                   </w:r>
                 </w:p>
               </w:tc>
@@ -1843,7 +1698,7 @@
                 </w:tcPr>
                 <w:p>
                   <w:r>
-                    <w:t>Pass</w:t>
+                    <w:t>Fail</w:t>
                   </w:r>
                 </w:p>
               </w:tc>
@@ -1866,7 +1721,7 @@
                 </w:tcPr>
                 <w:p>
                   <w:r>
-                    <w:t>Pass</w:t>
+                    <w:t>Fail</w:t>
                   </w:r>
                 </w:p>
               </w:tc>
@@ -1889,7 +1744,7 @@
                 </w:tcPr>
                 <w:p>
                   <w:r>
-                    <w:t>Pass</w:t>
+                    <w:t>Fail</w:t>
                   </w:r>
                 </w:p>
               </w:tc>
@@ -1921,6 +1776,69 @@
           <w:p>
             <w:r>
               <w:lastRenderedPageBreak/>
+              <w:t xml:space="preserve">The mobile menu remains open after page selection in the Interactive Server, WebAssembly, and Auto samples </w:t>
+            </w:r>
+            <w:r>
+              <w:lastRenderedPageBreak/>
+              <w:t xml:space="preserve">for </w:t>
+            </w:r>
+            <w:r>
+              <w:rPr>
+                <w:b/>
+                <w:bCs/>
+              </w:rPr>
+              <w:t>.NET 11</w:t>
+            </w:r>
+            <w:r>
+              <w:t xml:space="preserve">. This occurs even when CSP is </w:t>
+            </w:r>
+            <w:r>
+              <w:t>not enabled</w:t>
+            </w:r>
+            <w:r>
+              <w:t xml:space="preserve">. Notably, the issue </w:t>
+            </w:r>
+            <w:r>
+              <w:rPr>
+                <w:b/>
+                <w:bCs/>
+              </w:rPr>
+              <w:t>does not occur in Static SSR</w:t>
+            </w:r>
+            <w:r>
+              <w:rPr>
+                <w:b/>
+                <w:bCs/>
+              </w:rPr>
+              <w:t>(.NET 11)</w:t>
+            </w:r>
+            <w:r>
+              <w:t xml:space="preserve"> and </w:t>
+            </w:r>
+            <w:r>
+              <w:rPr>
+                <w:b/>
+                <w:bCs/>
+              </w:rPr>
+              <w:t>cannot be reproduced in .NET 10</w:t>
+            </w:r>
+            <w:r>
+              <w:rPr>
+                <w:b/>
+                <w:bCs/>
+              </w:rPr>
+              <w:t xml:space="preserve"> samples</w:t>
+            </w:r>
+            <w:r>
+              <w:t>.</w:t>
+            </w:r>
+            <w:r>
+              <w:br/>
+            </w:r>
+            <w:r>
+              <w:br/>
+            </w:r>
+            <w:r>
               <w:t>See Evidence Table.</w:t>
             </w:r>
           </w:p>
@@ -1946,6 +1864,7 @@
           </w:tcPr>
           <w:p>
             <w:r>
+              <w:lastRenderedPageBreak/>
               <w:t>The menu still works after moving between pages without a full reload.</w:t>
             </w:r>
           </w:p>
@@ -1985,11 +1904,11 @@
               <w:tblDescription w:val=""/>
             </w:tblPr>
             <w:tblGrid>
-              <w:gridCol w:w="1289"/>
-              <w:gridCol w:w="1153"/>
-              <w:gridCol w:w="1428"/>
-              <w:gridCol w:w="1460"/>
-              <w:gridCol w:w="1735"/>
+              <w:gridCol w:w="1269"/>
+              <w:gridCol w:w="1133"/>
+              <w:gridCol w:w="1403"/>
+              <w:gridCol w:w="1435"/>
+              <w:gridCol w:w="1705"/>
             </w:tblGrid>
             <w:tr>
               <w:tc>
@@ -2037,129 +1956,93 @@
                   <w:hideMark/>
                 </w:tcPr>
                 <w:p>
-                  <w:proofErr w:type="gramStart"/>
                   <w:r>
                     <w:rPr>
                       <w:b/>
                       <w:bCs/>
                     </w:rPr>
-                    <w:t>Edge(</w:t>
-                  </w:r>
-                  <w:proofErr w:type="gramEnd"/>
+                    <w:t>Edge(Debug mode)</w:t>
+                  </w:r>
+                </w:p>
+              </w:tc>
+              <w:tc>
+                <w:tcPr>
+                  <w:tcW w:w="1107" w:type="dxa"/>
+                  <w:tcBorders>
+                    <w:top w:val="single" w:sz="8" w:space="0" w:color="A3A3A3"/>
+                    <w:left w:val="single" w:sz="8" w:space="0" w:color="A3A3A3"/>
+                    <w:bottom w:val="single" w:sz="8" w:space="0" w:color="A3A3A3"/>
+                    <w:right w:val="single" w:sz="8" w:space="0" w:color="A3A3A3"/>
+                  </w:tcBorders>
+                  <w:tcMar>
+                    <w:top w:w="40" w:type="dxa"/>
+                    <w:left w:w="60" w:type="dxa"/>
+                    <w:bottom w:w="40" w:type="dxa"/>
+                    <w:right w:w="60" w:type="dxa"/>
+                  </w:tcMar>
+                  <w:hideMark/>
+                </w:tcPr>
+                <w:p>
                   <w:r>
                     <w:rPr>
                       <w:b/>
                       <w:bCs/>
                     </w:rPr>
-                    <w:t>Debug mode)</w:t>
-                  </w:r>
-                </w:p>
-              </w:tc>
-              <w:tc>
-                <w:tcPr>
-                  <w:tcW w:w="1107" w:type="dxa"/>
-                  <w:tcBorders>
-                    <w:top w:val="single" w:sz="8" w:space="0" w:color="A3A3A3"/>
-                    <w:left w:val="single" w:sz="8" w:space="0" w:color="A3A3A3"/>
-                    <w:bottom w:val="single" w:sz="8" w:space="0" w:color="A3A3A3"/>
-                    <w:right w:val="single" w:sz="8" w:space="0" w:color="A3A3A3"/>
-                  </w:tcBorders>
-                  <w:tcMar>
-                    <w:top w:w="40" w:type="dxa"/>
-                    <w:left w:w="60" w:type="dxa"/>
-                    <w:bottom w:w="40" w:type="dxa"/>
-                    <w:right w:w="60" w:type="dxa"/>
-                  </w:tcMar>
-                  <w:hideMark/>
-                </w:tcPr>
-                <w:p>
-                  <w:proofErr w:type="gramStart"/>
+                    <w:t>Chrome(Debug mode)</w:t>
+                  </w:r>
+                </w:p>
+              </w:tc>
+              <w:tc>
+                <w:tcPr>
+                  <w:tcW w:w="1214" w:type="dxa"/>
+                  <w:tcBorders>
+                    <w:top w:val="single" w:sz="8" w:space="0" w:color="A3A3A3"/>
+                    <w:left w:val="single" w:sz="8" w:space="0" w:color="A3A3A3"/>
+                    <w:bottom w:val="single" w:sz="8" w:space="0" w:color="A3A3A3"/>
+                    <w:right w:val="single" w:sz="8" w:space="0" w:color="A3A3A3"/>
+                  </w:tcBorders>
+                  <w:tcMar>
+                    <w:top w:w="40" w:type="dxa"/>
+                    <w:left w:w="60" w:type="dxa"/>
+                    <w:bottom w:w="40" w:type="dxa"/>
+                    <w:right w:w="60" w:type="dxa"/>
+                  </w:tcMar>
+                  <w:hideMark/>
+                </w:tcPr>
+                <w:p>
                   <w:r>
                     <w:rPr>
                       <w:b/>
                       <w:bCs/>
                     </w:rPr>
-                    <w:t>Chrome(</w:t>
-                  </w:r>
-                  <w:proofErr w:type="gramEnd"/>
+                    <w:t>Edge(Published output in Release)</w:t>
+                  </w:r>
+                </w:p>
+              </w:tc>
+              <w:tc>
+                <w:tcPr>
+                  <w:tcW w:w="1104" w:type="dxa"/>
+                  <w:tcBorders>
+                    <w:top w:val="single" w:sz="8" w:space="0" w:color="A3A3A3"/>
+                    <w:left w:val="single" w:sz="8" w:space="0" w:color="A3A3A3"/>
+                    <w:bottom w:val="single" w:sz="8" w:space="0" w:color="A3A3A3"/>
+                    <w:right w:val="single" w:sz="8" w:space="0" w:color="A3A3A3"/>
+                  </w:tcBorders>
+                  <w:tcMar>
+                    <w:top w:w="40" w:type="dxa"/>
+                    <w:left w:w="60" w:type="dxa"/>
+                    <w:bottom w:w="40" w:type="dxa"/>
+                    <w:right w:w="60" w:type="dxa"/>
+                  </w:tcMar>
+                  <w:hideMark/>
+                </w:tcPr>
+                <w:p>
                   <w:r>
                     <w:rPr>
                       <w:b/>
                       <w:bCs/>
                     </w:rPr>
-                    <w:t>Debug mode)</w:t>
-                  </w:r>
-                </w:p>
-              </w:tc>
-              <w:tc>
-                <w:tcPr>
-                  <w:tcW w:w="1214" w:type="dxa"/>
-                  <w:tcBorders>
-                    <w:top w:val="single" w:sz="8" w:space="0" w:color="A3A3A3"/>
-                    <w:left w:val="single" w:sz="8" w:space="0" w:color="A3A3A3"/>
-                    <w:bottom w:val="single" w:sz="8" w:space="0" w:color="A3A3A3"/>
-                    <w:right w:val="single" w:sz="8" w:space="0" w:color="A3A3A3"/>
-                  </w:tcBorders>
-                  <w:tcMar>
-                    <w:top w:w="40" w:type="dxa"/>
-                    <w:left w:w="60" w:type="dxa"/>
-                    <w:bottom w:w="40" w:type="dxa"/>
-                    <w:right w:w="60" w:type="dxa"/>
-                  </w:tcMar>
-                  <w:hideMark/>
-                </w:tcPr>
-                <w:p>
-                  <w:proofErr w:type="gramStart"/>
-                  <w:r>
-                    <w:rPr>
-                      <w:b/>
-                      <w:bCs/>
-                    </w:rPr>
-                    <w:t>Edge(</w:t>
-                  </w:r>
-                  <w:proofErr w:type="gramEnd"/>
-                  <w:r>
-                    <w:rPr>
-                      <w:b/>
-                      <w:bCs/>
-                    </w:rPr>
-                    <w:t>Published output in Release)</w:t>
-                  </w:r>
-                </w:p>
-              </w:tc>
-              <w:tc>
-                <w:tcPr>
-                  <w:tcW w:w="1104" w:type="dxa"/>
-                  <w:tcBorders>
-                    <w:top w:val="single" w:sz="8" w:space="0" w:color="A3A3A3"/>
-                    <w:left w:val="single" w:sz="8" w:space="0" w:color="A3A3A3"/>
-                    <w:bottom w:val="single" w:sz="8" w:space="0" w:color="A3A3A3"/>
-                    <w:right w:val="single" w:sz="8" w:space="0" w:color="A3A3A3"/>
-                  </w:tcBorders>
-                  <w:tcMar>
-                    <w:top w:w="40" w:type="dxa"/>
-                    <w:left w:w="60" w:type="dxa"/>
-                    <w:bottom w:w="40" w:type="dxa"/>
-                    <w:right w:w="60" w:type="dxa"/>
-                  </w:tcMar>
-                  <w:hideMark/>
-                </w:tcPr>
-                <w:p>
-                  <w:proofErr w:type="gramStart"/>
-                  <w:r>
-                    <w:rPr>
-                      <w:b/>
-                      <w:bCs/>
-                    </w:rPr>
-                    <w:t>Chrome(</w:t>
-                  </w:r>
-                  <w:proofErr w:type="gramEnd"/>
-                  <w:r>
-                    <w:rPr>
-                      <w:b/>
-                      <w:bCs/>
-                    </w:rPr>
-                    <w:t>Published output in Release)</w:t>
+                    <w:t>Chrome(Published output in Release)</w:t>
                   </w:r>
                 </w:p>
               </w:tc>
@@ -2418,13 +2301,8 @@
                 </w:tcPr>
                 <w:p>
                   <w:r>
-                    <w:t xml:space="preserve">Interactive </w:t>
-                  </w:r>
-                  <w:proofErr w:type="spellStart"/>
-                  <w:r>
-                    <w:t>WebAssembly</w:t>
-                  </w:r>
-                  <w:proofErr w:type="spellEnd"/>
+                    <w:t>Interactive WebAssembly</w:t>
+                  </w:r>
                 </w:p>
               </w:tc>
               <w:tc>
@@ -2638,11 +2516,7 @@
               </w:tc>
             </w:tr>
           </w:tbl>
-          <w:p>
-            <w:r>
-              <w:t> </w:t>
-            </w:r>
-          </w:p>
+          <w:p/>
         </w:tc>
         <w:tc>
           <w:tcPr>
@@ -2688,11 +2562,8 @@
           </w:tcPr>
           <w:p>
             <w:r>
-              <w:t xml:space="preserve">Nothing in the template requires a per-app inline script exception to be added </w:t>
-            </w:r>
-            <w:r>
               <w:lastRenderedPageBreak/>
-              <w:t>to the policy.</w:t>
+              <w:t>Nothing in the template requires a per-app inline script exception to be added to the policy.</w:t>
             </w:r>
           </w:p>
         </w:tc>
@@ -2731,11 +2602,11 @@
               <w:tblDescription w:val=""/>
             </w:tblPr>
             <w:tblGrid>
-              <w:gridCol w:w="1289"/>
-              <w:gridCol w:w="1153"/>
-              <w:gridCol w:w="1428"/>
-              <w:gridCol w:w="1460"/>
-              <w:gridCol w:w="1735"/>
+              <w:gridCol w:w="1269"/>
+              <w:gridCol w:w="1133"/>
+              <w:gridCol w:w="1403"/>
+              <w:gridCol w:w="1435"/>
+              <w:gridCol w:w="1705"/>
             </w:tblGrid>
             <w:tr>
               <w:tc>
@@ -2761,7 +2632,6 @@
                       <w:b/>
                       <w:bCs/>
                     </w:rPr>
-                    <w:lastRenderedPageBreak/>
                     <w:t>Blazor Web App</w:t>
                   </w:r>
                 </w:p>
@@ -2784,129 +2654,93 @@
                   <w:hideMark/>
                 </w:tcPr>
                 <w:p>
-                  <w:proofErr w:type="gramStart"/>
                   <w:r>
                     <w:rPr>
                       <w:b/>
                       <w:bCs/>
                     </w:rPr>
-                    <w:t>Edge(</w:t>
-                  </w:r>
-                  <w:proofErr w:type="gramEnd"/>
+                    <w:t>Edge(Debug mode)</w:t>
+                  </w:r>
+                </w:p>
+              </w:tc>
+              <w:tc>
+                <w:tcPr>
+                  <w:tcW w:w="1107" w:type="dxa"/>
+                  <w:tcBorders>
+                    <w:top w:val="single" w:sz="8" w:space="0" w:color="A3A3A3"/>
+                    <w:left w:val="single" w:sz="8" w:space="0" w:color="A3A3A3"/>
+                    <w:bottom w:val="single" w:sz="8" w:space="0" w:color="A3A3A3"/>
+                    <w:right w:val="single" w:sz="8" w:space="0" w:color="A3A3A3"/>
+                  </w:tcBorders>
+                  <w:tcMar>
+                    <w:top w:w="40" w:type="dxa"/>
+                    <w:left w:w="60" w:type="dxa"/>
+                    <w:bottom w:w="40" w:type="dxa"/>
+                    <w:right w:w="60" w:type="dxa"/>
+                  </w:tcMar>
+                  <w:hideMark/>
+                </w:tcPr>
+                <w:p>
                   <w:r>
                     <w:rPr>
                       <w:b/>
                       <w:bCs/>
                     </w:rPr>
-                    <w:t>Debug mode)</w:t>
-                  </w:r>
-                </w:p>
-              </w:tc>
-              <w:tc>
-                <w:tcPr>
-                  <w:tcW w:w="1107" w:type="dxa"/>
-                  <w:tcBorders>
-                    <w:top w:val="single" w:sz="8" w:space="0" w:color="A3A3A3"/>
-                    <w:left w:val="single" w:sz="8" w:space="0" w:color="A3A3A3"/>
-                    <w:bottom w:val="single" w:sz="8" w:space="0" w:color="A3A3A3"/>
-                    <w:right w:val="single" w:sz="8" w:space="0" w:color="A3A3A3"/>
-                  </w:tcBorders>
-                  <w:tcMar>
-                    <w:top w:w="40" w:type="dxa"/>
-                    <w:left w:w="60" w:type="dxa"/>
-                    <w:bottom w:w="40" w:type="dxa"/>
-                    <w:right w:w="60" w:type="dxa"/>
-                  </w:tcMar>
-                  <w:hideMark/>
-                </w:tcPr>
-                <w:p>
-                  <w:proofErr w:type="gramStart"/>
+                    <w:t>Chrome(Debug mode)</w:t>
+                  </w:r>
+                </w:p>
+              </w:tc>
+              <w:tc>
+                <w:tcPr>
+                  <w:tcW w:w="1214" w:type="dxa"/>
+                  <w:tcBorders>
+                    <w:top w:val="single" w:sz="8" w:space="0" w:color="A3A3A3"/>
+                    <w:left w:val="single" w:sz="8" w:space="0" w:color="A3A3A3"/>
+                    <w:bottom w:val="single" w:sz="8" w:space="0" w:color="A3A3A3"/>
+                    <w:right w:val="single" w:sz="8" w:space="0" w:color="A3A3A3"/>
+                  </w:tcBorders>
+                  <w:tcMar>
+                    <w:top w:w="40" w:type="dxa"/>
+                    <w:left w:w="60" w:type="dxa"/>
+                    <w:bottom w:w="40" w:type="dxa"/>
+                    <w:right w:w="60" w:type="dxa"/>
+                  </w:tcMar>
+                  <w:hideMark/>
+                </w:tcPr>
+                <w:p>
                   <w:r>
                     <w:rPr>
                       <w:b/>
                       <w:bCs/>
                     </w:rPr>
-                    <w:t>Chrome(</w:t>
-                  </w:r>
-                  <w:proofErr w:type="gramEnd"/>
+                    <w:t>Edge(Published output in Release)</w:t>
+                  </w:r>
+                </w:p>
+              </w:tc>
+              <w:tc>
+                <w:tcPr>
+                  <w:tcW w:w="1104" w:type="dxa"/>
+                  <w:tcBorders>
+                    <w:top w:val="single" w:sz="8" w:space="0" w:color="A3A3A3"/>
+                    <w:left w:val="single" w:sz="8" w:space="0" w:color="A3A3A3"/>
+                    <w:bottom w:val="single" w:sz="8" w:space="0" w:color="A3A3A3"/>
+                    <w:right w:val="single" w:sz="8" w:space="0" w:color="A3A3A3"/>
+                  </w:tcBorders>
+                  <w:tcMar>
+                    <w:top w:w="40" w:type="dxa"/>
+                    <w:left w:w="60" w:type="dxa"/>
+                    <w:bottom w:w="40" w:type="dxa"/>
+                    <w:right w:w="60" w:type="dxa"/>
+                  </w:tcMar>
+                  <w:hideMark/>
+                </w:tcPr>
+                <w:p>
                   <w:r>
                     <w:rPr>
                       <w:b/>
                       <w:bCs/>
                     </w:rPr>
-                    <w:t>Debug mode)</w:t>
-                  </w:r>
-                </w:p>
-              </w:tc>
-              <w:tc>
-                <w:tcPr>
-                  <w:tcW w:w="1214" w:type="dxa"/>
-                  <w:tcBorders>
-                    <w:top w:val="single" w:sz="8" w:space="0" w:color="A3A3A3"/>
-                    <w:left w:val="single" w:sz="8" w:space="0" w:color="A3A3A3"/>
-                    <w:bottom w:val="single" w:sz="8" w:space="0" w:color="A3A3A3"/>
-                    <w:right w:val="single" w:sz="8" w:space="0" w:color="A3A3A3"/>
-                  </w:tcBorders>
-                  <w:tcMar>
-                    <w:top w:w="40" w:type="dxa"/>
-                    <w:left w:w="60" w:type="dxa"/>
-                    <w:bottom w:w="40" w:type="dxa"/>
-                    <w:right w:w="60" w:type="dxa"/>
-                  </w:tcMar>
-                  <w:hideMark/>
-                </w:tcPr>
-                <w:p>
-                  <w:proofErr w:type="gramStart"/>
-                  <w:r>
-                    <w:rPr>
-                      <w:b/>
-                      <w:bCs/>
-                    </w:rPr>
-                    <w:t>Edge(</w:t>
-                  </w:r>
-                  <w:proofErr w:type="gramEnd"/>
-                  <w:r>
-                    <w:rPr>
-                      <w:b/>
-                      <w:bCs/>
-                    </w:rPr>
-                    <w:t>Published output in Release)</w:t>
-                  </w:r>
-                </w:p>
-              </w:tc>
-              <w:tc>
-                <w:tcPr>
-                  <w:tcW w:w="1104" w:type="dxa"/>
-                  <w:tcBorders>
-                    <w:top w:val="single" w:sz="8" w:space="0" w:color="A3A3A3"/>
-                    <w:left w:val="single" w:sz="8" w:space="0" w:color="A3A3A3"/>
-                    <w:bottom w:val="single" w:sz="8" w:space="0" w:color="A3A3A3"/>
-                    <w:right w:val="single" w:sz="8" w:space="0" w:color="A3A3A3"/>
-                  </w:tcBorders>
-                  <w:tcMar>
-                    <w:top w:w="40" w:type="dxa"/>
-                    <w:left w:w="60" w:type="dxa"/>
-                    <w:bottom w:w="40" w:type="dxa"/>
-                    <w:right w:w="60" w:type="dxa"/>
-                  </w:tcMar>
-                  <w:hideMark/>
-                </w:tcPr>
-                <w:p>
-                  <w:proofErr w:type="gramStart"/>
-                  <w:r>
-                    <w:rPr>
-                      <w:b/>
-                      <w:bCs/>
-                    </w:rPr>
-                    <w:t>Chrome(</w:t>
-                  </w:r>
-                  <w:proofErr w:type="gramEnd"/>
-                  <w:r>
-                    <w:rPr>
-                      <w:b/>
-                      <w:bCs/>
-                    </w:rPr>
-                    <w:t>Published output in Release)</w:t>
+                    <w:t>Chrome(Published output in Release)</w:t>
                   </w:r>
                 </w:p>
               </w:tc>
@@ -3165,13 +2999,8 @@
                 </w:tcPr>
                 <w:p>
                   <w:r>
-                    <w:t xml:space="preserve">Interactive </w:t>
-                  </w:r>
-                  <w:proofErr w:type="spellStart"/>
-                  <w:r>
-                    <w:t>WebAssembly</w:t>
-                  </w:r>
-                  <w:proofErr w:type="spellEnd"/>
+                    <w:t>Interactive WebAssembly</w:t>
+                  </w:r>
                 </w:p>
               </w:tc>
               <w:tc>
@@ -3287,7 +3116,6 @@
                 </w:tcPr>
                 <w:p>
                   <w:r>
-                    <w:lastRenderedPageBreak/>
                     <w:t>Interactive Auto</w:t>
                   </w:r>
                 </w:p>
@@ -3407,16 +3235,7 @@
           </w:tcPr>
           <w:p>
             <w:r>
-              <w:lastRenderedPageBreak/>
-              <w:t>The &lt;</w:t>
-            </w:r>
-            <w:proofErr w:type="spellStart"/>
-            <w:r>
-              <w:t>ImportMap</w:t>
-            </w:r>
-            <w:proofErr w:type="spellEnd"/>
-            <w:r>
-              <w:t xml:space="preserve"> /&gt; component </w:t>
+              <w:t xml:space="preserve">The &lt;ImportMap /&gt; component </w:t>
             </w:r>
             <w:r>
               <w:rPr>
@@ -3426,11 +3245,7 @@
               <w:t>causes an</w:t>
             </w:r>
             <w:r>
-              <w:t xml:space="preserve"> inline script violation, which requires a per-app inline </w:t>
-            </w:r>
-            <w:r>
-              <w:lastRenderedPageBreak/>
-              <w:t>script exception to be added to the policy.</w:t>
+              <w:t xml:space="preserve"> inline script violation, which requires a per-app inline script exception to be added to the policy.</w:t>
             </w:r>
           </w:p>
           <w:p>
@@ -3468,8 +3283,11 @@
           </w:tcPr>
           <w:p>
             <w:r>
+              <w:t xml:space="preserve">Starting in report-only mode to collect violations without breaking the app, then </w:t>
+            </w:r>
+            <w:r>
               <w:lastRenderedPageBreak/>
-              <w:t>Starting in report-only mode to collect violations without breaking the app, then switching to enforcing.</w:t>
+              <w:t>switching to enforcing.</w:t>
             </w:r>
           </w:p>
           <w:p/>
@@ -3492,6 +3310,7 @@
           </w:tcPr>
           <w:p>
             <w:r>
+              <w:lastRenderedPageBreak/>
               <w:t>N/A</w:t>
             </w:r>
           </w:p>
@@ -3514,27 +3333,11 @@
           </w:tcPr>
           <w:p>
             <w:r>
-              <w:t xml:space="preserve">To test a policy over </w:t>
-            </w:r>
-            <w:proofErr w:type="gramStart"/>
-            <w:r>
-              <w:t>a period of time</w:t>
-            </w:r>
-            <w:proofErr w:type="gramEnd"/>
-            <w:r>
-              <w:t xml:space="preserve"> without enforcing its directives, we can set the &lt;meta&gt; tag's http-</w:t>
-            </w:r>
-            <w:proofErr w:type="spellStart"/>
-            <w:r>
-              <w:t>equiv</w:t>
-            </w:r>
-            <w:proofErr w:type="spellEnd"/>
-            <w:r>
-              <w:t xml:space="preserve"> attribute to Content-Security-Policy-Report-Only instead of Content-Security-Policy. </w:t>
+              <w:t xml:space="preserve">To test a policy over a period of time without enforcing its directives, we can set the header name of a header-based policy </w:t>
             </w:r>
             <w:r>
               <w:lastRenderedPageBreak/>
-              <w:t>However, this appears to be unnecessary since we can test directly in enforcement mode to gather the required error details.</w:t>
+              <w:t>to Content-Security-Policy-Report-Only in program.cs. However, this appears to be unnecessary since we can test directly in enforcement mode to gather the required error details.</w:t>
             </w:r>
           </w:p>
         </w:tc>
@@ -3562,7 +3365,6 @@
               <w:t>Resizing the window back and forth across the point where the menu collapses.</w:t>
             </w:r>
           </w:p>
-          <w:p/>
         </w:tc>
         <w:tc>
           <w:tcPr>
@@ -3596,11 +3398,11 @@
               <w:tblLook w:val="04A0" w:firstRow="1" w:lastRow="0" w:firstColumn="1" w:lastColumn="0" w:noHBand="0" w:noVBand="1"/>
             </w:tblPr>
             <w:tblGrid>
-              <w:gridCol w:w="1289"/>
-              <w:gridCol w:w="1153"/>
-              <w:gridCol w:w="1428"/>
-              <w:gridCol w:w="1460"/>
-              <w:gridCol w:w="1735"/>
+              <w:gridCol w:w="1269"/>
+              <w:gridCol w:w="1133"/>
+              <w:gridCol w:w="1403"/>
+              <w:gridCol w:w="1435"/>
+              <w:gridCol w:w="1705"/>
             </w:tblGrid>
             <w:tr>
               <w:tc>
@@ -3648,129 +3450,93 @@
                   <w:hideMark/>
                 </w:tcPr>
                 <w:p>
-                  <w:proofErr w:type="gramStart"/>
                   <w:r>
                     <w:rPr>
                       <w:b/>
                       <w:bCs/>
                     </w:rPr>
-                    <w:t>Edge(</w:t>
-                  </w:r>
-                  <w:proofErr w:type="gramEnd"/>
+                    <w:t>Edge(Debug mode)</w:t>
+                  </w:r>
+                </w:p>
+              </w:tc>
+              <w:tc>
+                <w:tcPr>
+                  <w:tcW w:w="1107" w:type="dxa"/>
+                  <w:tcBorders>
+                    <w:top w:val="single" w:sz="8" w:space="0" w:color="A3A3A3"/>
+                    <w:left w:val="single" w:sz="8" w:space="0" w:color="A3A3A3"/>
+                    <w:bottom w:val="single" w:sz="8" w:space="0" w:color="A3A3A3"/>
+                    <w:right w:val="single" w:sz="8" w:space="0" w:color="A3A3A3"/>
+                  </w:tcBorders>
+                  <w:tcMar>
+                    <w:top w:w="40" w:type="dxa"/>
+                    <w:left w:w="60" w:type="dxa"/>
+                    <w:bottom w:w="40" w:type="dxa"/>
+                    <w:right w:w="60" w:type="dxa"/>
+                  </w:tcMar>
+                  <w:hideMark/>
+                </w:tcPr>
+                <w:p>
                   <w:r>
                     <w:rPr>
                       <w:b/>
                       <w:bCs/>
                     </w:rPr>
-                    <w:t>Debug mode)</w:t>
-                  </w:r>
-                </w:p>
-              </w:tc>
-              <w:tc>
-                <w:tcPr>
-                  <w:tcW w:w="1107" w:type="dxa"/>
-                  <w:tcBorders>
-                    <w:top w:val="single" w:sz="8" w:space="0" w:color="A3A3A3"/>
-                    <w:left w:val="single" w:sz="8" w:space="0" w:color="A3A3A3"/>
-                    <w:bottom w:val="single" w:sz="8" w:space="0" w:color="A3A3A3"/>
-                    <w:right w:val="single" w:sz="8" w:space="0" w:color="A3A3A3"/>
-                  </w:tcBorders>
-                  <w:tcMar>
-                    <w:top w:w="40" w:type="dxa"/>
-                    <w:left w:w="60" w:type="dxa"/>
-                    <w:bottom w:w="40" w:type="dxa"/>
-                    <w:right w:w="60" w:type="dxa"/>
-                  </w:tcMar>
-                  <w:hideMark/>
-                </w:tcPr>
-                <w:p>
-                  <w:proofErr w:type="gramStart"/>
+                    <w:t>Chrome(Debug mode)</w:t>
+                  </w:r>
+                </w:p>
+              </w:tc>
+              <w:tc>
+                <w:tcPr>
+                  <w:tcW w:w="1214" w:type="dxa"/>
+                  <w:tcBorders>
+                    <w:top w:val="single" w:sz="8" w:space="0" w:color="A3A3A3"/>
+                    <w:left w:val="single" w:sz="8" w:space="0" w:color="A3A3A3"/>
+                    <w:bottom w:val="single" w:sz="8" w:space="0" w:color="A3A3A3"/>
+                    <w:right w:val="single" w:sz="8" w:space="0" w:color="A3A3A3"/>
+                  </w:tcBorders>
+                  <w:tcMar>
+                    <w:top w:w="40" w:type="dxa"/>
+                    <w:left w:w="60" w:type="dxa"/>
+                    <w:bottom w:w="40" w:type="dxa"/>
+                    <w:right w:w="60" w:type="dxa"/>
+                  </w:tcMar>
+                  <w:hideMark/>
+                </w:tcPr>
+                <w:p>
                   <w:r>
                     <w:rPr>
                       <w:b/>
                       <w:bCs/>
                     </w:rPr>
-                    <w:t>Chrome(</w:t>
-                  </w:r>
-                  <w:proofErr w:type="gramEnd"/>
+                    <w:t>Edge(Published output in Release)</w:t>
+                  </w:r>
+                </w:p>
+              </w:tc>
+              <w:tc>
+                <w:tcPr>
+                  <w:tcW w:w="1104" w:type="dxa"/>
+                  <w:tcBorders>
+                    <w:top w:val="single" w:sz="8" w:space="0" w:color="A3A3A3"/>
+                    <w:left w:val="single" w:sz="8" w:space="0" w:color="A3A3A3"/>
+                    <w:bottom w:val="single" w:sz="8" w:space="0" w:color="A3A3A3"/>
+                    <w:right w:val="single" w:sz="8" w:space="0" w:color="A3A3A3"/>
+                  </w:tcBorders>
+                  <w:tcMar>
+                    <w:top w:w="40" w:type="dxa"/>
+                    <w:left w:w="60" w:type="dxa"/>
+                    <w:bottom w:w="40" w:type="dxa"/>
+                    <w:right w:w="60" w:type="dxa"/>
+                  </w:tcMar>
+                  <w:hideMark/>
+                </w:tcPr>
+                <w:p>
                   <w:r>
                     <w:rPr>
                       <w:b/>
                       <w:bCs/>
                     </w:rPr>
-                    <w:t>Debug mode)</w:t>
-                  </w:r>
-                </w:p>
-              </w:tc>
-              <w:tc>
-                <w:tcPr>
-                  <w:tcW w:w="1214" w:type="dxa"/>
-                  <w:tcBorders>
-                    <w:top w:val="single" w:sz="8" w:space="0" w:color="A3A3A3"/>
-                    <w:left w:val="single" w:sz="8" w:space="0" w:color="A3A3A3"/>
-                    <w:bottom w:val="single" w:sz="8" w:space="0" w:color="A3A3A3"/>
-                    <w:right w:val="single" w:sz="8" w:space="0" w:color="A3A3A3"/>
-                  </w:tcBorders>
-                  <w:tcMar>
-                    <w:top w:w="40" w:type="dxa"/>
-                    <w:left w:w="60" w:type="dxa"/>
-                    <w:bottom w:w="40" w:type="dxa"/>
-                    <w:right w:w="60" w:type="dxa"/>
-                  </w:tcMar>
-                  <w:hideMark/>
-                </w:tcPr>
-                <w:p>
-                  <w:proofErr w:type="gramStart"/>
-                  <w:r>
-                    <w:rPr>
-                      <w:b/>
-                      <w:bCs/>
-                    </w:rPr>
-                    <w:t>Edge(</w:t>
-                  </w:r>
-                  <w:proofErr w:type="gramEnd"/>
-                  <w:r>
-                    <w:rPr>
-                      <w:b/>
-                      <w:bCs/>
-                    </w:rPr>
-                    <w:t>Published output in Release)</w:t>
-                  </w:r>
-                </w:p>
-              </w:tc>
-              <w:tc>
-                <w:tcPr>
-                  <w:tcW w:w="1104" w:type="dxa"/>
-                  <w:tcBorders>
-                    <w:top w:val="single" w:sz="8" w:space="0" w:color="A3A3A3"/>
-                    <w:left w:val="single" w:sz="8" w:space="0" w:color="A3A3A3"/>
-                    <w:bottom w:val="single" w:sz="8" w:space="0" w:color="A3A3A3"/>
-                    <w:right w:val="single" w:sz="8" w:space="0" w:color="A3A3A3"/>
-                  </w:tcBorders>
-                  <w:tcMar>
-                    <w:top w:w="40" w:type="dxa"/>
-                    <w:left w:w="60" w:type="dxa"/>
-                    <w:bottom w:w="40" w:type="dxa"/>
-                    <w:right w:w="60" w:type="dxa"/>
-                  </w:tcMar>
-                  <w:hideMark/>
-                </w:tcPr>
-                <w:p>
-                  <w:proofErr w:type="gramStart"/>
-                  <w:r>
-                    <w:rPr>
-                      <w:b/>
-                      <w:bCs/>
-                    </w:rPr>
-                    <w:t>Chrome(</w:t>
-                  </w:r>
-                  <w:proofErr w:type="gramEnd"/>
-                  <w:r>
-                    <w:rPr>
-                      <w:b/>
-                      <w:bCs/>
-                    </w:rPr>
-                    <w:t>Published output in Release)</w:t>
+                    <w:t>Chrome(Published output in Release)</w:t>
                   </w:r>
                 </w:p>
               </w:tc>
@@ -4029,13 +3795,8 @@
                 </w:tcPr>
                 <w:p>
                   <w:r>
-                    <w:t xml:space="preserve">Interactive </w:t>
-                  </w:r>
-                  <w:proofErr w:type="spellStart"/>
-                  <w:r>
-                    <w:t>WebAssembly</w:t>
-                  </w:r>
-                  <w:proofErr w:type="spellEnd"/>
+                    <w:t>Interactive WebAssembly</w:t>
+                  </w:r>
                 </w:p>
               </w:tc>
               <w:tc>
@@ -4293,11 +4054,8 @@
           </w:tcPr>
           <w:p>
             <w:r>
-              <w:t xml:space="preserve">Opening the menu, then </w:t>
-            </w:r>
-            <w:r>
               <w:lastRenderedPageBreak/>
-              <w:t>tapping outside it</w:t>
+              <w:t>Opening the menu, then tapping outside it</w:t>
             </w:r>
           </w:p>
         </w:tc>
@@ -4319,7 +4077,6 @@
           </w:tcPr>
           <w:p>
             <w:r>
-              <w:lastRenderedPageBreak/>
               <w:t>N/A</w:t>
             </w:r>
           </w:p>
@@ -4342,11 +4099,7 @@
           </w:tcPr>
           <w:p>
             <w:r>
-              <w:t xml:space="preserve">This is not a valid test case. Tapping </w:t>
-            </w:r>
-            <w:r>
-              <w:lastRenderedPageBreak/>
-              <w:t>outside does not close the navigation menu</w:t>
+              <w:t>This is not a valid test case. Tapping outside does not close the navigation menu</w:t>
             </w:r>
             <w:r>
               <w:t>;</w:t>
@@ -4366,7 +4119,6 @@
     </w:tbl>
     <w:p>
       <w:r>
-        <w:lastRenderedPageBreak/>
         <w:t> </w:t>
       </w:r>
     </w:p>
@@ -4454,21 +4206,12 @@
             <w:hideMark/>
           </w:tcPr>
           <w:p>
-            <w:proofErr w:type="gramStart"/>
             <w:r>
               <w:rPr>
                 <w:b/>
                 <w:bCs/>
               </w:rPr>
-              <w:t>Edge(</w:t>
-            </w:r>
-            <w:proofErr w:type="gramEnd"/>
-            <w:r>
-              <w:rPr>
-                <w:b/>
-                <w:bCs/>
-              </w:rPr>
-              <w:t>Debug Mode Videos)</w:t>
+              <w:t>Edge(Debug Mode Videos)</w:t>
             </w:r>
           </w:p>
         </w:tc>
@@ -4490,21 +4233,12 @@
             <w:hideMark/>
           </w:tcPr>
           <w:p>
-            <w:proofErr w:type="gramStart"/>
             <w:r>
               <w:rPr>
                 <w:b/>
                 <w:bCs/>
               </w:rPr>
-              <w:t>Chrome(</w:t>
-            </w:r>
-            <w:proofErr w:type="gramEnd"/>
-            <w:r>
-              <w:rPr>
-                <w:b/>
-                <w:bCs/>
-              </w:rPr>
-              <w:t>Debug Mode Videos)</w:t>
+              <w:t>Chrome(Debug Mode Videos)</w:t>
             </w:r>
           </w:p>
         </w:tc>
@@ -4526,21 +4260,12 @@
             <w:hideMark/>
           </w:tcPr>
           <w:p>
-            <w:proofErr w:type="gramStart"/>
             <w:r>
               <w:rPr>
                 <w:b/>
                 <w:bCs/>
               </w:rPr>
-              <w:t>Edge(</w:t>
-            </w:r>
-            <w:proofErr w:type="gramEnd"/>
-            <w:r>
-              <w:rPr>
-                <w:b/>
-                <w:bCs/>
-              </w:rPr>
-              <w:t>Published Output Videos)</w:t>
+              <w:t>Edge(Published Output Videos)</w:t>
             </w:r>
           </w:p>
         </w:tc>
@@ -4562,21 +4287,12 @@
             <w:hideMark/>
           </w:tcPr>
           <w:p>
-            <w:proofErr w:type="gramStart"/>
             <w:r>
               <w:rPr>
                 <w:b/>
                 <w:bCs/>
               </w:rPr>
-              <w:t>Chrome(</w:t>
-            </w:r>
-            <w:proofErr w:type="gramEnd"/>
-            <w:r>
-              <w:rPr>
-                <w:b/>
-                <w:bCs/>
-              </w:rPr>
-              <w:t>Published Output Videos)</w:t>
+              <w:t>Chrome(Published Output Videos)</w:t>
             </w:r>
           </w:p>
         </w:tc>
@@ -4628,7 +4344,14 @@
                 <w:rPr>
                   <w:rStyle w:val="Hyperlink"/>
                 </w:rPr>
-                <w:t>Evidence\DebugModeVideos\DebugModeVideos\StaticSSR_Edge_WithCspScriptSrcSelf.mp4</w:t>
+                <w:t>Evidence\DebugModeVideos\DebugModeVideos\StaticSSR_Edge_WithCs</w:t>
+              </w:r>
+              <w:r>
+                <w:rPr>
+                  <w:rStyle w:val="Hyperlink"/>
+                </w:rPr>
+                <w:lastRenderedPageBreak/>
+                <w:t>pScriptSrcSelf.mp4</w:t>
               </w:r>
             </w:hyperlink>
           </w:p>
@@ -4712,7 +4435,14 @@
                 <w:rPr>
                   <w:rStyle w:val="Hyperlink"/>
                 </w:rPr>
-                <w:t>Evidence\PublishedOutputVideos.zip\PublishedOutputVideos\StaticSSR_Chrome_WithCspScriptSrcSelf.mp4</w:t>
+                <w:t>Evidence\PublishedOutputVideos.zip\PublishedOutputVideos\StaticSSR_Chrome_Wit</w:t>
+              </w:r>
+              <w:r>
+                <w:rPr>
+                  <w:rStyle w:val="Hyperlink"/>
+                </w:rPr>
+                <w:lastRenderedPageBreak/>
+                <w:t>hCspScriptSrcSelf.mp4</w:t>
               </w:r>
             </w:hyperlink>
           </w:p>
@@ -4738,11 +4468,8 @@
           </w:tcPr>
           <w:p>
             <w:r>
-              <w:t>Inter</w:t>
-            </w:r>
-            <w:r>
               <w:lastRenderedPageBreak/>
-              <w:t>active Server</w:t>
+              <w:t>Interactive Server</w:t>
             </w:r>
           </w:p>
         </w:tc>
@@ -4769,14 +4496,7 @@
                 <w:rPr>
                   <w:rStyle w:val="Hyperlink"/>
                 </w:rPr>
-                <w:t>Evidence\DebugModeVideos\Debug</w:t>
-              </w:r>
-              <w:r>
-                <w:rPr>
-                  <w:rStyle w:val="Hyperlink"/>
-                </w:rPr>
-                <w:lastRenderedPageBreak/>
-                <w:t>ModeVideos\InteractiveServer_Edge_WithCspScriptSrcSelf.mp4</w:t>
+                <w:t>Evidence\DebugModeVideos\DebugModeVideos\InteractiveServer_Edge_WithCspScriptSrcSelf.mp4</w:t>
               </w:r>
             </w:hyperlink>
           </w:p>
@@ -4804,14 +4524,7 @@
                 <w:rPr>
                   <w:rStyle w:val="Hyperlink"/>
                 </w:rPr>
-                <w:t>Evidence\DebugModeVideos\DebugMo</w:t>
-              </w:r>
-              <w:r>
-                <w:rPr>
-                  <w:rStyle w:val="Hyperlink"/>
-                </w:rPr>
-                <w:lastRenderedPageBreak/>
-                <w:t>deVideos\InteractiveServer_Chrome_WithCspScriptSrcSelf.mp4</w:t>
+                <w:t>Evidence\DebugModeVideos\DebugModeVideos\InteractiveServer_Chrome_WithCspScriptSrcSelf.mp4</w:t>
               </w:r>
             </w:hyperlink>
           </w:p>
@@ -4839,14 +4552,7 @@
                 <w:rPr>
                   <w:rStyle w:val="Hyperlink"/>
                 </w:rPr>
-                <w:t>Evidence\PublishedOutputVideos\Publis</w:t>
-              </w:r>
-              <w:r>
-                <w:rPr>
-                  <w:rStyle w:val="Hyperlink"/>
-                </w:rPr>
-                <w:lastRenderedPageBreak/>
-                <w:t>hedOutputVideos\InteractiveServer_Edge_WithCspScriptSrcSelf.mp4</w:t>
+                <w:t>Evidence\PublishedOutputVideos\PublishedOutputVideos\InteractiveServer_Edge_WithCspScriptSrcSelf.mp4</w:t>
               </w:r>
             </w:hyperlink>
           </w:p>
@@ -4874,14 +4580,7 @@
                 <w:rPr>
                   <w:rStyle w:val="Hyperlink"/>
                 </w:rPr>
-                <w:t>Evidence\PublishedOutputVideos\Publishe</w:t>
-              </w:r>
-              <w:r>
-                <w:rPr>
-                  <w:rStyle w:val="Hyperlink"/>
-                </w:rPr>
-                <w:lastRenderedPageBreak/>
-                <w:t>dOutputVideos\InteractiveServer_Chrome_WithCspScriptSrcSelf.mp4</w:t>
+                <w:t>Evidence\PublishedOutputVideos\PublishedOutputVideos\InteractiveServer_Chrome_WithCspScriptSrcSelf.mp4</w:t>
               </w:r>
             </w:hyperlink>
           </w:p>
@@ -4907,14 +4606,8 @@
           </w:tcPr>
           <w:p>
             <w:r>
-              <w:lastRenderedPageBreak/>
-              <w:t xml:space="preserve">Interactive </w:t>
+              <w:t>Interactive WebAssembly</w:t>
             </w:r>
-            <w:proofErr w:type="spellStart"/>
-            <w:r>
-              <w:t>WebAssembly</w:t>
-            </w:r>
-            <w:proofErr w:type="spellEnd"/>
           </w:p>
         </w:tc>
         <w:tc>
@@ -5279,6 +4972,7 @@
           </w:tcPr>
           <w:p>
             <w:r>
+              <w:lastRenderedPageBreak/>
               <w:t>Static SSR</w:t>
             </w:r>
           </w:p>
@@ -5306,44 +5000,8 @@
                 <w:rPr>
                   <w:rStyle w:val="Hyperlink"/>
                 </w:rPr>
-                <w:t>Evidence\</w:t>
+                <w:t>Evidence\PublishedBinaries\PublishedBinaries\StaticSSR</w:t>
               </w:r>
-              <w:proofErr w:type="spellStart"/>
-              <w:r>
-                <w:rPr>
-                  <w:rStyle w:val="Hyperlink"/>
-                </w:rPr>
-                <w:t>PublishedBinaries</w:t>
-              </w:r>
-              <w:proofErr w:type="spellEnd"/>
-              <w:r>
-                <w:rPr>
-                  <w:rStyle w:val="Hyperlink"/>
-                </w:rPr>
-                <w:t>\</w:t>
-              </w:r>
-              <w:proofErr w:type="spellStart"/>
-              <w:r>
-                <w:rPr>
-                  <w:rStyle w:val="Hyperlink"/>
-                </w:rPr>
-                <w:t>PublishedBinaries</w:t>
-              </w:r>
-              <w:proofErr w:type="spellEnd"/>
-              <w:r>
-                <w:rPr>
-                  <w:rStyle w:val="Hyperlink"/>
-                </w:rPr>
-                <w:t>\</w:t>
-              </w:r>
-              <w:proofErr w:type="spellStart"/>
-              <w:r>
-                <w:rPr>
-                  <w:rStyle w:val="Hyperlink"/>
-                </w:rPr>
-                <w:t>StaticSSR</w:t>
-              </w:r>
-              <w:proofErr w:type="spellEnd"/>
             </w:hyperlink>
           </w:p>
         </w:tc>
@@ -5395,44 +5053,8 @@
                 <w:rPr>
                   <w:rStyle w:val="Hyperlink"/>
                 </w:rPr>
-                <w:t>Evidence\</w:t>
+                <w:t>Evidence\PublishedBinaries\PublishedBinaries\InteractiveServer</w:t>
               </w:r>
-              <w:proofErr w:type="spellStart"/>
-              <w:r>
-                <w:rPr>
-                  <w:rStyle w:val="Hyperlink"/>
-                </w:rPr>
-                <w:t>PublishedBinaries</w:t>
-              </w:r>
-              <w:proofErr w:type="spellEnd"/>
-              <w:r>
-                <w:rPr>
-                  <w:rStyle w:val="Hyperlink"/>
-                </w:rPr>
-                <w:t>\</w:t>
-              </w:r>
-              <w:proofErr w:type="spellStart"/>
-              <w:r>
-                <w:rPr>
-                  <w:rStyle w:val="Hyperlink"/>
-                </w:rPr>
-                <w:t>PublishedBinaries</w:t>
-              </w:r>
-              <w:proofErr w:type="spellEnd"/>
-              <w:r>
-                <w:rPr>
-                  <w:rStyle w:val="Hyperlink"/>
-                </w:rPr>
-                <w:t>\</w:t>
-              </w:r>
-              <w:proofErr w:type="spellStart"/>
-              <w:r>
-                <w:rPr>
-                  <w:rStyle w:val="Hyperlink"/>
-                </w:rPr>
-                <w:t>InteractiveServer</w:t>
-              </w:r>
-              <w:proofErr w:type="spellEnd"/>
             </w:hyperlink>
           </w:p>
         </w:tc>
@@ -5457,14 +5079,8 @@
           </w:tcPr>
           <w:p>
             <w:r>
-              <w:lastRenderedPageBreak/>
-              <w:t xml:space="preserve">Interactive </w:t>
+              <w:t>Interactive WebAssembly</w:t>
             </w:r>
-            <w:proofErr w:type="spellStart"/>
-            <w:r>
-              <w:t>WebAssembly</w:t>
-            </w:r>
-            <w:proofErr w:type="spellEnd"/>
           </w:p>
         </w:tc>
         <w:tc>
@@ -5490,44 +5106,8 @@
                 <w:rPr>
                   <w:rStyle w:val="Hyperlink"/>
                 </w:rPr>
-                <w:t>Evidence\</w:t>
+                <w:t>Evidence\PublishedBinaries\PublishedBinaries\InteractiveWasm</w:t>
               </w:r>
-              <w:proofErr w:type="spellStart"/>
-              <w:r>
-                <w:rPr>
-                  <w:rStyle w:val="Hyperlink"/>
-                </w:rPr>
-                <w:t>PublishedBinaries</w:t>
-              </w:r>
-              <w:proofErr w:type="spellEnd"/>
-              <w:r>
-                <w:rPr>
-                  <w:rStyle w:val="Hyperlink"/>
-                </w:rPr>
-                <w:t>\</w:t>
-              </w:r>
-              <w:proofErr w:type="spellStart"/>
-              <w:r>
-                <w:rPr>
-                  <w:rStyle w:val="Hyperlink"/>
-                </w:rPr>
-                <w:t>PublishedBinaries</w:t>
-              </w:r>
-              <w:proofErr w:type="spellEnd"/>
-              <w:r>
-                <w:rPr>
-                  <w:rStyle w:val="Hyperlink"/>
-                </w:rPr>
-                <w:t>\</w:t>
-              </w:r>
-              <w:proofErr w:type="spellStart"/>
-              <w:r>
-                <w:rPr>
-                  <w:rStyle w:val="Hyperlink"/>
-                </w:rPr>
-                <w:t>InteractiveWasm</w:t>
-              </w:r>
-              <w:proofErr w:type="spellEnd"/>
             </w:hyperlink>
           </w:p>
         </w:tc>
@@ -5579,44 +5159,8 @@
                 <w:rPr>
                   <w:rStyle w:val="Hyperlink"/>
                 </w:rPr>
-                <w:t>Evidence\</w:t>
+                <w:t>Evidence\PublishedBinaries\PublishedBinaries\InteractiveAuto</w:t>
               </w:r>
-              <w:proofErr w:type="spellStart"/>
-              <w:r>
-                <w:rPr>
-                  <w:rStyle w:val="Hyperlink"/>
-                </w:rPr>
-                <w:t>PublishedBinaries</w:t>
-              </w:r>
-              <w:proofErr w:type="spellEnd"/>
-              <w:r>
-                <w:rPr>
-                  <w:rStyle w:val="Hyperlink"/>
-                </w:rPr>
-                <w:t>\</w:t>
-              </w:r>
-              <w:proofErr w:type="spellStart"/>
-              <w:r>
-                <w:rPr>
-                  <w:rStyle w:val="Hyperlink"/>
-                </w:rPr>
-                <w:t>PublishedBinaries</w:t>
-              </w:r>
-              <w:proofErr w:type="spellEnd"/>
-              <w:r>
-                <w:rPr>
-                  <w:rStyle w:val="Hyperlink"/>
-                </w:rPr>
-                <w:t>\</w:t>
-              </w:r>
-              <w:proofErr w:type="spellStart"/>
-              <w:r>
-                <w:rPr>
-                  <w:rStyle w:val="Hyperlink"/>
-                </w:rPr>
-                <w:t>InteractiveAuto</w:t>
-              </w:r>
-              <w:proofErr w:type="spellEnd"/>
             </w:hyperlink>
           </w:p>
         </w:tc>
@@ -5653,6 +5197,13 @@
           <w:b/>
           <w:bCs/>
         </w:rPr>
+        <w:t>1.</w:t>
+      </w:r>
+      <w:r>
+        <w:rPr>
+          <w:b/>
+          <w:bCs/>
+        </w:rPr>
         <w:t>Inline script CSP violation</w:t>
       </w:r>
     </w:p>
@@ -5667,31 +5218,7 @@
     </w:p>
     <w:p>
       <w:r>
-        <w:t>The inline script CSP violation appears to originate from the inline script generated by the &lt;</w:t>
-      </w:r>
-      <w:proofErr w:type="spellStart"/>
-      <w:r>
-        <w:t>ImportMap</w:t>
-      </w:r>
-      <w:proofErr w:type="spellEnd"/>
-      <w:r>
-        <w:t xml:space="preserve"> /&gt; component. While .NET 11 addresses inline event handler violations, the inline script emitted by &lt;</w:t>
-      </w:r>
-      <w:proofErr w:type="spellStart"/>
-      <w:r>
-        <w:t>ImportMap</w:t>
-      </w:r>
-      <w:proofErr w:type="spellEnd"/>
-      <w:r>
-        <w:t xml:space="preserve"> /&gt; still requires an exception and therefore continues to violate a strict script-</w:t>
-      </w:r>
-      <w:proofErr w:type="spellStart"/>
-      <w:r>
-        <w:t>src</w:t>
-      </w:r>
-      <w:proofErr w:type="spellEnd"/>
-      <w:r>
-        <w:t xml:space="preserve"> policy.</w:t>
+        <w:t>The inline script CSP violation appears to originate from the inline script generated by the &lt;ImportMap /&gt; component. While .NET 11 addresses inline event handler violations, the inline script emitted by &lt;ImportMap /&gt; still requires an exception and therefore continues to violate a strict script-src policy.</w:t>
       </w:r>
     </w:p>
     <w:p>
@@ -5781,15 +5308,7 @@
           </w:tcPr>
           <w:p>
             <w:r>
-              <w:t>script-</w:t>
-            </w:r>
-            <w:proofErr w:type="spellStart"/>
-            <w:r>
-              <w:t>src</w:t>
-            </w:r>
-            <w:proofErr w:type="spellEnd"/>
-            <w:r>
-              <w:t xml:space="preserve"> 'self'</w:t>
+              <w:t>script-src 'self'</w:t>
             </w:r>
           </w:p>
         </w:tc>
@@ -5807,17 +5326,8 @@
           <w:b/>
           <w:bCs/>
         </w:rPr>
-        <w:t xml:space="preserve">Interactive </w:t>
-      </w:r>
-      <w:proofErr w:type="spellStart"/>
-      <w:r>
-        <w:rPr>
-          <w:b/>
-          <w:bCs/>
-        </w:rPr>
-        <w:t>WebAssembly</w:t>
-      </w:r>
-      <w:proofErr w:type="spellEnd"/>
+        <w:t>Interactive WebAssembly</w:t>
+      </w:r>
       <w:r>
         <w:t xml:space="preserve"> and </w:t>
       </w:r>
@@ -5872,23 +5382,7 @@
           </w:tcPr>
           <w:p>
             <w:r>
-              <w:t>script-</w:t>
-            </w:r>
-            <w:proofErr w:type="spellStart"/>
-            <w:r>
-              <w:t>src</w:t>
-            </w:r>
-            <w:proofErr w:type="spellEnd"/>
-            <w:r>
-              <w:t xml:space="preserve"> 'self' '</w:t>
-            </w:r>
-            <w:proofErr w:type="spellStart"/>
-            <w:r>
-              <w:t>wasm</w:t>
-            </w:r>
-            <w:proofErr w:type="spellEnd"/>
-            <w:r>
-              <w:t>-unsafe-eval'</w:t>
+              <w:t>script-src 'self' 'wasm-unsafe-eval'</w:t>
             </w:r>
           </w:p>
         </w:tc>
@@ -5939,15 +5433,7 @@
           </w:tcPr>
           <w:p>
             <w:r>
-              <w:t>Executing inline script violates the following Content Security Policy directive: "script-</w:t>
-            </w:r>
-            <w:proofErr w:type="spellStart"/>
-            <w:r>
-              <w:t>src</w:t>
-            </w:r>
-            <w:proofErr w:type="spellEnd"/>
-            <w:r>
-              <w:t xml:space="preserve"> 'self'".</w:t>
+              <w:t>Executing inline script violates the following Content Security Policy directive: "script-src 'self'".</w:t>
             </w:r>
           </w:p>
         </w:tc>
@@ -5964,6 +5450,7 @@
           <w:b/>
           <w:bCs/>
         </w:rPr>
+        <w:lastRenderedPageBreak/>
         <w:t xml:space="preserve">What you expected instead: </w:t>
       </w:r>
     </w:p>
@@ -5974,7 +5461,6 @@
     </w:p>
     <w:p>
       <w:r>
-        <w:lastRenderedPageBreak/>
         <w:t>After applying a strict CSP policy without allowing inline scripts, the application should run without any CSP violations, and the browser console should not report any blocked inline script execution.</w:t>
       </w:r>
     </w:p>
@@ -6127,15 +5613,7 @@
         </w:numPr>
       </w:pPr>
       <w:r>
-        <w:t xml:space="preserve">Add the following CSP policy in </w:t>
-      </w:r>
-      <w:proofErr w:type="spellStart"/>
-      <w:r>
-        <w:t>App.razor</w:t>
-      </w:r>
-      <w:proofErr w:type="spellEnd"/>
-      <w:r>
-        <w:t>:</w:t>
+        <w:t>Add the following CSP policy in App.razor:</w:t>
       </w:r>
     </w:p>
     <w:tbl>
@@ -6183,15 +5661,7 @@
           </w:p>
           <w:p>
             <w:r>
-              <w:t xml:space="preserve">    &lt;meta http-</w:t>
-            </w:r>
-            <w:proofErr w:type="spellStart"/>
-            <w:r>
-              <w:t>equiv</w:t>
-            </w:r>
-            <w:proofErr w:type="spellEnd"/>
-            <w:r>
-              <w:t>="Content-Security-Policy"</w:t>
+              <w:t xml:space="preserve">    &lt;meta http-equiv="Content-Security-Policy"</w:t>
             </w:r>
           </w:p>
           <w:p>
@@ -6201,88 +5671,27 @@
           </w:p>
           <w:p>
             <w:r>
-              <w:t xml:space="preserve">    default-</w:t>
-            </w:r>
-            <w:proofErr w:type="spellStart"/>
-            <w:r>
-              <w:t>src</w:t>
-            </w:r>
-            <w:proofErr w:type="spellEnd"/>
-            <w:r>
-              <w:t xml:space="preserve"> 'self';</w:t>
+              <w:t xml:space="preserve">    default-src 'self';</w:t>
             </w:r>
           </w:p>
           <w:p>
             <w:r>
-              <w:t xml:space="preserve">    script-</w:t>
-            </w:r>
-            <w:proofErr w:type="spellStart"/>
-            <w:r>
-              <w:t>src</w:t>
-            </w:r>
-            <w:proofErr w:type="spellEnd"/>
-            <w:r>
-              <w:t xml:space="preserve"> 'self';</w:t>
+              <w:t xml:space="preserve">    script-src 'self';</w:t>
             </w:r>
           </w:p>
           <w:p>
             <w:r>
-              <w:t xml:space="preserve">    style-</w:t>
-            </w:r>
-            <w:proofErr w:type="spellStart"/>
-            <w:r>
-              <w:t>src</w:t>
-            </w:r>
-            <w:proofErr w:type="spellEnd"/>
-            <w:r>
-              <w:t xml:space="preserve"> 'self';</w:t>
+              <w:t xml:space="preserve">    style-src 'self';</w:t>
             </w:r>
           </w:p>
           <w:p>
             <w:r>
-              <w:t xml:space="preserve">    </w:t>
+              <w:t xml:space="preserve">    img-src 'self' data:;</w:t>
             </w:r>
-            <w:proofErr w:type="spellStart"/>
-            <w:r>
-              <w:t>img-src</w:t>
-            </w:r>
-            <w:proofErr w:type="spellEnd"/>
-            <w:r>
-              <w:t xml:space="preserve"> 'self' </w:t>
-            </w:r>
-            <w:proofErr w:type="gramStart"/>
-            <w:r>
-              <w:t>data:;</w:t>
-            </w:r>
-            <w:proofErr w:type="gramEnd"/>
           </w:p>
           <w:p>
             <w:r>
-              <w:t xml:space="preserve">    connect-</w:t>
-            </w:r>
-            <w:proofErr w:type="spellStart"/>
-            <w:r>
-              <w:t>src</w:t>
-            </w:r>
-            <w:proofErr w:type="spellEnd"/>
-            <w:r>
-              <w:t xml:space="preserve"> 'self' </w:t>
-            </w:r>
-            <w:proofErr w:type="spellStart"/>
-            <w:r>
-              <w:t>ws</w:t>
-            </w:r>
-            <w:proofErr w:type="spellEnd"/>
-            <w:r>
-              <w:t xml:space="preserve">: </w:t>
-            </w:r>
-            <w:proofErr w:type="gramStart"/>
-            <w:r>
-              <w:t>http:;</w:t>
-            </w:r>
-            <w:proofErr w:type="gramEnd"/>
-            <w:r>
-              <w:t>" /&gt;</w:t>
+              <w:t xml:space="preserve">    connect-src 'self' ws: http:;" /&gt;</w:t>
             </w:r>
             <w:r>
               <w:br/>
@@ -6307,9 +5716,51 @@
           <w:b/>
           <w:bCs/>
         </w:rPr>
-        <w:t xml:space="preserve">Interactive </w:t>
-      </w:r>
-      <w:proofErr w:type="spellStart"/>
+        <w:t>Interactive WebAssembly and Interactive Auto</w:t>
+      </w:r>
+    </w:p>
+    <w:p>
+      <w:pPr>
+        <w:numPr>
+          <w:ilvl w:val="0"/>
+          <w:numId w:val="11"/>
+        </w:numPr>
+      </w:pPr>
+      <w:r>
+        <w:t>Create a default Blazor Web App in .NET 11.</w:t>
+      </w:r>
+    </w:p>
+    <w:p>
+      <w:pPr>
+        <w:numPr>
+          <w:ilvl w:val="1"/>
+          <w:numId w:val="11"/>
+        </w:numPr>
+      </w:pPr>
+      <w:r>
+        <w:lastRenderedPageBreak/>
+        <w:t xml:space="preserve">For </w:t>
+      </w:r>
+      <w:r>
+        <w:rPr>
+          <w:b/>
+          <w:bCs/>
+        </w:rPr>
+        <w:t>Interactive WebAssembly</w:t>
+      </w:r>
+      <w:r>
+        <w:t xml:space="preserve">, set </w:t>
+      </w:r>
+      <w:r>
+        <w:rPr>
+          <w:b/>
+          <w:bCs/>
+        </w:rPr>
+        <w:t>Interactive Render Mode</w:t>
+      </w:r>
+      <w:r>
+        <w:t xml:space="preserve"> to </w:t>
+      </w:r>
       <w:r>
         <w:rPr>
           <w:b/>
@@ -6317,24 +5768,28 @@
         </w:rPr>
         <w:t>WebAssembly</w:t>
       </w:r>
-      <w:proofErr w:type="spellEnd"/>
+      <w:r>
+        <w:t xml:space="preserve"> and </w:t>
+      </w:r>
       <w:r>
         <w:rPr>
           <w:b/>
           <w:bCs/>
         </w:rPr>
-        <w:t xml:space="preserve"> and Interactive Auto</w:t>
-      </w:r>
-    </w:p>
-    <w:p>
-      <w:pPr>
-        <w:numPr>
-          <w:ilvl w:val="0"/>
-          <w:numId w:val="11"/>
-        </w:numPr>
-      </w:pPr>
-      <w:r>
-        <w:t>Create a default Blazor Web App in .NET 11.</w:t>
+        <w:t>Interactivity Location</w:t>
+      </w:r>
+      <w:r>
+        <w:t xml:space="preserve"> to </w:t>
+      </w:r>
+      <w:r>
+        <w:rPr>
+          <w:b/>
+          <w:bCs/>
+        </w:rPr>
+        <w:t>Global</w:t>
+      </w:r>
+      <w:r>
+        <w:t>.</w:t>
       </w:r>
     </w:p>
     <w:p>
@@ -6352,17 +5807,8 @@
           <w:b/>
           <w:bCs/>
         </w:rPr>
-        <w:t xml:space="preserve">Interactive </w:t>
-      </w:r>
-      <w:proofErr w:type="spellStart"/>
-      <w:r>
-        <w:rPr>
-          <w:b/>
-          <w:bCs/>
-        </w:rPr>
-        <w:t>WebAssembly</w:t>
-      </w:r>
-      <w:proofErr w:type="spellEnd"/>
+        <w:t>Interactive Auto</w:t>
+      </w:r>
       <w:r>
         <w:t xml:space="preserve">, set </w:t>
       </w:r>
@@ -6376,15 +5822,13 @@
       <w:r>
         <w:t xml:space="preserve"> to </w:t>
       </w:r>
-      <w:proofErr w:type="spellStart"/>
       <w:r>
         <w:rPr>
           <w:b/>
           <w:bCs/>
         </w:rPr>
-        <w:t>WebAssembly</w:t>
-      </w:r>
-      <w:proofErr w:type="spellEnd"/>
+        <w:t>Auto</w:t>
+      </w:r>
       <w:r>
         <w:t xml:space="preserve"> and </w:t>
       </w:r>
@@ -6412,82 +5856,12 @@
     <w:p>
       <w:pPr>
         <w:numPr>
-          <w:ilvl w:val="1"/>
-          <w:numId w:val="11"/>
-        </w:numPr>
-      </w:pPr>
-      <w:r>
-        <w:lastRenderedPageBreak/>
-        <w:t xml:space="preserve">For </w:t>
-      </w:r>
-      <w:r>
-        <w:rPr>
-          <w:b/>
-          <w:bCs/>
-        </w:rPr>
-        <w:t>Interactive Auto</w:t>
-      </w:r>
-      <w:r>
-        <w:t xml:space="preserve">, set </w:t>
-      </w:r>
-      <w:r>
-        <w:rPr>
-          <w:b/>
-          <w:bCs/>
-        </w:rPr>
-        <w:t>Interactive Render Mode</w:t>
-      </w:r>
-      <w:r>
-        <w:t xml:space="preserve"> to </w:t>
-      </w:r>
-      <w:r>
-        <w:rPr>
-          <w:b/>
-          <w:bCs/>
-        </w:rPr>
-        <w:t>Auto</w:t>
-      </w:r>
-      <w:r>
-        <w:t xml:space="preserve"> and </w:t>
-      </w:r>
-      <w:r>
-        <w:rPr>
-          <w:b/>
-          <w:bCs/>
-        </w:rPr>
-        <w:t>Interactivity Location</w:t>
-      </w:r>
-      <w:r>
-        <w:t xml:space="preserve"> to </w:t>
-      </w:r>
-      <w:r>
-        <w:rPr>
-          <w:b/>
-          <w:bCs/>
-        </w:rPr>
-        <w:t>Global</w:t>
-      </w:r>
-      <w:r>
-        <w:t>.</w:t>
-      </w:r>
-    </w:p>
-    <w:p>
-      <w:pPr>
-        <w:numPr>
           <w:ilvl w:val="0"/>
           <w:numId w:val="11"/>
         </w:numPr>
       </w:pPr>
       <w:r>
-        <w:t xml:space="preserve">Add the following CSP policy in </w:t>
-      </w:r>
-      <w:proofErr w:type="spellStart"/>
-      <w:r>
-        <w:t>App.razor</w:t>
-      </w:r>
-      <w:proofErr w:type="spellEnd"/>
-      <w:r>
-        <w:t>:</w:t>
+        <w:t>Add the following CSP policy in App.razor:</w:t>
       </w:r>
     </w:p>
     <w:p>
@@ -6540,15 +5914,7 @@
           </w:p>
           <w:p>
             <w:r>
-              <w:t xml:space="preserve">    &lt;meta http-</w:t>
-            </w:r>
-            <w:proofErr w:type="spellStart"/>
-            <w:r>
-              <w:t>equiv</w:t>
-            </w:r>
-            <w:proofErr w:type="spellEnd"/>
-            <w:r>
-              <w:t>="Content-Security-Policy"</w:t>
+              <w:t xml:space="preserve">    &lt;meta http-equiv="Content-Security-Policy"</w:t>
             </w:r>
           </w:p>
           <w:p>
@@ -6558,96 +5924,27 @@
           </w:p>
           <w:p>
             <w:r>
-              <w:t xml:space="preserve">    default-</w:t>
-            </w:r>
-            <w:proofErr w:type="spellStart"/>
-            <w:r>
-              <w:t>src</w:t>
-            </w:r>
-            <w:proofErr w:type="spellEnd"/>
-            <w:r>
-              <w:t xml:space="preserve"> 'self';</w:t>
+              <w:t xml:space="preserve">    default-src 'self';</w:t>
             </w:r>
           </w:p>
           <w:p>
             <w:r>
-              <w:t xml:space="preserve">    script-</w:t>
-            </w:r>
-            <w:proofErr w:type="spellStart"/>
-            <w:r>
-              <w:t>src</w:t>
-            </w:r>
-            <w:proofErr w:type="spellEnd"/>
-            <w:r>
-              <w:t xml:space="preserve"> 'self' '</w:t>
-            </w:r>
-            <w:proofErr w:type="spellStart"/>
-            <w:r>
-              <w:t>wasm</w:t>
-            </w:r>
-            <w:proofErr w:type="spellEnd"/>
-            <w:r>
-              <w:t>-unsafe-eval';</w:t>
+              <w:t xml:space="preserve">    script-src 'self' 'wasm-unsafe-eval';</w:t>
             </w:r>
           </w:p>
           <w:p>
             <w:r>
-              <w:t xml:space="preserve">    style-</w:t>
-            </w:r>
-            <w:proofErr w:type="spellStart"/>
-            <w:r>
-              <w:t>src</w:t>
-            </w:r>
-            <w:proofErr w:type="spellEnd"/>
-            <w:r>
-              <w:t xml:space="preserve"> 'self';</w:t>
+              <w:t xml:space="preserve">    style-src 'self';</w:t>
             </w:r>
           </w:p>
           <w:p>
             <w:r>
-              <w:t xml:space="preserve">    </w:t>
+              <w:t xml:space="preserve">    img-src 'self' data:;</w:t>
             </w:r>
-            <w:proofErr w:type="spellStart"/>
-            <w:r>
-              <w:t>img-src</w:t>
-            </w:r>
-            <w:proofErr w:type="spellEnd"/>
-            <w:r>
-              <w:t xml:space="preserve"> 'self' </w:t>
-            </w:r>
-            <w:proofErr w:type="gramStart"/>
-            <w:r>
-              <w:t>data:;</w:t>
-            </w:r>
-            <w:proofErr w:type="gramEnd"/>
           </w:p>
           <w:p>
             <w:r>
-              <w:t xml:space="preserve">    connect-</w:t>
-            </w:r>
-            <w:proofErr w:type="spellStart"/>
-            <w:r>
-              <w:t>src</w:t>
-            </w:r>
-            <w:proofErr w:type="spellEnd"/>
-            <w:r>
-              <w:t xml:space="preserve"> 'self' </w:t>
-            </w:r>
-            <w:proofErr w:type="spellStart"/>
-            <w:r>
-              <w:t>ws</w:t>
-            </w:r>
-            <w:proofErr w:type="spellEnd"/>
-            <w:r>
-              <w:t xml:space="preserve">: </w:t>
-            </w:r>
-            <w:proofErr w:type="gramStart"/>
-            <w:r>
-              <w:t>http:;</w:t>
-            </w:r>
-            <w:proofErr w:type="gramEnd"/>
-            <w:r>
-              <w:t>" /&gt;</w:t>
+              <w:t xml:space="preserve">    connect-src 'self' ws: http:;" /&gt;</w:t>
             </w:r>
             <w:r>
               <w:br/>
@@ -6671,66 +5968,29 @@
         <w:t xml:space="preserve">Evidence: </w:t>
       </w:r>
       <w:hyperlink r:id="rId27" w:history="1">
-        <w:proofErr w:type="spellStart"/>
         <w:r>
           <w:rPr>
             <w:rStyle w:val="Hyperlink"/>
           </w:rPr>
-          <w:t>BlazorCspValidation</w:t>
+          <w:t>BlazorCspValidation/Evidence at main · BharatRamsf3693/BlazorCspValidation</w:t>
         </w:r>
-        <w:proofErr w:type="spellEnd"/>
-        <w:r>
-          <w:rPr>
-            <w:rStyle w:val="Hyperlink"/>
-          </w:rPr>
-          <w:t>/Evidence at main · BharatRamsf3693/</w:t>
-        </w:r>
-        <w:proofErr w:type="spellStart"/>
-        <w:r>
-          <w:rPr>
-            <w:rStyle w:val="Hyperlink"/>
-          </w:rPr>
-          <w:t>BlazorCspValidation</w:t>
-        </w:r>
-        <w:proofErr w:type="spellEnd"/>
       </w:hyperlink>
     </w:p>
+    <w:p/>
     <w:p>
-      <w:pPr>
+      <w:r>
         <w:rPr>
           <w:b/>
           <w:bCs/>
         </w:rPr>
-      </w:pPr>
-      <w:r>
-        <w:t> </w:t>
-      </w:r>
-      <w:r>
-        <w:br/>
+        <w:t>2.</w:t>
       </w:r>
       <w:r>
         <w:rPr>
           <w:b/>
           <w:bCs/>
         </w:rPr>
-        <w:t>Observation</w:t>
-      </w:r>
-    </w:p>
-    <w:p>
-      <w:pPr>
-        <w:rPr>
-          <w:b/>
-          <w:bCs/>
-        </w:rPr>
-      </w:pPr>
-    </w:p>
-    <w:p>
-      <w:r>
-        <w:rPr>
-          <w:b/>
-          <w:bCs/>
-        </w:rPr>
-        <w:t>Browser Console Error: Permissions policy violation: unload is not allowed in this document</w:t>
+        <w:t>The mobile menu remains open after page selection in .NET 11 Interactive Server, WebAssembly, and Auto samples</w:t>
       </w:r>
     </w:p>
     <w:p>
@@ -6744,45 +6004,47 @@
     </w:p>
     <w:p>
       <w:r>
-        <w:t xml:space="preserve">The error originates from Visual Studio’s </w:t>
+        <w:t xml:space="preserve">The mobile menu remains open after a page is selected in the Interactive Server, WebAssembly, and Auto samples for </w:t>
       </w:r>
       <w:r>
         <w:rPr>
           <w:b/>
           <w:bCs/>
         </w:rPr>
-        <w:t>Browser Link</w:t>
-      </w:r>
-      <w:r>
-        <w:t xml:space="preserve"> feature (localhost:7181/_vs/</w:t>
-      </w:r>
-      <w:proofErr w:type="spellStart"/>
-      <w:r>
-        <w:t>browserLink</w:t>
-      </w:r>
-      <w:proofErr w:type="spellEnd"/>
-      <w:r>
-        <w:t xml:space="preserve">) rather than the application code. It only occurs during </w:t>
+        <w:t>.NET 11</w:t>
+      </w:r>
+      <w:r>
+        <w:t xml:space="preserve">. This issue occurs </w:t>
       </w:r>
       <w:r>
         <w:rPr>
           <w:b/>
           <w:bCs/>
         </w:rPr>
-        <w:t>local debugging in Microsoft Edge</w:t>
-      </w:r>
-      <w:r>
-        <w:t xml:space="preserve">. It does not occur in Google Chrome, nor does it appear when the application is published in </w:t>
+        <w:t>even when CSP is not enabled</w:t>
+      </w:r>
+      <w:r>
+        <w:t xml:space="preserve">. Notably, the issue </w:t>
       </w:r>
       <w:r>
         <w:rPr>
           <w:b/>
           <w:bCs/>
         </w:rPr>
-        <w:t>Release</w:t>
-      </w:r>
-      <w:r>
-        <w:t xml:space="preserve"> mode.</w:t>
+        <w:t>does not occur in Static SSR (.NET 11)</w:t>
+      </w:r>
+      <w:r>
+        <w:t xml:space="preserve"> and </w:t>
+      </w:r>
+      <w:r>
+        <w:rPr>
+          <w:b/>
+          <w:bCs/>
+        </w:rPr>
+        <w:t>cannot be reproduced in .NET 10 samples</w:t>
+      </w:r>
+      <w:r>
+        <w:t>.</w:t>
       </w:r>
     </w:p>
     <w:p>
@@ -6802,66 +6064,55 @@
     <w:p>
       <w:r>
         <w:lastRenderedPageBreak/>
-        <w:t xml:space="preserve">This error occurs in Edge even when Content Security Policy (CSP) is </w:t>
+        <w:t xml:space="preserve">This issue occurs in both </w:t>
       </w:r>
       <w:r>
         <w:rPr>
           <w:b/>
           <w:bCs/>
         </w:rPr>
-        <w:t>not enabled</w:t>
-      </w:r>
-      <w:r>
-        <w:t>. It impacts all default Blazor Web App interactive modes:</w:t>
+        <w:t>Edge and Chrome</w:t>
+      </w:r>
+      <w:r>
+        <w:t>, even when Content Security Policy (CSP) is not enabled. It impacts all default Blazor Web App interactive modes:</w:t>
       </w:r>
     </w:p>
     <w:p>
       <w:pPr>
         <w:numPr>
           <w:ilvl w:val="0"/>
-          <w:numId w:val="12"/>
+          <w:numId w:val="19"/>
         </w:numPr>
       </w:pPr>
       <w:r>
-        <w:t>Static SSR</w:t>
+        <w:t>Interactive Server</w:t>
       </w:r>
     </w:p>
     <w:p>
       <w:pPr>
         <w:numPr>
           <w:ilvl w:val="0"/>
-          <w:numId w:val="12"/>
+          <w:numId w:val="19"/>
         </w:numPr>
       </w:pPr>
       <w:r>
-        <w:t>Interactive Server</w:t>
+        <w:t>Interactive WebAssembly</w:t>
       </w:r>
     </w:p>
     <w:p>
       <w:pPr>
         <w:numPr>
           <w:ilvl w:val="0"/>
-          <w:numId w:val="12"/>
+          <w:numId w:val="19"/>
         </w:numPr>
       </w:pPr>
       <w:r>
-        <w:t xml:space="preserve">Interactive </w:t>
-      </w:r>
-      <w:proofErr w:type="spellStart"/>
-      <w:r>
-        <w:t>WebAssembly</w:t>
-      </w:r>
-      <w:proofErr w:type="spellEnd"/>
+        <w:t>Interactive Auto</w:t>
+      </w:r>
     </w:p>
     <w:p>
-      <w:pPr>
-        <w:numPr>
-          <w:ilvl w:val="0"/>
-          <w:numId w:val="12"/>
-        </w:numPr>
-      </w:pPr>
-      <w:r>
-        <w:t>Interactive Auto</w:t>
+      <w:r>
+        <w:t> </w:t>
       </w:r>
     </w:p>
     <w:p>
@@ -6875,7 +6126,7 @@
     </w:p>
     <w:p>
       <w:r>
-        <w:t>The default Visual Studio project template should launch in Microsoft Edge without triggering console errors.</w:t>
+        <w:t>The mobile menu should automatically close after a page is selected across all interactivity modes, matching the behavior seen in .NET 10 and Static SSR (.NET 11).</w:t>
       </w:r>
     </w:p>
     <w:p>
@@ -6896,53 +6147,79 @@
       <w:pPr>
         <w:numPr>
           <w:ilvl w:val="0"/>
-          <w:numId w:val="13"/>
+          <w:numId w:val="20"/>
         </w:numPr>
       </w:pPr>
       <w:r>
-        <w:t>Create a default Blazor Web App using any interactivity mode.</w:t>
-      </w:r>
-    </w:p>
-    <w:p>
-      <w:pPr>
-        <w:numPr>
-          <w:ilvl w:val="0"/>
-          <w:numId w:val="13"/>
-        </w:numPr>
-      </w:pPr>
-      <w:r>
-        <w:t xml:space="preserve">Launch the application in </w:t>
+        <w:t>Create a default Blazor Web App using an interactive render mode (</w:t>
       </w:r>
       <w:r>
         <w:rPr>
           <w:b/>
           <w:bCs/>
         </w:rPr>
-        <w:t>Debug mode</w:t>
-      </w:r>
-      <w:r>
-        <w:t xml:space="preserve"> using the </w:t>
+        <w:t>Interactive Server</w:t>
+      </w:r>
+      <w:r>
+        <w:t xml:space="preserve">, </w:t>
       </w:r>
       <w:r>
         <w:rPr>
           <w:b/>
           <w:bCs/>
         </w:rPr>
-        <w:t>Microsoft Edge</w:t>
-      </w:r>
-      <w:r>
-        <w:t xml:space="preserve"> browser.</w:t>
+        <w:t>WebAssembly</w:t>
+      </w:r>
+      <w:r>
+        <w:t xml:space="preserve">, or </w:t>
+      </w:r>
+      <w:r>
+        <w:rPr>
+          <w:b/>
+          <w:bCs/>
+        </w:rPr>
+        <w:t>Auto</w:t>
+      </w:r>
+      <w:r>
+        <w:t>).</w:t>
       </w:r>
     </w:p>
     <w:p>
       <w:pPr>
         <w:numPr>
           <w:ilvl w:val="0"/>
-          <w:numId w:val="13"/>
+          <w:numId w:val="20"/>
         </w:numPr>
       </w:pPr>
       <w:r>
-        <w:t>Open the browser dev tools to observe the error in the console.</w:t>
+        <w:t>Launch the application via Debug mode or run the published output's .exe file.</w:t>
+      </w:r>
+    </w:p>
+    <w:p>
+      <w:pPr>
+        <w:numPr>
+          <w:ilvl w:val="0"/>
+          <w:numId w:val="20"/>
+        </w:numPr>
+      </w:pPr>
+      <w:r>
+        <w:t>Resize the browser to a mobile view to expose the mobile menu.</w:t>
+      </w:r>
+    </w:p>
+    <w:p>
+      <w:pPr>
+        <w:numPr>
+          <w:ilvl w:val="0"/>
+          <w:numId w:val="20"/>
+        </w:numPr>
+      </w:pPr>
+      <w:r>
+        <w:t>Open the mobile menu, select a page to navigate, and observe that the menu remains open.</w:t>
+      </w:r>
+    </w:p>
+    <w:p>
+      <w:r>
+        <w:t> </w:t>
       </w:r>
     </w:p>
     <w:p>
@@ -6954,28 +6231,12 @@
         <w:t xml:space="preserve">Evidence: </w:t>
       </w:r>
       <w:hyperlink r:id="rId28" w:history="1">
-        <w:proofErr w:type="spellStart"/>
         <w:r>
           <w:rPr>
             <w:rStyle w:val="Hyperlink"/>
           </w:rPr>
-          <w:t>BlazorCspValidation</w:t>
+          <w:t>BlazorCspValidation/Evidence at main · BharatRamsf3693/BlazorCspValidation</w:t>
         </w:r>
-        <w:proofErr w:type="spellEnd"/>
-        <w:r>
-          <w:rPr>
-            <w:rStyle w:val="Hyperlink"/>
-          </w:rPr>
-          <w:t>/Evidence/DebugModeVideos.zip at main · BharatRamsf3693/</w:t>
-        </w:r>
-        <w:proofErr w:type="spellStart"/>
-        <w:r>
-          <w:rPr>
-            <w:rStyle w:val="Hyperlink"/>
-          </w:rPr>
-          <w:t>BlazorCspValidation</w:t>
-        </w:r>
-        <w:proofErr w:type="spellEnd"/>
       </w:hyperlink>
     </w:p>
     <w:sectPr>
@@ -7140,6 +6401,155 @@
     </w:lvl>
   </w:abstractNum>
   <w:abstractNum w:abstractNumId="1" w15:restartNumberingAfterBreak="0">
+    <w:nsid w:val="12A629C5"/>
+    <w:multiLevelType w:val="multilevel"/>
+    <w:tmpl w:val="5956C4D6"/>
+    <w:lvl w:ilvl="0">
+      <w:start w:val="1"/>
+      <w:numFmt w:val="bullet"/>
+      <w:lvlText w:val=""/>
+      <w:lvlJc w:val="left"/>
+      <w:pPr>
+        <w:tabs>
+          <w:tab w:val="num" w:pos="720"/>
+        </w:tabs>
+        <w:ind w:left="720" w:hanging="360"/>
+      </w:pPr>
+      <w:rPr>
+        <w:rFonts w:ascii="Symbol" w:hAnsi="Symbol" w:hint="default"/>
+        <w:sz w:val="20"/>
+      </w:rPr>
+    </w:lvl>
+    <w:lvl w:ilvl="1" w:tentative="1">
+      <w:start w:val="1"/>
+      <w:numFmt w:val="bullet"/>
+      <w:lvlText w:val=""/>
+      <w:lvlJc w:val="left"/>
+      <w:pPr>
+        <w:tabs>
+          <w:tab w:val="num" w:pos="1440"/>
+        </w:tabs>
+        <w:ind w:left="1440" w:hanging="360"/>
+      </w:pPr>
+      <w:rPr>
+        <w:rFonts w:ascii="Symbol" w:hAnsi="Symbol" w:hint="default"/>
+        <w:sz w:val="20"/>
+      </w:rPr>
+    </w:lvl>
+    <w:lvl w:ilvl="2" w:tentative="1">
+      <w:start w:val="1"/>
+      <w:numFmt w:val="bullet"/>
+      <w:lvlText w:val=""/>
+      <w:lvlJc w:val="left"/>
+      <w:pPr>
+        <w:tabs>
+          <w:tab w:val="num" w:pos="2160"/>
+        </w:tabs>
+        <w:ind w:left="2160" w:hanging="360"/>
+      </w:pPr>
+      <w:rPr>
+        <w:rFonts w:ascii="Symbol" w:hAnsi="Symbol" w:hint="default"/>
+        <w:sz w:val="20"/>
+      </w:rPr>
+    </w:lvl>
+    <w:lvl w:ilvl="3" w:tentative="1">
+      <w:start w:val="1"/>
+      <w:numFmt w:val="bullet"/>
+      <w:lvlText w:val=""/>
+      <w:lvlJc w:val="left"/>
+      <w:pPr>
+        <w:tabs>
+          <w:tab w:val="num" w:pos="2880"/>
+        </w:tabs>
+        <w:ind w:left="2880" w:hanging="360"/>
+      </w:pPr>
+      <w:rPr>
+        <w:rFonts w:ascii="Symbol" w:hAnsi="Symbol" w:hint="default"/>
+        <w:sz w:val="20"/>
+      </w:rPr>
+    </w:lvl>
+    <w:lvl w:ilvl="4" w:tentative="1">
+      <w:start w:val="1"/>
+      <w:numFmt w:val="bullet"/>
+      <w:lvlText w:val=""/>
+      <w:lvlJc w:val="left"/>
+      <w:pPr>
+        <w:tabs>
+          <w:tab w:val="num" w:pos="3600"/>
+        </w:tabs>
+        <w:ind w:left="3600" w:hanging="360"/>
+      </w:pPr>
+      <w:rPr>
+        <w:rFonts w:ascii="Symbol" w:hAnsi="Symbol" w:hint="default"/>
+        <w:sz w:val="20"/>
+      </w:rPr>
+    </w:lvl>
+    <w:lvl w:ilvl="5" w:tentative="1">
+      <w:start w:val="1"/>
+      <w:numFmt w:val="bullet"/>
+      <w:lvlText w:val=""/>
+      <w:lvlJc w:val="left"/>
+      <w:pPr>
+        <w:tabs>
+          <w:tab w:val="num" w:pos="4320"/>
+        </w:tabs>
+        <w:ind w:left="4320" w:hanging="360"/>
+      </w:pPr>
+      <w:rPr>
+        <w:rFonts w:ascii="Symbol" w:hAnsi="Symbol" w:hint="default"/>
+        <w:sz w:val="20"/>
+      </w:rPr>
+    </w:lvl>
+    <w:lvl w:ilvl="6" w:tentative="1">
+      <w:start w:val="1"/>
+      <w:numFmt w:val="bullet"/>
+      <w:lvlText w:val=""/>
+      <w:lvlJc w:val="left"/>
+      <w:pPr>
+        <w:tabs>
+          <w:tab w:val="num" w:pos="5040"/>
+        </w:tabs>
+        <w:ind w:left="5040" w:hanging="360"/>
+      </w:pPr>
+      <w:rPr>
+        <w:rFonts w:ascii="Symbol" w:hAnsi="Symbol" w:hint="default"/>
+        <w:sz w:val="20"/>
+      </w:rPr>
+    </w:lvl>
+    <w:lvl w:ilvl="7" w:tentative="1">
+      <w:start w:val="1"/>
+      <w:numFmt w:val="bullet"/>
+      <w:lvlText w:val=""/>
+      <w:lvlJc w:val="left"/>
+      <w:pPr>
+        <w:tabs>
+          <w:tab w:val="num" w:pos="5760"/>
+        </w:tabs>
+        <w:ind w:left="5760" w:hanging="360"/>
+      </w:pPr>
+      <w:rPr>
+        <w:rFonts w:ascii="Symbol" w:hAnsi="Symbol" w:hint="default"/>
+        <w:sz w:val="20"/>
+      </w:rPr>
+    </w:lvl>
+    <w:lvl w:ilvl="8" w:tentative="1">
+      <w:start w:val="1"/>
+      <w:numFmt w:val="bullet"/>
+      <w:lvlText w:val=""/>
+      <w:lvlJc w:val="left"/>
+      <w:pPr>
+        <w:tabs>
+          <w:tab w:val="num" w:pos="6480"/>
+        </w:tabs>
+        <w:ind w:left="6480" w:hanging="360"/>
+      </w:pPr>
+      <w:rPr>
+        <w:rFonts w:ascii="Symbol" w:hAnsi="Symbol" w:hint="default"/>
+        <w:sz w:val="20"/>
+      </w:rPr>
+    </w:lvl>
+  </w:abstractNum>
+  <w:abstractNum w:abstractNumId="2" w15:restartNumberingAfterBreak="0">
     <w:nsid w:val="14761A2F"/>
     <w:multiLevelType w:val="multilevel"/>
     <w:tmpl w:val="46CEB15C"/>
@@ -7288,7 +6698,7 @@
       </w:rPr>
     </w:lvl>
   </w:abstractNum>
-  <w:abstractNum w:abstractNumId="2" w15:restartNumberingAfterBreak="0">
+  <w:abstractNum w:abstractNumId="3" w15:restartNumberingAfterBreak="0">
     <w:nsid w:val="18FC408F"/>
     <w:multiLevelType w:val="multilevel"/>
     <w:tmpl w:val="E180AC46"/>
@@ -7437,7 +6847,7 @@
       </w:rPr>
     </w:lvl>
   </w:abstractNum>
-  <w:abstractNum w:abstractNumId="3" w15:restartNumberingAfterBreak="0">
+  <w:abstractNum w:abstractNumId="4" w15:restartNumberingAfterBreak="0">
     <w:nsid w:val="199401FF"/>
     <w:multiLevelType w:val="multilevel"/>
     <w:tmpl w:val="6012F93C"/>
@@ -7586,7 +6996,7 @@
       </w:rPr>
     </w:lvl>
   </w:abstractNum>
-  <w:abstractNum w:abstractNumId="4" w15:restartNumberingAfterBreak="0">
+  <w:abstractNum w:abstractNumId="5" w15:restartNumberingAfterBreak="0">
     <w:nsid w:val="27E7161A"/>
     <w:multiLevelType w:val="multilevel"/>
     <w:tmpl w:val="30EC5BBA"/>
@@ -7703,7 +7113,7 @@
       </w:pPr>
     </w:lvl>
   </w:abstractNum>
-  <w:abstractNum w:abstractNumId="5" w15:restartNumberingAfterBreak="0">
+  <w:abstractNum w:abstractNumId="6" w15:restartNumberingAfterBreak="0">
     <w:nsid w:val="35E95FBD"/>
     <w:multiLevelType w:val="multilevel"/>
     <w:tmpl w:val="6046BC0E"/>
@@ -7820,7 +7230,7 @@
       </w:pPr>
     </w:lvl>
   </w:abstractNum>
-  <w:abstractNum w:abstractNumId="6" w15:restartNumberingAfterBreak="0">
+  <w:abstractNum w:abstractNumId="7" w15:restartNumberingAfterBreak="0">
     <w:nsid w:val="3A29698D"/>
     <w:multiLevelType w:val="multilevel"/>
     <w:tmpl w:val="2D186360"/>
@@ -7969,7 +7379,7 @@
       </w:rPr>
     </w:lvl>
   </w:abstractNum>
-  <w:abstractNum w:abstractNumId="7" w15:restartNumberingAfterBreak="0">
+  <w:abstractNum w:abstractNumId="8" w15:restartNumberingAfterBreak="0">
     <w:nsid w:val="43194CC0"/>
     <w:multiLevelType w:val="multilevel"/>
     <w:tmpl w:val="2FECF1EE"/>
@@ -8086,7 +7496,7 @@
       </w:pPr>
     </w:lvl>
   </w:abstractNum>
-  <w:abstractNum w:abstractNumId="8" w15:restartNumberingAfterBreak="0">
+  <w:abstractNum w:abstractNumId="9" w15:restartNumberingAfterBreak="0">
     <w:nsid w:val="438B7085"/>
     <w:multiLevelType w:val="multilevel"/>
     <w:tmpl w:val="B9D82EB8"/>
@@ -8235,7 +7645,7 @@
       </w:rPr>
     </w:lvl>
   </w:abstractNum>
-  <w:abstractNum w:abstractNumId="9" w15:restartNumberingAfterBreak="0">
+  <w:abstractNum w:abstractNumId="10" w15:restartNumberingAfterBreak="0">
     <w:nsid w:val="48896157"/>
     <w:multiLevelType w:val="multilevel"/>
     <w:tmpl w:val="32EA8376"/>
@@ -8384,7 +7794,7 @@
       </w:rPr>
     </w:lvl>
   </w:abstractNum>
-  <w:abstractNum w:abstractNumId="10" w15:restartNumberingAfterBreak="0">
+  <w:abstractNum w:abstractNumId="11" w15:restartNumberingAfterBreak="0">
     <w:nsid w:val="4A93225A"/>
     <w:multiLevelType w:val="multilevel"/>
     <w:tmpl w:val="16F6415A"/>
@@ -8533,7 +7943,7 @@
       </w:rPr>
     </w:lvl>
   </w:abstractNum>
-  <w:abstractNum w:abstractNumId="11" w15:restartNumberingAfterBreak="0">
+  <w:abstractNum w:abstractNumId="12" w15:restartNumberingAfterBreak="0">
     <w:nsid w:val="530072F5"/>
     <w:multiLevelType w:val="multilevel"/>
     <w:tmpl w:val="CAE2D91E"/>
@@ -8682,7 +8092,7 @@
       </w:rPr>
     </w:lvl>
   </w:abstractNum>
-  <w:abstractNum w:abstractNumId="12" w15:restartNumberingAfterBreak="0">
+  <w:abstractNum w:abstractNumId="13" w15:restartNumberingAfterBreak="0">
     <w:nsid w:val="551F3F93"/>
     <w:multiLevelType w:val="multilevel"/>
     <w:tmpl w:val="7562C15E"/>
@@ -8831,7 +8241,7 @@
       </w:rPr>
     </w:lvl>
   </w:abstractNum>
-  <w:abstractNum w:abstractNumId="13" w15:restartNumberingAfterBreak="0">
+  <w:abstractNum w:abstractNumId="14" w15:restartNumberingAfterBreak="0">
     <w:nsid w:val="55C52E24"/>
     <w:multiLevelType w:val="multilevel"/>
     <w:tmpl w:val="C9729366"/>
@@ -8948,7 +8358,7 @@
       </w:pPr>
     </w:lvl>
   </w:abstractNum>
-  <w:abstractNum w:abstractNumId="14" w15:restartNumberingAfterBreak="0">
+  <w:abstractNum w:abstractNumId="15" w15:restartNumberingAfterBreak="0">
     <w:nsid w:val="5EDC73A9"/>
     <w:multiLevelType w:val="multilevel"/>
     <w:tmpl w:val="B0CAD9B4"/>
@@ -9097,7 +8507,7 @@
       </w:rPr>
     </w:lvl>
   </w:abstractNum>
-  <w:abstractNum w:abstractNumId="15" w15:restartNumberingAfterBreak="0">
+  <w:abstractNum w:abstractNumId="16" w15:restartNumberingAfterBreak="0">
     <w:nsid w:val="63A86E9D"/>
     <w:multiLevelType w:val="multilevel"/>
     <w:tmpl w:val="90686B6E"/>
@@ -9246,7 +8656,7 @@
       </w:rPr>
     </w:lvl>
   </w:abstractNum>
-  <w:abstractNum w:abstractNumId="16" w15:restartNumberingAfterBreak="0">
+  <w:abstractNum w:abstractNumId="17" w15:restartNumberingAfterBreak="0">
     <w:nsid w:val="696C144F"/>
     <w:multiLevelType w:val="multilevel"/>
     <w:tmpl w:val="B65A3616"/>
@@ -9395,7 +8805,7 @@
       </w:rPr>
     </w:lvl>
   </w:abstractNum>
-  <w:abstractNum w:abstractNumId="17" w15:restartNumberingAfterBreak="0">
+  <w:abstractNum w:abstractNumId="18" w15:restartNumberingAfterBreak="0">
     <w:nsid w:val="6C2F0456"/>
     <w:multiLevelType w:val="multilevel"/>
     <w:tmpl w:val="27CAE67C"/>
@@ -9544,71 +8954,193 @@
       </w:rPr>
     </w:lvl>
   </w:abstractNum>
+  <w:abstractNum w:abstractNumId="19" w15:restartNumberingAfterBreak="0">
+    <w:nsid w:val="747464E0"/>
+    <w:multiLevelType w:val="multilevel"/>
+    <w:tmpl w:val="7E58766C"/>
+    <w:lvl w:ilvl="0">
+      <w:start w:val="1"/>
+      <w:numFmt w:val="decimal"/>
+      <w:lvlText w:val="%1."/>
+      <w:lvlJc w:val="left"/>
+      <w:pPr>
+        <w:tabs>
+          <w:tab w:val="num" w:pos="720"/>
+        </w:tabs>
+        <w:ind w:left="720" w:hanging="360"/>
+      </w:pPr>
+    </w:lvl>
+    <w:lvl w:ilvl="1" w:tentative="1">
+      <w:start w:val="1"/>
+      <w:numFmt w:val="decimal"/>
+      <w:lvlText w:val="%2."/>
+      <w:lvlJc w:val="left"/>
+      <w:pPr>
+        <w:tabs>
+          <w:tab w:val="num" w:pos="1440"/>
+        </w:tabs>
+        <w:ind w:left="1440" w:hanging="360"/>
+      </w:pPr>
+    </w:lvl>
+    <w:lvl w:ilvl="2" w:tentative="1">
+      <w:start w:val="1"/>
+      <w:numFmt w:val="decimal"/>
+      <w:lvlText w:val="%3."/>
+      <w:lvlJc w:val="left"/>
+      <w:pPr>
+        <w:tabs>
+          <w:tab w:val="num" w:pos="2160"/>
+        </w:tabs>
+        <w:ind w:left="2160" w:hanging="360"/>
+      </w:pPr>
+    </w:lvl>
+    <w:lvl w:ilvl="3" w:tentative="1">
+      <w:start w:val="1"/>
+      <w:numFmt w:val="decimal"/>
+      <w:lvlText w:val="%4."/>
+      <w:lvlJc w:val="left"/>
+      <w:pPr>
+        <w:tabs>
+          <w:tab w:val="num" w:pos="2880"/>
+        </w:tabs>
+        <w:ind w:left="2880" w:hanging="360"/>
+      </w:pPr>
+    </w:lvl>
+    <w:lvl w:ilvl="4" w:tentative="1">
+      <w:start w:val="1"/>
+      <w:numFmt w:val="decimal"/>
+      <w:lvlText w:val="%5."/>
+      <w:lvlJc w:val="left"/>
+      <w:pPr>
+        <w:tabs>
+          <w:tab w:val="num" w:pos="3600"/>
+        </w:tabs>
+        <w:ind w:left="3600" w:hanging="360"/>
+      </w:pPr>
+    </w:lvl>
+    <w:lvl w:ilvl="5" w:tentative="1">
+      <w:start w:val="1"/>
+      <w:numFmt w:val="decimal"/>
+      <w:lvlText w:val="%6."/>
+      <w:lvlJc w:val="left"/>
+      <w:pPr>
+        <w:tabs>
+          <w:tab w:val="num" w:pos="4320"/>
+        </w:tabs>
+        <w:ind w:left="4320" w:hanging="360"/>
+      </w:pPr>
+    </w:lvl>
+    <w:lvl w:ilvl="6" w:tentative="1">
+      <w:start w:val="1"/>
+      <w:numFmt w:val="decimal"/>
+      <w:lvlText w:val="%7."/>
+      <w:lvlJc w:val="left"/>
+      <w:pPr>
+        <w:tabs>
+          <w:tab w:val="num" w:pos="5040"/>
+        </w:tabs>
+        <w:ind w:left="5040" w:hanging="360"/>
+      </w:pPr>
+    </w:lvl>
+    <w:lvl w:ilvl="7" w:tentative="1">
+      <w:start w:val="1"/>
+      <w:numFmt w:val="decimal"/>
+      <w:lvlText w:val="%8."/>
+      <w:lvlJc w:val="left"/>
+      <w:pPr>
+        <w:tabs>
+          <w:tab w:val="num" w:pos="5760"/>
+        </w:tabs>
+        <w:ind w:left="5760" w:hanging="360"/>
+      </w:pPr>
+    </w:lvl>
+    <w:lvl w:ilvl="8" w:tentative="1">
+      <w:start w:val="1"/>
+      <w:numFmt w:val="decimal"/>
+      <w:lvlText w:val="%9."/>
+      <w:lvlJc w:val="left"/>
+      <w:pPr>
+        <w:tabs>
+          <w:tab w:val="num" w:pos="6480"/>
+        </w:tabs>
+        <w:ind w:left="6480" w:hanging="360"/>
+      </w:pPr>
+    </w:lvl>
+  </w:abstractNum>
   <w:num w:numId="1" w16cid:durableId="1435127517">
-    <w:abstractNumId w:val="12"/>
+    <w:abstractNumId w:val="13"/>
   </w:num>
   <w:num w:numId="2" w16cid:durableId="1201821682">
-    <w:abstractNumId w:val="1"/>
+    <w:abstractNumId w:val="2"/>
   </w:num>
   <w:num w:numId="3" w16cid:durableId="1367100993">
-    <w:abstractNumId w:val="4"/>
+    <w:abstractNumId w:val="5"/>
     <w:lvlOverride w:ilvl="0">
       <w:startOverride w:val="1"/>
     </w:lvlOverride>
   </w:num>
   <w:num w:numId="4" w16cid:durableId="880553252">
-    <w:abstractNumId w:val="5"/>
+    <w:abstractNumId w:val="6"/>
     <w:lvlOverride w:ilvl="0">
       <w:startOverride w:val="1"/>
     </w:lvlOverride>
   </w:num>
   <w:num w:numId="5" w16cid:durableId="1949582827">
-    <w:abstractNumId w:val="15"/>
+    <w:abstractNumId w:val="16"/>
   </w:num>
   <w:num w:numId="6" w16cid:durableId="2090148790">
     <w:abstractNumId w:val="0"/>
   </w:num>
   <w:num w:numId="7" w16cid:durableId="1373650462">
-    <w:abstractNumId w:val="2"/>
+    <w:abstractNumId w:val="3"/>
   </w:num>
   <w:num w:numId="8" w16cid:durableId="699401781">
-    <w:abstractNumId w:val="14"/>
+    <w:abstractNumId w:val="15"/>
   </w:num>
   <w:num w:numId="9" w16cid:durableId="959804759">
-    <w:abstractNumId w:val="16"/>
+    <w:abstractNumId w:val="17"/>
   </w:num>
   <w:num w:numId="10" w16cid:durableId="723412882">
-    <w:abstractNumId w:val="13"/>
+    <w:abstractNumId w:val="14"/>
     <w:lvlOverride w:ilvl="0">
       <w:startOverride w:val="1"/>
     </w:lvlOverride>
   </w:num>
   <w:num w:numId="11" w16cid:durableId="1811946793">
-    <w:abstractNumId w:val="7"/>
+    <w:abstractNumId w:val="8"/>
     <w:lvlOverride w:ilvl="0">
       <w:startOverride w:val="1"/>
     </w:lvlOverride>
   </w:num>
   <w:num w:numId="12" w16cid:durableId="1437092795">
-    <w:abstractNumId w:val="8"/>
+    <w:abstractNumId w:val="9"/>
   </w:num>
   <w:num w:numId="13" w16cid:durableId="508985002">
-    <w:abstractNumId w:val="3"/>
+    <w:abstractNumId w:val="4"/>
   </w:num>
   <w:num w:numId="14" w16cid:durableId="1347361645">
+    <w:abstractNumId w:val="11"/>
+  </w:num>
+  <w:num w:numId="15" w16cid:durableId="1816949979">
+    <w:abstractNumId w:val="18"/>
+  </w:num>
+  <w:num w:numId="16" w16cid:durableId="1544976214">
+    <w:abstractNumId w:val="7"/>
+  </w:num>
+  <w:num w:numId="17" w16cid:durableId="1993554907">
     <w:abstractNumId w:val="10"/>
   </w:num>
-  <w:num w:numId="15" w16cid:durableId="1816949979">
-    <w:abstractNumId w:val="17"/>
+  <w:num w:numId="18" w16cid:durableId="1860927008">
+    <w:abstractNumId w:val="12"/>
   </w:num>
-  <w:num w:numId="16" w16cid:durableId="1544976214">
-    <w:abstractNumId w:val="6"/>
+  <w:num w:numId="19" w16cid:durableId="2015063767">
+    <w:abstractNumId w:val="1"/>
   </w:num>
-  <w:num w:numId="17" w16cid:durableId="1993554907">
-    <w:abstractNumId w:val="9"/>
-  </w:num>
-  <w:num w:numId="18" w16cid:durableId="1860927008">
-    <w:abstractNumId w:val="11"/>
+  <w:num w:numId="20" w16cid:durableId="2104451552">
+    <w:abstractNumId w:val="19"/>
+    <w:lvlOverride w:ilvl="0">
+      <w:startOverride w:val="1"/>
+    </w:lvlOverride>
   </w:num>
 </w:numbering>
 </file>
@@ -10217,7 +9749,6 @@
   <w:style w:type="character" w:default="1" w:styleId="DefaultParagraphFont">
     <w:name w:val="Default Paragraph Font"/>
     <w:uiPriority w:val="1"/>
-    <w:semiHidden/>
     <w:unhideWhenUsed/>
   </w:style>
   <w:style w:type="table" w:default="1" w:styleId="TableNormal">

</xml_diff>